<commit_message>
Fix doc creation + Add creator/owner requirement
</commit_message>
<xml_diff>
--- a/warrant_form/resources/reqform_template.docx
+++ b/warrant_form/resources/reqform_template.docx
@@ -259,7 +259,7 @@
         <mc:AlternateContent>
           <mc:Choice Requires="wps">
             <w:drawing>
-              <wp:anchor distT="0" distB="0" distL="0" distR="0" simplePos="0" relativeHeight="9" behindDoc="0" locked="0" layoutInCell="1" allowOverlap="1" wp14:anchorId="6313861C">
+              <wp:anchor distT="0" distB="0" distL="0" distR="0" simplePos="0" relativeHeight="17" behindDoc="0" locked="0" layoutInCell="1" allowOverlap="1" wp14:anchorId="6313861C">
                 <wp:simplePos x="0" y="0"/>
                 <wp:positionH relativeFrom="column">
                   <wp:posOffset>-189865</wp:posOffset>
@@ -433,118 +433,11 @@
             </w:pict>
           </mc:Fallback>
         </mc:AlternateContent>
-        <mc:AlternateContent>
-          <mc:Choice Requires="wps">
-            <w:drawing>
-              <wp:anchor distT="0" distB="0" distL="0" distR="0" simplePos="0" relativeHeight="99" behindDoc="0" locked="0" layoutInCell="1" allowOverlap="1" wp14:anchorId="0C6474A2">
-                <wp:simplePos x="0" y="0"/>
-                <wp:positionH relativeFrom="column">
-                  <wp:posOffset>-186055</wp:posOffset>
-                </wp:positionH>
-                <wp:positionV relativeFrom="paragraph">
-                  <wp:posOffset>1383665</wp:posOffset>
-                </wp:positionV>
-                <wp:extent cx="2386330" cy="488315"/>
-                <wp:effectExtent l="0" t="0" r="0" b="0"/>
-                <wp:wrapNone/>
-                <wp:docPr id="3" name="Text Frame 4"/>
-                <a:graphic xmlns:a="http://schemas.openxmlformats.org/drawingml/2006/main">
-                  <a:graphicData uri="http://schemas.microsoft.com/office/word/2010/wordprocessingShape">
-                    <wps:wsp>
-                      <wps:cNvSpPr/>
-                      <wps:spPr>
-                        <a:xfrm>
-                          <a:off x="0" y="0"/>
-                          <a:ext cx="2386440" cy="488160"/>
-                        </a:xfrm>
-                        <a:prstGeom prst="rect">
-                          <a:avLst/>
-                        </a:prstGeom>
-                        <a:noFill/>
-                        <a:ln w="19080">
-                          <a:noFill/>
-                        </a:ln>
-                      </wps:spPr>
-                      <wps:style>
-                        <a:lnRef idx="0"/>
-                        <a:fillRef idx="0"/>
-                        <a:effectRef idx="0"/>
-                        <a:fontRef idx="minor"/>
-                      </wps:style>
-                      <wps:txbx>
-                        <w:txbxContent>
-                          <w:p>
-                            <w:pPr>
-                              <w:pStyle w:val="FrameContentsuser"/>
-                              <w:rPr/>
-                            </w:pPr>
-                            <w:r>
-                              <w:rPr>
-                                <w:color w:val="000000"/>
-                              </w:rPr>
-                              <w:t>{{</w:t>
-                            </w:r>
-                            <w:r>
-                              <w:rPr>
-                                <w:rFonts w:ascii="TH SarabunIT๙" w:hAnsi="TH SarabunIT๙"/>
-                                <w:color w:val="000000"/>
-                                <w:sz w:val="34"/>
-                                <w:szCs w:val="34"/>
-                              </w:rPr>
-                              <w:t xml:space="preserve"> judge_name }}</w:t>
-                            </w:r>
-                          </w:p>
-                        </w:txbxContent>
-                      </wps:txbx>
-                      <wps:bodyPr lIns="0" rIns="0" tIns="0" bIns="0" anchor="t">
-                        <a:noAutofit/>
-                      </wps:bodyPr>
-                    </wps:wsp>
-                  </a:graphicData>
-                </a:graphic>
-              </wp:anchor>
-            </w:drawing>
-          </mc:Choice>
-          <mc:Fallback>
-            <w:pict>
-              <v:rect id="shape_0" stroked="f" o:allowincell="f" style="position:absolute;margin-left:-14.65pt;margin-top:108.95pt;width:187.85pt;height:38.4pt;mso-wrap-style:square;v-text-anchor:top" wp14:anchorId="0C6474A2">
-                <v:fill o:detectmouseclick="t" on="false"/>
-                <v:stroke color="#3465a4" weight="19080" joinstyle="round" endcap="flat"/>
-                <v:textbox>
-                  <w:txbxContent>
-                    <w:p>
-                      <w:pPr>
-                        <w:pStyle w:val="FrameContentsuser"/>
-                        <w:rPr/>
-                      </w:pPr>
-                      <w:r>
-                        <w:rPr>
-                          <w:color w:val="000000"/>
-                        </w:rPr>
-                        <w:t>{{</w:t>
-                      </w:r>
-                      <w:r>
-                        <w:rPr>
-                          <w:rFonts w:ascii="TH SarabunIT๙" w:hAnsi="TH SarabunIT๙"/>
-                          <w:color w:val="000000"/>
-                          <w:sz w:val="34"/>
-                          <w:szCs w:val="34"/>
-                        </w:rPr>
-                        <w:t xml:space="preserve"> judge_name }}</w:t>
-                      </w:r>
-                    </w:p>
-                  </w:txbxContent>
-                </v:textbox>
-                <w10:wrap type="none"/>
-              </v:rect>
-            </w:pict>
-          </mc:Fallback>
-        </mc:AlternateContent>
         <w:drawing>
           <wp:inline distT="0" distB="0" distL="0" distR="0">
             <wp:extent cx="1066800" cy="1104900"/>
             <wp:effectExtent l="0" t="0" r="0" b="0"/>
-            <wp:docPr id="4" name="image1.png"/>
+            <wp:docPr id="3" name="image1.png"/>
             <wp:cNvGraphicFramePr>
               <a:graphicFrameLocks xmlns:a="http://schemas.openxmlformats.org/drawingml/2006/main" noChangeAspect="1"/>
             </wp:cNvGraphicFramePr>
@@ -552,7 +445,7 @@
               <a:graphicData uri="http://schemas.openxmlformats.org/drawingml/2006/picture">
                 <pic:pic xmlns:pic="http://schemas.openxmlformats.org/drawingml/2006/picture">
                   <pic:nvPicPr>
-                    <pic:cNvPr id="4" name="image1.png"/>
+                    <pic:cNvPr id="3" name="image1.png"/>
                     <pic:cNvPicPr>
                       <a:picLocks noChangeAspect="1" noChangeArrowheads="1"/>
                     </pic:cNvPicPr>
@@ -627,18 +520,18 @@
         <mc:AlternateContent>
           <mc:Choice Requires="wps">
             <w:drawing>
-              <wp:anchor distT="0" distB="0" distL="0" distR="0" simplePos="0" relativeHeight="85" behindDoc="0" locked="0" layoutInCell="1" allowOverlap="1" wp14:anchorId="65B13EF3">
+              <wp:anchor distT="0" distB="0" distL="0" distR="0" simplePos="0" relativeHeight="91" behindDoc="0" locked="0" layoutInCell="1" allowOverlap="1" wp14:anchorId="65B13EF3">
                 <wp:simplePos x="0" y="0"/>
                 <wp:positionH relativeFrom="column">
-                  <wp:posOffset>4375785</wp:posOffset>
+                  <wp:posOffset>4337685</wp:posOffset>
                 </wp:positionH>
                 <wp:positionV relativeFrom="paragraph">
-                  <wp:posOffset>-75565</wp:posOffset>
+                  <wp:posOffset>-36830</wp:posOffset>
                 </wp:positionV>
                 <wp:extent cx="906145" cy="488315"/>
                 <wp:effectExtent l="0" t="0" r="0" b="0"/>
                 <wp:wrapNone/>
-                <wp:docPr id="5" name="Text Frame 1"/>
+                <wp:docPr id="4" name="Text Frame 1"/>
                 <a:graphic xmlns:a="http://schemas.openxmlformats.org/drawingml/2006/main">
                   <a:graphicData uri="http://schemas.microsoft.com/office/word/2010/wordprocessingShape">
                     <wps:wsp>
@@ -671,10 +564,8 @@
                               <w:suppressAutoHyphens w:val="true"/>
                               <w:bidi w:val="0"/>
                               <w:spacing w:lineRule="auto" w:line="276" w:before="0" w:after="200"/>
-                              <w:jc w:val="start"/>
-                              <w:rPr>
-                                <w:color w:val="000000"/>
-                              </w:rPr>
+                              <w:jc w:val="center"/>
+                              <w:rPr/>
                             </w:pPr>
                             <w:r>
                               <w:rPr>
@@ -696,7 +587,7 @@
           </mc:Choice>
           <mc:Fallback>
             <w:pict>
-              <v:rect id="shape_0" stroked="f" o:allowincell="f" style="position:absolute;margin-left:344.55pt;margin-top:-5.95pt;width:71.3pt;height:38.4pt;mso-wrap-style:square;v-text-anchor:top" wp14:anchorId="65B13EF3">
+              <v:rect id="shape_0" stroked="f" o:allowincell="f" style="position:absolute;margin-left:341.55pt;margin-top:-2.9pt;width:71.3pt;height:38.4pt;mso-wrap-style:square;v-text-anchor:top" wp14:anchorId="65B13EF3">
                 <v:fill o:detectmouseclick="t" on="false"/>
                 <v:stroke color="#3465a4" joinstyle="round" endcap="flat"/>
                 <v:textbox>
@@ -708,10 +599,8 @@
                         <w:suppressAutoHyphens w:val="true"/>
                         <w:bidi w:val="0"/>
                         <w:spacing w:lineRule="auto" w:line="276" w:before="0" w:after="200"/>
-                        <w:jc w:val="start"/>
-                        <w:rPr>
-                          <w:color w:val="000000"/>
-                        </w:rPr>
+                        <w:jc w:val="center"/>
+                        <w:rPr/>
                       </w:pPr>
                       <w:r>
                         <w:rPr>
@@ -730,18 +619,18 @@
         <mc:AlternateContent>
           <mc:Choice Requires="wps">
             <w:drawing>
-              <wp:anchor distT="0" distB="0" distL="0" distR="0" simplePos="0" relativeHeight="87" behindDoc="0" locked="0" layoutInCell="1" allowOverlap="1" wp14:anchorId="413DEFBA">
+              <wp:anchor distT="0" distB="0" distL="0" distR="0" simplePos="0" relativeHeight="93" behindDoc="0" locked="0" layoutInCell="1" allowOverlap="1" wp14:anchorId="413DEFBA">
                 <wp:simplePos x="0" y="0"/>
                 <wp:positionH relativeFrom="column">
-                  <wp:posOffset>5401945</wp:posOffset>
+                  <wp:posOffset>5501640</wp:posOffset>
                 </wp:positionH>
                 <wp:positionV relativeFrom="paragraph">
-                  <wp:posOffset>-75565</wp:posOffset>
+                  <wp:posOffset>-37465</wp:posOffset>
                 </wp:positionV>
-                <wp:extent cx="906145" cy="488315"/>
+                <wp:extent cx="393065" cy="488315"/>
                 <wp:effectExtent l="0" t="0" r="0" b="0"/>
                 <wp:wrapNone/>
-                <wp:docPr id="6" name="Text Frame 2"/>
+                <wp:docPr id="5" name="Text Frame 2"/>
                 <a:graphic xmlns:a="http://schemas.openxmlformats.org/drawingml/2006/main">
                   <a:graphicData uri="http://schemas.microsoft.com/office/word/2010/wordprocessingShape">
                     <wps:wsp>
@@ -749,7 +638,7 @@
                       <wps:spPr>
                         <a:xfrm>
                           <a:off x="0" y="0"/>
-                          <a:ext cx="906120" cy="488160"/>
+                          <a:ext cx="393120" cy="488160"/>
                         </a:xfrm>
                         <a:prstGeom prst="rect">
                           <a:avLst/>
@@ -774,10 +663,8 @@
                               <w:suppressAutoHyphens w:val="true"/>
                               <w:bidi w:val="0"/>
                               <w:spacing w:lineRule="auto" w:line="276" w:before="0" w:after="200"/>
-                              <w:jc w:val="start"/>
-                              <w:rPr>
-                                <w:color w:val="000000"/>
-                              </w:rPr>
+                              <w:jc w:val="center"/>
+                              <w:rPr/>
                             </w:pPr>
                             <w:r>
                               <w:rPr>
@@ -801,7 +688,7 @@
           </mc:Choice>
           <mc:Fallback>
             <w:pict>
-              <v:rect id="shape_0" stroked="f" o:allowincell="f" style="position:absolute;margin-left:425.35pt;margin-top:-5.95pt;width:71.3pt;height:38.4pt;mso-wrap-style:square;v-text-anchor:top" wp14:anchorId="413DEFBA">
+              <v:rect id="shape_0" stroked="f" o:allowincell="f" style="position:absolute;margin-left:433.2pt;margin-top:-2.95pt;width:30.9pt;height:38.4pt;mso-wrap-style:square;v-text-anchor:top" wp14:anchorId="413DEFBA">
                 <v:fill o:detectmouseclick="t" on="false"/>
                 <v:stroke color="#3465a4" joinstyle="round" endcap="flat"/>
                 <v:textbox>
@@ -813,10 +700,8 @@
                         <w:suppressAutoHyphens w:val="true"/>
                         <w:bidi w:val="0"/>
                         <w:spacing w:lineRule="auto" w:line="276" w:before="0" w:after="200"/>
-                        <w:jc w:val="start"/>
-                        <w:rPr>
-                          <w:color w:val="000000"/>
-                        </w:rPr>
+                        <w:jc w:val="center"/>
+                        <w:rPr/>
                       </w:pPr>
                       <w:r>
                         <w:rPr>
@@ -860,27 +745,130 @@
           <w:sz w:val="34"/>
           <w:szCs w:val="34"/>
         </w:rPr>
-        <w:tab/>
-      </w:r>
-      <w:r>
-        <w:rPr>
-          <w:rFonts w:ascii="TH SarabunIT๙" w:hAnsi="TH SarabunIT๙" w:eastAsia="Sarabun" w:hint="cs"/>
-          <w:sz w:val="34"/>
-          <w:szCs w:val="34"/>
-        </w:rPr>
-        <w:t>ศาล</w:t>
-      </w:r>
-      <w:r>
         <mc:AlternateContent>
           <mc:Choice Requires="wps">
             <w:drawing>
-              <wp:anchor distT="0" distB="0" distL="0" distR="0" simplePos="0" relativeHeight="31" behindDoc="0" locked="0" layoutInCell="1" allowOverlap="1" wp14:anchorId="464982A6">
+              <wp:anchor distT="0" distB="0" distL="0" distR="0" simplePos="0" relativeHeight="105" behindDoc="0" locked="0" layoutInCell="1" allowOverlap="1" wp14:anchorId="0C6474A2">
                 <wp:simplePos x="0" y="0"/>
                 <wp:positionH relativeFrom="column">
-                  <wp:posOffset>3251200</wp:posOffset>
+                  <wp:posOffset>-127000</wp:posOffset>
                 </wp:positionH>
                 <wp:positionV relativeFrom="paragraph">
-                  <wp:posOffset>-73025</wp:posOffset>
+                  <wp:posOffset>-41275</wp:posOffset>
+                </wp:positionV>
+                <wp:extent cx="2386330" cy="488315"/>
+                <wp:effectExtent l="0" t="0" r="0" b="0"/>
+                <wp:wrapNone/>
+                <wp:docPr id="6" name="Text Frame 4"/>
+                <a:graphic xmlns:a="http://schemas.openxmlformats.org/drawingml/2006/main">
+                  <a:graphicData uri="http://schemas.microsoft.com/office/word/2010/wordprocessingShape">
+                    <wps:wsp>
+                      <wps:cNvSpPr/>
+                      <wps:spPr>
+                        <a:xfrm>
+                          <a:off x="0" y="0"/>
+                          <a:ext cx="2386440" cy="488160"/>
+                        </a:xfrm>
+                        <a:prstGeom prst="rect">
+                          <a:avLst/>
+                        </a:prstGeom>
+                        <a:noFill/>
+                        <a:ln w="19080">
+                          <a:noFill/>
+                        </a:ln>
+                      </wps:spPr>
+                      <wps:style>
+                        <a:lnRef idx="0"/>
+                        <a:fillRef idx="0"/>
+                        <a:effectRef idx="0"/>
+                        <a:fontRef idx="minor"/>
+                      </wps:style>
+                      <wps:txbx>
+                        <w:txbxContent>
+                          <w:p>
+                            <w:pPr>
+                              <w:pStyle w:val="Normal1"/>
+                              <w:spacing w:before="0" w:after="200"/>
+                              <w:jc w:val="start"/>
+                              <w:rPr>
+                                <w:sz w:val="30"/>
+                                <w:szCs w:val="30"/>
+                              </w:rPr>
+                            </w:pPr>
+                            <w:r>
+                              <w:rPr>
+                                <w:color w:val="000000"/>
+                                <w:sz w:val="30"/>
+                                <w:szCs w:val="30"/>
+                              </w:rPr>
+                              <w:t>{{ judge_name }}</w:t>
+                            </w:r>
+                          </w:p>
+                        </w:txbxContent>
+                      </wps:txbx>
+                      <wps:bodyPr lIns="0" rIns="0" tIns="0" bIns="0" anchor="t">
+                        <a:noAutofit/>
+                      </wps:bodyPr>
+                    </wps:wsp>
+                  </a:graphicData>
+                </a:graphic>
+              </wp:anchor>
+            </w:drawing>
+          </mc:Choice>
+          <mc:Fallback>
+            <w:pict>
+              <v:rect id="shape_0" stroked="f" o:allowincell="f" style="position:absolute;margin-left:-10pt;margin-top:-3.25pt;width:187.85pt;height:38.4pt;mso-wrap-style:square;v-text-anchor:top" wp14:anchorId="0C6474A2">
+                <v:fill o:detectmouseclick="t" on="false"/>
+                <v:stroke color="#3465a4" weight="19080" joinstyle="round" endcap="flat"/>
+                <v:textbox>
+                  <w:txbxContent>
+                    <w:p>
+                      <w:pPr>
+                        <w:pStyle w:val="Normal1"/>
+                        <w:spacing w:before="0" w:after="200"/>
+                        <w:jc w:val="start"/>
+                        <w:rPr>
+                          <w:sz w:val="30"/>
+                          <w:szCs w:val="30"/>
+                        </w:rPr>
+                      </w:pPr>
+                      <w:r>
+                        <w:rPr>
+                          <w:color w:val="000000"/>
+                          <w:sz w:val="30"/>
+                          <w:szCs w:val="30"/>
+                        </w:rPr>
+                        <w:t>{{ judge_name }}</w:t>
+                      </w:r>
+                    </w:p>
+                  </w:txbxContent>
+                </v:textbox>
+                <w10:wrap type="none"/>
+              </v:rect>
+            </w:pict>
+          </mc:Fallback>
+        </mc:AlternateContent>
+        <w:tab/>
+      </w:r>
+      <w:r>
+        <w:rPr>
+          <w:rFonts w:ascii="TH SarabunIT๙" w:hAnsi="TH SarabunIT๙" w:eastAsia="Sarabun" w:hint="cs"/>
+          <w:sz w:val="34"/>
+          <w:szCs w:val="34"/>
+        </w:rPr>
+        <w:t>ศาล</w:t>
+      </w:r>
+      <w:r>
+        <mc:AlternateContent>
+          <mc:Choice Requires="wps">
+            <w:drawing>
+              <wp:anchor distT="0" distB="0" distL="0" distR="0" simplePos="0" relativeHeight="39" behindDoc="0" locked="0" layoutInCell="1" allowOverlap="1" wp14:anchorId="464982A6">
+                <wp:simplePos x="0" y="0"/>
+                <wp:positionH relativeFrom="column">
+                  <wp:posOffset>3251835</wp:posOffset>
+                </wp:positionH>
+                <wp:positionV relativeFrom="paragraph">
+                  <wp:posOffset>-34925</wp:posOffset>
                 </wp:positionV>
                 <wp:extent cx="2386330" cy="488315"/>
                 <wp:effectExtent l="0" t="0" r="0" b="0"/>
@@ -945,7 +933,7 @@
           </mc:Choice>
           <mc:Fallback>
             <w:pict>
-              <v:rect id="shape_0" stroked="f" o:allowincell="f" style="position:absolute;margin-left:256pt;margin-top:-5.75pt;width:187.85pt;height:38.4pt;mso-wrap-style:square;v-text-anchor:top" wp14:anchorId="464982A6">
+              <v:rect id="shape_0" stroked="f" o:allowincell="f" style="position:absolute;margin-left:256.05pt;margin-top:-2.75pt;width:187.85pt;height:38.4pt;mso-wrap-style:square;v-text-anchor:top" wp14:anchorId="464982A6">
                 <v:fill o:detectmouseclick="t" on="false"/>
                 <v:stroke color="#3465a4" joinstyle="round" endcap="flat"/>
                 <v:textbox>
@@ -1050,15 +1038,15 @@
         <mc:AlternateContent>
           <mc:Choice Requires="wps">
             <w:drawing>
-              <wp:anchor distT="0" distB="0" distL="0" distR="0" simplePos="0" relativeHeight="29" behindDoc="0" locked="0" layoutInCell="1" allowOverlap="1" wp14:anchorId="01DAE91C">
+              <wp:anchor distT="0" distB="0" distL="0" distR="0" simplePos="0" relativeHeight="37" behindDoc="0" locked="0" layoutInCell="1" allowOverlap="1" wp14:anchorId="01DAE91C">
                 <wp:simplePos x="0" y="0"/>
                 <wp:positionH relativeFrom="column">
-                  <wp:posOffset>4984115</wp:posOffset>
+                  <wp:posOffset>5080000</wp:posOffset>
                 </wp:positionH>
                 <wp:positionV relativeFrom="paragraph">
                   <wp:posOffset>-35560</wp:posOffset>
                 </wp:positionV>
-                <wp:extent cx="1485265" cy="488315"/>
+                <wp:extent cx="832485" cy="488315"/>
                 <wp:effectExtent l="0" t="0" r="0" b="0"/>
                 <wp:wrapNone/>
                 <wp:docPr id="8" name="Text Frame 5"/>
@@ -1069,7 +1057,7 @@
                       <wps:spPr>
                         <a:xfrm>
                           <a:off x="0" y="0"/>
-                          <a:ext cx="1485360" cy="488160"/>
+                          <a:ext cx="832320" cy="488160"/>
                         </a:xfrm>
                         <a:prstGeom prst="rect">
                           <a:avLst/>
@@ -1094,10 +1082,8 @@
                               <w:suppressAutoHyphens w:val="true"/>
                               <w:bidi w:val="0"/>
                               <w:spacing w:lineRule="auto" w:line="276" w:before="0" w:after="200"/>
-                              <w:jc w:val="start"/>
-                              <w:rPr>
-                                <w:color w:val="000000"/>
-                              </w:rPr>
+                              <w:jc w:val="center"/>
+                              <w:rPr/>
                             </w:pPr>
                             <w:r>
                               <w:rPr>
@@ -1121,7 +1107,7 @@
           </mc:Choice>
           <mc:Fallback>
             <w:pict>
-              <v:rect id="shape_0" stroked="f" o:allowincell="f" style="position:absolute;margin-left:392.45pt;margin-top:-2.8pt;width:116.9pt;height:38.4pt;mso-wrap-style:square;v-text-anchor:top" wp14:anchorId="01DAE91C">
+              <v:rect id="shape_0" stroked="f" o:allowincell="f" style="position:absolute;margin-left:400pt;margin-top:-2.8pt;width:65.5pt;height:38.4pt;mso-wrap-style:square;v-text-anchor:top" wp14:anchorId="01DAE91C">
                 <v:fill o:detectmouseclick="t" on="false"/>
                 <v:stroke color="#3465a4" joinstyle="round" endcap="flat"/>
                 <v:textbox>
@@ -1133,10 +1119,8 @@
                         <w:suppressAutoHyphens w:val="true"/>
                         <w:bidi w:val="0"/>
                         <w:spacing w:lineRule="auto" w:line="276" w:before="0" w:after="200"/>
-                        <w:jc w:val="start"/>
-                        <w:rPr>
-                          <w:color w:val="000000"/>
-                        </w:rPr>
+                        <w:jc w:val="center"/>
+                        <w:rPr/>
                       </w:pPr>
                       <w:r>
                         <w:rPr>
@@ -1157,13 +1141,13 @@
         <mc:AlternateContent>
           <mc:Choice Requires="wps">
             <w:drawing>
-              <wp:anchor distT="0" distB="0" distL="0" distR="0" simplePos="0" relativeHeight="89" behindDoc="0" locked="0" layoutInCell="1" allowOverlap="1" wp14:anchorId="5CF04B2F">
+              <wp:anchor distT="0" distB="0" distL="0" distR="0" simplePos="0" relativeHeight="95" behindDoc="0" locked="0" layoutInCell="1" allowOverlap="1" wp14:anchorId="5CF04B2F">
                 <wp:simplePos x="0" y="0"/>
                 <wp:positionH relativeFrom="column">
-                  <wp:posOffset>2291715</wp:posOffset>
+                  <wp:posOffset>2374900</wp:posOffset>
                 </wp:positionH>
                 <wp:positionV relativeFrom="paragraph">
-                  <wp:posOffset>-35560</wp:posOffset>
+                  <wp:posOffset>-34925</wp:posOffset>
                 </wp:positionV>
                 <wp:extent cx="628015" cy="488315"/>
                 <wp:effectExtent l="0" t="0" r="0" b="0"/>
@@ -1202,9 +1186,7 @@
                               <w:bidi w:val="0"/>
                               <w:spacing w:lineRule="auto" w:line="276" w:before="0" w:after="200"/>
                               <w:jc w:val="center"/>
-                              <w:rPr>
-                                <w:color w:val="000000"/>
-                              </w:rPr>
+                              <w:rPr/>
                             </w:pPr>
                             <w:r>
                               <w:rPr>
@@ -1228,7 +1210,7 @@
           </mc:Choice>
           <mc:Fallback>
             <w:pict>
-              <v:rect id="shape_0" stroked="f" o:allowincell="f" style="position:absolute;margin-left:180.45pt;margin-top:-2.8pt;width:49.4pt;height:38.4pt;mso-wrap-style:square;v-text-anchor:top" wp14:anchorId="5CF04B2F">
+              <v:rect id="shape_0" stroked="f" o:allowincell="f" style="position:absolute;margin-left:187pt;margin-top:-2.75pt;width:49.4pt;height:38.4pt;mso-wrap-style:square;v-text-anchor:top" wp14:anchorId="5CF04B2F">
                 <v:fill o:detectmouseclick="t" on="false"/>
                 <v:stroke color="#3465a4" joinstyle="round" endcap="flat"/>
                 <v:textbox>
@@ -1241,9 +1223,7 @@
                         <w:bidi w:val="0"/>
                         <w:spacing w:lineRule="auto" w:line="276" w:before="0" w:after="200"/>
                         <w:jc w:val="center"/>
-                        <w:rPr>
-                          <w:color w:val="000000"/>
-                        </w:rPr>
+                        <w:rPr/>
                       </w:pPr>
                       <w:r>
                         <w:rPr>
@@ -1264,7 +1244,7 @@
         <mc:AlternateContent>
           <mc:Choice Requires="wps">
             <w:drawing>
-              <wp:anchor distT="0" distB="0" distL="0" distR="0" simplePos="0" relativeHeight="107" behindDoc="0" locked="0" layoutInCell="1" allowOverlap="1" wp14:anchorId="3BEC66EE">
+              <wp:anchor distT="0" distB="0" distL="0" distR="0" simplePos="0" relativeHeight="113" behindDoc="0" locked="0" layoutInCell="1" allowOverlap="1" wp14:anchorId="3BEC66EE">
                 <wp:simplePos x="0" y="0"/>
                 <wp:positionH relativeFrom="column">
                   <wp:posOffset>2965450</wp:posOffset>
@@ -1309,9 +1289,7 @@
                               <w:bidi w:val="0"/>
                               <w:spacing w:lineRule="auto" w:line="276" w:before="0" w:after="200"/>
                               <w:jc w:val="center"/>
-                              <w:rPr>
-                                <w:color w:val="000000"/>
-                              </w:rPr>
+                              <w:rPr/>
                             </w:pPr>
                             <w:r>
                               <w:rPr>
@@ -1348,9 +1326,7 @@
                         <w:bidi w:val="0"/>
                         <w:spacing w:lineRule="auto" w:line="276" w:before="0" w:after="200"/>
                         <w:jc w:val="center"/>
-                        <w:rPr>
-                          <w:color w:val="000000"/>
-                        </w:rPr>
+                        <w:rPr/>
                       </w:pPr>
                       <w:r>
                         <w:rPr>
@@ -1413,6 +1389,7 @@
           <w:tab w:val="left" w:pos="4536" w:leader="none"/>
         </w:tabs>
         <w:spacing w:lineRule="atLeast" w:line="198" w:before="0" w:after="198"/>
+        <w:jc w:val="both"/>
         <w:rPr/>
       </w:pPr>
       <w:r>
@@ -1427,13 +1404,13 @@
         <mc:AlternateContent>
           <mc:Choice Requires="wps">
             <w:drawing>
-              <wp:anchor distT="0" distB="0" distL="0" distR="0" simplePos="0" relativeHeight="93" behindDoc="0" locked="0" layoutInCell="1" allowOverlap="1" wp14:anchorId="59D92C92">
+              <wp:anchor distT="0" distB="0" distL="0" distR="0" simplePos="0" relativeHeight="99" behindDoc="0" locked="0" layoutInCell="1" allowOverlap="1" wp14:anchorId="59D92C92">
                 <wp:simplePos x="0" y="0"/>
                 <wp:positionH relativeFrom="column">
                   <wp:posOffset>86360</wp:posOffset>
                 </wp:positionH>
                 <wp:positionV relativeFrom="paragraph">
-                  <wp:posOffset>-72390</wp:posOffset>
+                  <wp:posOffset>-43815</wp:posOffset>
                 </wp:positionV>
                 <wp:extent cx="5295900" cy="488315"/>
                 <wp:effectExtent l="0" t="0" r="0" b="0"/>
@@ -1496,7 +1473,7 @@
           </mc:Choice>
           <mc:Fallback>
             <w:pict>
-              <v:rect id="shape_0" stroked="f" o:allowincell="f" style="position:absolute;margin-left:6.8pt;margin-top:-5.7pt;width:416.95pt;height:38.4pt;mso-wrap-style:square;v-text-anchor:top" wp14:anchorId="59D92C92">
+              <v:rect id="shape_0" stroked="f" o:allowincell="f" style="position:absolute;margin-left:6.8pt;margin-top:-3.45pt;width:416.95pt;height:38.4pt;mso-wrap-style:square;v-text-anchor:top" wp14:anchorId="59D92C92">
                 <v:fill o:detectmouseclick="t" on="false"/>
                 <v:stroke color="#3465a4" joinstyle="round" endcap="flat"/>
                 <v:textbox>
@@ -1546,6 +1523,7 @@
           <w:tab w:val="left" w:pos="4536" w:leader="none"/>
         </w:tabs>
         <w:spacing w:lineRule="atLeast" w:line="198" w:before="0" w:after="198"/>
+        <w:jc w:val="both"/>
         <w:rPr/>
       </w:pPr>
       <w:r>
@@ -1584,7 +1562,7 @@
         <mc:AlternateContent>
           <mc:Choice Requires="wps">
             <w:drawing>
-              <wp:anchor distT="0" distB="0" distL="0" distR="0" simplePos="0" relativeHeight="95" behindDoc="0" locked="0" layoutInCell="1" allowOverlap="1" wp14:anchorId="5544D1F1">
+              <wp:anchor distT="0" distB="0" distL="0" distR="0" simplePos="0" relativeHeight="101" behindDoc="0" locked="0" layoutInCell="1" allowOverlap="1" wp14:anchorId="5544D1F1">
                 <wp:simplePos x="0" y="0"/>
                 <wp:positionH relativeFrom="column">
                   <wp:posOffset>1210945</wp:posOffset>
@@ -1626,15 +1604,12 @@
                               <w:pStyle w:val="Normal1"/>
                               <w:spacing w:before="0" w:after="200"/>
                               <w:rPr>
-                                <w:rFonts w:ascii="TH SarabunIT๙" w:hAnsi="TH SarabunIT๙" w:cs="TH SarabunIT๙"/>
+                                <w:color w:val="000000"/>
                               </w:rPr>
                             </w:pPr>
                             <w:r>
                               <w:rPr>
-                                <w:rFonts w:cs="TH SarabunIT๙"/>
                                 <w:color w:val="000000"/>
-                                <w:sz w:val="34"/>
-                                <w:szCs w:val="34"/>
                               </w:rPr>
                               <w:t>{{ req_name }}</w:t>
                             </w:r>
@@ -1662,15 +1637,12 @@
                         <w:pStyle w:val="Normal1"/>
                         <w:spacing w:before="0" w:after="200"/>
                         <w:rPr>
-                          <w:rFonts w:ascii="TH SarabunIT๙" w:hAnsi="TH SarabunIT๙" w:cs="TH SarabunIT๙"/>
+                          <w:color w:val="000000"/>
                         </w:rPr>
                       </w:pPr>
                       <w:r>
                         <w:rPr>
-                          <w:rFonts w:cs="TH SarabunIT๙"/>
                           <w:color w:val="000000"/>
-                          <w:sz w:val="34"/>
-                          <w:szCs w:val="34"/>
                         </w:rPr>
                         <w:t>{{ req_name }}</w:t>
                       </w:r>
@@ -1685,15 +1657,15 @@
         <mc:AlternateContent>
           <mc:Choice Requires="wps">
             <w:drawing>
-              <wp:anchor distT="0" distB="0" distL="0" distR="0" simplePos="0" relativeHeight="101" behindDoc="0" locked="0" layoutInCell="1" allowOverlap="1" wp14:anchorId="71CA97A7">
+              <wp:anchor distT="0" distB="0" distL="0" distR="0" simplePos="0" relativeHeight="107" behindDoc="0" locked="0" layoutInCell="1" allowOverlap="1" wp14:anchorId="71CA97A7">
                 <wp:simplePos x="0" y="0"/>
                 <wp:positionH relativeFrom="column">
-                  <wp:posOffset>3386455</wp:posOffset>
+                  <wp:posOffset>3342640</wp:posOffset>
                 </wp:positionH>
                 <wp:positionV relativeFrom="paragraph">
                   <wp:posOffset>-41275</wp:posOffset>
                 </wp:positionV>
-                <wp:extent cx="1485265" cy="488315"/>
+                <wp:extent cx="2367280" cy="488315"/>
                 <wp:effectExtent l="0" t="0" r="0" b="0"/>
                 <wp:wrapNone/>
                 <wp:docPr id="13" name="Text Frame 10"/>
@@ -1704,7 +1676,149 @@
                       <wps:spPr>
                         <a:xfrm>
                           <a:off x="0" y="0"/>
-                          <a:ext cx="1485360" cy="488160"/>
+                          <a:ext cx="2367360" cy="488160"/>
+                        </a:xfrm>
+                        <a:prstGeom prst="rect">
+                          <a:avLst/>
+                        </a:prstGeom>
+                        <a:noFill/>
+                        <a:ln w="0">
+                          <a:noFill/>
+                        </a:ln>
+                      </wps:spPr>
+                      <wps:style>
+                        <a:lnRef idx="0"/>
+                        <a:fillRef idx="0"/>
+                        <a:effectRef idx="0"/>
+                        <a:fontRef idx="minor"/>
+                      </wps:style>
+                      <wps:txbx>
+                        <w:txbxContent>
+                          <w:p>
+                            <w:pPr>
+                              <w:pStyle w:val="Normal1"/>
+                              <w:spacing w:before="0" w:after="200"/>
+                              <w:rPr>
+                                <w:color w:val="000000"/>
+                              </w:rPr>
+                            </w:pPr>
+                            <w:r>
+                              <w:rPr>
+                                <w:color w:val="000000"/>
+                              </w:rPr>
+                              <w:t>{{ req_pos }}</w:t>
+                            </w:r>
+                          </w:p>
+                        </w:txbxContent>
+                      </wps:txbx>
+                      <wps:bodyPr lIns="0" rIns="0" tIns="0" bIns="0" anchor="t">
+                        <a:noAutofit/>
+                      </wps:bodyPr>
+                    </wps:wsp>
+                  </a:graphicData>
+                </a:graphic>
+              </wp:anchor>
+            </w:drawing>
+          </mc:Choice>
+          <mc:Fallback>
+            <w:pict>
+              <v:rect id="shape_0" stroked="f" o:allowincell="f" style="position:absolute;margin-left:263.2pt;margin-top:-3.25pt;width:186.35pt;height:38.4pt;mso-wrap-style:square;v-text-anchor:top" wp14:anchorId="71CA97A7">
+                <v:fill o:detectmouseclick="t" on="false"/>
+                <v:stroke color="#3465a4" joinstyle="round" endcap="flat"/>
+                <v:textbox>
+                  <w:txbxContent>
+                    <w:p>
+                      <w:pPr>
+                        <w:pStyle w:val="Normal1"/>
+                        <w:spacing w:before="0" w:after="200"/>
+                        <w:rPr>
+                          <w:color w:val="000000"/>
+                        </w:rPr>
+                      </w:pPr>
+                      <w:r>
+                        <w:rPr>
+                          <w:color w:val="000000"/>
+                        </w:rPr>
+                        <w:t>{{ req_pos }}</w:t>
+                      </w:r>
+                    </w:p>
+                  </w:txbxContent>
+                </v:textbox>
+                <w10:wrap type="none"/>
+              </v:rect>
+            </w:pict>
+          </mc:Fallback>
+        </mc:AlternateContent>
+      </w:r>
+      <w:r>
+        <w:rPr>
+          <w:rFonts w:eastAsia="Sarabun" w:cs="TH SarabunIT๙" w:hint="cs"/>
+          <w:sz w:val="34"/>
+          <w:szCs w:val="34"/>
+        </w:rPr>
+        <w:t>......................................................................</w:t>
+      </w:r>
+    </w:p>
+    <w:p>
+      <w:pPr>
+        <w:pStyle w:val="Normal1"/>
+        <w:tabs>
+          <w:tab w:val="clear" w:pos="720"/>
+          <w:tab w:val="left" w:pos="1134" w:leader="none"/>
+          <w:tab w:val="left" w:pos="4536" w:leader="none"/>
+        </w:tabs>
+        <w:spacing w:lineRule="atLeast" w:line="198" w:before="0" w:after="198"/>
+        <w:jc w:val="both"/>
+        <w:rPr/>
+      </w:pPr>
+      <w:r>
+        <w:rPr>
+          <w:rFonts w:ascii="TH SarabunIT๙" w:hAnsi="TH SarabunIT๙" w:eastAsia="Sarabun" w:hint="cs"/>
+          <w:sz w:val="34"/>
+          <w:szCs w:val="34"/>
+        </w:rPr>
+        <w:t>อายุ</w:t>
+      </w:r>
+      <w:r>
+        <w:rPr>
+          <w:rFonts w:eastAsia="Sarabun" w:cs="TH SarabunIT๙" w:hint="cs"/>
+          <w:sz w:val="34"/>
+          <w:szCs w:val="34"/>
+        </w:rPr>
+        <w:t>................</w:t>
+      </w:r>
+      <w:r>
+        <w:rPr>
+          <w:rFonts w:ascii="TH SarabunIT๙" w:hAnsi="TH SarabunIT๙" w:eastAsia="Sarabun" w:hint="cs"/>
+          <w:sz w:val="34"/>
+          <w:szCs w:val="34"/>
+        </w:rPr>
+        <w:t>ปี  อาชีพ  รับราชการ  สถานที่ทำงาน</w:t>
+      </w:r>
+      <w:r>
+        <mc:AlternateContent>
+          <mc:Choice Requires="wps">
+            <w:drawing>
+              <wp:anchor distT="0" distB="0" distL="0" distR="0" simplePos="0" relativeHeight="19" behindDoc="0" locked="0" layoutInCell="1" allowOverlap="1" wp14:anchorId="2BF2E1DA">
+                <wp:simplePos x="0" y="0"/>
+                <wp:positionH relativeFrom="column">
+                  <wp:posOffset>2912745</wp:posOffset>
+                </wp:positionH>
+                <wp:positionV relativeFrom="paragraph">
+                  <wp:posOffset>-41275</wp:posOffset>
+                </wp:positionV>
+                <wp:extent cx="2830195" cy="488315"/>
+                <wp:effectExtent l="0" t="0" r="0" b="0"/>
+                <wp:wrapNone/>
+                <wp:docPr id="14" name="Text Frame 12"/>
+                <a:graphic xmlns:a="http://schemas.openxmlformats.org/drawingml/2006/main">
+                  <a:graphicData uri="http://schemas.microsoft.com/office/word/2010/wordprocessingShape">
+                    <wps:wsp>
+                      <wps:cNvSpPr/>
+                      <wps:spPr>
+                        <a:xfrm>
+                          <a:off x="0" y="0"/>
+                          <a:ext cx="2830320" cy="488160"/>
                         </a:xfrm>
                         <a:prstGeom prst="rect">
                           <a:avLst/>
@@ -1729,163 +1843,8 @@
                               <w:suppressAutoHyphens w:val="true"/>
                               <w:bidi w:val="0"/>
                               <w:spacing w:lineRule="auto" w:line="276" w:before="0" w:after="200"/>
-                              <w:jc w:val="start"/>
-                              <w:rPr>
-                                <w:color w:val="000000"/>
-                              </w:rPr>
-                            </w:pPr>
-                            <w:r>
-                              <w:rPr>
-                                <w:color w:val="000000"/>
-                                <w:sz w:val="34"/>
-                                <w:szCs w:val="34"/>
-                              </w:rPr>
-                              <w:t>{{ req_pos }}</w:t>
-                            </w:r>
-                          </w:p>
-                        </w:txbxContent>
-                      </wps:txbx>
-                      <wps:bodyPr lIns="0" rIns="0" tIns="0" bIns="0" anchor="t">
-                        <a:noAutofit/>
-                      </wps:bodyPr>
-                    </wps:wsp>
-                  </a:graphicData>
-                </a:graphic>
-              </wp:anchor>
-            </w:drawing>
-          </mc:Choice>
-          <mc:Fallback>
-            <w:pict>
-              <v:rect id="shape_0" stroked="f" o:allowincell="f" style="position:absolute;margin-left:266.65pt;margin-top:-3.25pt;width:116.9pt;height:38.4pt;mso-wrap-style:square;v-text-anchor:top" wp14:anchorId="71CA97A7">
-                <v:fill o:detectmouseclick="t" on="false"/>
-                <v:stroke color="#3465a4" joinstyle="round" endcap="flat"/>
-                <v:textbox>
-                  <w:txbxContent>
-                    <w:p>
-                      <w:pPr>
-                        <w:pStyle w:val="Normal1"/>
-                        <w:widowControl/>
-                        <w:suppressAutoHyphens w:val="true"/>
-                        <w:bidi w:val="0"/>
-                        <w:spacing w:lineRule="auto" w:line="276" w:before="0" w:after="200"/>
-                        <w:jc w:val="start"/>
-                        <w:rPr>
-                          <w:color w:val="000000"/>
-                        </w:rPr>
-                      </w:pPr>
-                      <w:r>
-                        <w:rPr>
-                          <w:color w:val="000000"/>
-                          <w:sz w:val="34"/>
-                          <w:szCs w:val="34"/>
-                        </w:rPr>
-                        <w:t>{{ req_pos }}</w:t>
-                      </w:r>
-                    </w:p>
-                  </w:txbxContent>
-                </v:textbox>
-                <w10:wrap type="none"/>
-              </v:rect>
-            </w:pict>
-          </mc:Fallback>
-        </mc:AlternateContent>
-      </w:r>
-      <w:r>
-        <w:rPr>
-          <w:rFonts w:eastAsia="Sarabun" w:cs="TH SarabunIT๙" w:hint="cs"/>
-          <w:sz w:val="34"/>
-          <w:szCs w:val="34"/>
-        </w:rPr>
-        <w:t>......................................................................</w:t>
-      </w:r>
-    </w:p>
-    <w:p>
-      <w:pPr>
-        <w:pStyle w:val="Normal1"/>
-        <w:tabs>
-          <w:tab w:val="clear" w:pos="720"/>
-          <w:tab w:val="left" w:pos="1134" w:leader="none"/>
-          <w:tab w:val="left" w:pos="4536" w:leader="none"/>
-        </w:tabs>
-        <w:spacing w:lineRule="atLeast" w:line="198" w:before="0" w:after="198"/>
-        <w:rPr/>
-      </w:pPr>
-      <w:r>
-        <w:rPr>
-          <w:rFonts w:ascii="TH SarabunIT๙" w:hAnsi="TH SarabunIT๙" w:eastAsia="Sarabun" w:hint="cs"/>
-          <w:sz w:val="34"/>
-          <w:szCs w:val="34"/>
-        </w:rPr>
-        <w:t>อายุ</w:t>
-      </w:r>
-      <w:r>
-        <w:rPr>
-          <w:rFonts w:eastAsia="Sarabun" w:cs="TH SarabunIT๙" w:hint="cs"/>
-          <w:sz w:val="34"/>
-          <w:szCs w:val="34"/>
-        </w:rPr>
-        <w:t>................</w:t>
-      </w:r>
-      <w:r>
-        <w:rPr>
-          <w:rFonts w:ascii="TH SarabunIT๙" w:hAnsi="TH SarabunIT๙" w:eastAsia="Sarabun" w:hint="cs"/>
-          <w:sz w:val="34"/>
-          <w:szCs w:val="34"/>
-        </w:rPr>
-        <w:t>ปี  อาชีพ  รับราชการ  สถานที่ทำงาน</w:t>
-      </w:r>
-      <w:r>
-        <mc:AlternateContent>
-          <mc:Choice Requires="wps">
-            <w:drawing>
-              <wp:anchor distT="0" distB="0" distL="0" distR="0" simplePos="0" relativeHeight="11" behindDoc="0" locked="0" layoutInCell="1" allowOverlap="1" wp14:anchorId="2BF2E1DA">
-                <wp:simplePos x="0" y="0"/>
-                <wp:positionH relativeFrom="column">
-                  <wp:posOffset>2912745</wp:posOffset>
-                </wp:positionH>
-                <wp:positionV relativeFrom="paragraph">
-                  <wp:posOffset>-41275</wp:posOffset>
-                </wp:positionV>
-                <wp:extent cx="1485265" cy="488315"/>
-                <wp:effectExtent l="0" t="0" r="0" b="0"/>
-                <wp:wrapNone/>
-                <wp:docPr id="14" name="Text Frame 12"/>
-                <a:graphic xmlns:a="http://schemas.openxmlformats.org/drawingml/2006/main">
-                  <a:graphicData uri="http://schemas.microsoft.com/office/word/2010/wordprocessingShape">
-                    <wps:wsp>
-                      <wps:cNvSpPr/>
-                      <wps:spPr>
-                        <a:xfrm>
-                          <a:off x="0" y="0"/>
-                          <a:ext cx="1485360" cy="488160"/>
-                        </a:xfrm>
-                        <a:prstGeom prst="rect">
-                          <a:avLst/>
-                        </a:prstGeom>
-                        <a:noFill/>
-                        <a:ln w="0">
-                          <a:noFill/>
-                        </a:ln>
-                      </wps:spPr>
-                      <wps:style>
-                        <a:lnRef idx="0"/>
-                        <a:fillRef idx="0"/>
-                        <a:effectRef idx="0"/>
-                        <a:fontRef idx="minor"/>
-                      </wps:style>
-                      <wps:txbx>
-                        <w:txbxContent>
-                          <w:p>
-                            <w:pPr>
-                              <w:pStyle w:val="Normal1"/>
-                              <w:widowControl/>
-                              <w:suppressAutoHyphens w:val="true"/>
-                              <w:bidi w:val="0"/>
-                              <w:spacing w:lineRule="auto" w:line="276" w:before="0" w:after="200"/>
-                              <w:jc w:val="start"/>
-                              <w:rPr>
-                                <w:color w:val="000000"/>
-                              </w:rPr>
+                              <w:jc w:val="center"/>
+                              <w:rPr/>
                             </w:pPr>
                             <w:r>
                               <w:rPr>
@@ -1909,7 +1868,7 @@
           </mc:Choice>
           <mc:Fallback>
             <w:pict>
-              <v:rect id="shape_0" stroked="f" o:allowincell="f" style="position:absolute;margin-left:229.35pt;margin-top:-3.25pt;width:116.9pt;height:38.4pt;mso-wrap-style:square;v-text-anchor:top" wp14:anchorId="2BF2E1DA">
+              <v:rect id="shape_0" stroked="f" o:allowincell="f" style="position:absolute;margin-left:229.35pt;margin-top:-3.25pt;width:222.8pt;height:38.4pt;mso-wrap-style:square;v-text-anchor:top" wp14:anchorId="2BF2E1DA">
                 <v:fill o:detectmouseclick="t" on="false"/>
                 <v:stroke color="#3465a4" joinstyle="round" endcap="flat"/>
                 <v:textbox>
@@ -1921,10 +1880,8 @@
                         <w:suppressAutoHyphens w:val="true"/>
                         <w:bidi w:val="0"/>
                         <w:spacing w:lineRule="auto" w:line="276" w:before="0" w:after="200"/>
-                        <w:jc w:val="start"/>
-                        <w:rPr>
-                          <w:color w:val="000000"/>
-                        </w:rPr>
+                        <w:jc w:val="center"/>
+                        <w:rPr/>
                       </w:pPr>
                       <w:r>
                         <w:rPr>
@@ -1945,10 +1902,10 @@
         <mc:AlternateContent>
           <mc:Choice Requires="wps">
             <w:drawing>
-              <wp:anchor distT="0" distB="0" distL="0" distR="0" simplePos="0" relativeHeight="15" behindDoc="0" locked="0" layoutInCell="1" allowOverlap="1" wp14:anchorId="6A1A27FD">
+              <wp:anchor distT="0" distB="0" distL="0" distR="0" simplePos="0" relativeHeight="23" behindDoc="0" locked="0" layoutInCell="1" allowOverlap="1" wp14:anchorId="6A1A27FD">
                 <wp:simplePos x="0" y="0"/>
                 <wp:positionH relativeFrom="column">
-                  <wp:posOffset>254000</wp:posOffset>
+                  <wp:posOffset>330200</wp:posOffset>
                 </wp:positionH>
                 <wp:positionV relativeFrom="paragraph">
                   <wp:posOffset>-46990</wp:posOffset>
@@ -2016,7 +1973,7 @@
           </mc:Choice>
           <mc:Fallback>
             <w:pict>
-              <v:rect id="shape_0" stroked="f" o:allowincell="f" style="position:absolute;margin-left:20pt;margin-top:-3.7pt;width:116.9pt;height:38.4pt;mso-wrap-style:square;v-text-anchor:top" wp14:anchorId="6A1A27FD">
+              <v:rect id="shape_0" stroked="f" o:allowincell="f" style="position:absolute;margin-left:26pt;margin-top:-3.7pt;width:116.9pt;height:38.4pt;mso-wrap-style:square;v-text-anchor:top" wp14:anchorId="6A1A27FD">
                 <v:fill o:detectmouseclick="t" on="false"/>
                 <v:stroke color="#3465a4" joinstyle="round" endcap="flat"/>
                 <v:textbox>
@@ -2062,12 +2019,7 @@
     <w:p>
       <w:pPr>
         <w:pStyle w:val="Normal1"/>
-        <w:tabs>
-          <w:tab w:val="clear" w:pos="720"/>
-          <w:tab w:val="left" w:pos="1134" w:leader="none"/>
-          <w:tab w:val="left" w:pos="4536" w:leader="none"/>
-        </w:tabs>
-        <w:spacing w:lineRule="atLeast" w:line="198" w:before="0" w:after="198"/>
+        <w:jc w:val="both"/>
         <w:rPr/>
       </w:pPr>
       <w:r>
@@ -2146,13 +2098,13 @@
         <mc:AlternateContent>
           <mc:Choice Requires="wps">
             <w:drawing>
-              <wp:anchor distT="0" distB="0" distL="0" distR="0" simplePos="0" relativeHeight="35" behindDoc="0" locked="0" layoutInCell="1" allowOverlap="1" wp14:anchorId="3C72A6D4">
+              <wp:anchor distT="0" distB="0" distL="0" distR="0" simplePos="0" relativeHeight="43" behindDoc="0" locked="0" layoutInCell="1" allowOverlap="1" wp14:anchorId="3C72A6D4">
                 <wp:simplePos x="0" y="0"/>
                 <wp:positionH relativeFrom="column">
-                  <wp:posOffset>737235</wp:posOffset>
+                  <wp:posOffset>401320</wp:posOffset>
                 </wp:positionH>
                 <wp:positionV relativeFrom="paragraph">
-                  <wp:posOffset>-38735</wp:posOffset>
+                  <wp:posOffset>-33020</wp:posOffset>
                 </wp:positionV>
                 <wp:extent cx="1485265" cy="488315"/>
                 <wp:effectExtent l="0" t="0" r="0" b="0"/>
@@ -2186,11 +2138,7 @@
                           <w:p>
                             <w:pPr>
                               <w:pStyle w:val="Normal1"/>
-                              <w:widowControl/>
-                              <w:suppressAutoHyphens w:val="true"/>
-                              <w:bidi w:val="0"/>
-                              <w:spacing w:lineRule="auto" w:line="276" w:before="0" w:after="200"/>
-                              <w:jc w:val="start"/>
+                              <w:spacing w:before="0" w:after="200"/>
                               <w:rPr>
                                 <w:color w:val="000000"/>
                               </w:rPr>
@@ -2198,8 +2146,6 @@
                             <w:r>
                               <w:rPr>
                                 <w:color w:val="000000"/>
-                                <w:sz w:val="34"/>
-                                <w:szCs w:val="34"/>
                               </w:rPr>
                               <w:t>{{ req_sub_district }}</w:t>
                             </w:r>
@@ -2217,7 +2163,7 @@
           </mc:Choice>
           <mc:Fallback>
             <w:pict>
-              <v:rect id="shape_0" stroked="f" o:allowincell="f" style="position:absolute;margin-left:58.05pt;margin-top:-3.05pt;width:116.9pt;height:38.4pt;mso-wrap-style:square;v-text-anchor:top" wp14:anchorId="3C72A6D4">
+              <v:rect id="shape_0" stroked="f" o:allowincell="f" style="position:absolute;margin-left:31.6pt;margin-top:-2.6pt;width:116.9pt;height:38.4pt;mso-wrap-style:square;v-text-anchor:top" wp14:anchorId="3C72A6D4">
                 <v:fill o:detectmouseclick="t" on="false"/>
                 <v:stroke color="#3465a4" joinstyle="round" endcap="flat"/>
                 <v:textbox>
@@ -2225,11 +2171,7 @@
                     <w:p>
                       <w:pPr>
                         <w:pStyle w:val="Normal1"/>
-                        <w:widowControl/>
-                        <w:suppressAutoHyphens w:val="true"/>
-                        <w:bidi w:val="0"/>
-                        <w:spacing w:lineRule="auto" w:line="276" w:before="0" w:after="200"/>
-                        <w:jc w:val="start"/>
+                        <w:spacing w:before="0" w:after="200"/>
                         <w:rPr>
                           <w:color w:val="000000"/>
                         </w:rPr>
@@ -2237,8 +2179,6 @@
                       <w:r>
                         <w:rPr>
                           <w:color w:val="000000"/>
-                          <w:sz w:val="34"/>
-                          <w:szCs w:val="34"/>
                         </w:rPr>
                         <w:t>{{ req_sub_district }}</w:t>
                       </w:r>
@@ -2253,7 +2193,7 @@
         <mc:AlternateContent>
           <mc:Choice Requires="wps">
             <w:drawing>
-              <wp:anchor distT="0" distB="0" distL="0" distR="0" simplePos="0" relativeHeight="77" behindDoc="0" locked="0" layoutInCell="1" allowOverlap="1" wp14:anchorId="0B97DFB2">
+              <wp:anchor distT="0" distB="0" distL="0" distR="0" simplePos="0" relativeHeight="83" behindDoc="0" locked="0" layoutInCell="1" allowOverlap="1" wp14:anchorId="0B97DFB2">
                 <wp:simplePos x="0" y="0"/>
                 <wp:positionH relativeFrom="column">
                   <wp:posOffset>2395855</wp:posOffset>
@@ -2293,11 +2233,7 @@
                           <w:p>
                             <w:pPr>
                               <w:pStyle w:val="Normal1"/>
-                              <w:widowControl/>
-                              <w:suppressAutoHyphens w:val="true"/>
-                              <w:bidi w:val="0"/>
-                              <w:spacing w:lineRule="auto" w:line="276" w:before="0" w:after="200"/>
-                              <w:jc w:val="start"/>
+                              <w:spacing w:before="0" w:after="200"/>
                               <w:rPr>
                                 <w:color w:val="000000"/>
                               </w:rPr>
@@ -2305,8 +2241,6 @@
                             <w:r>
                               <w:rPr>
                                 <w:color w:val="000000"/>
-                                <w:sz w:val="34"/>
-                                <w:szCs w:val="34"/>
                               </w:rPr>
                               <w:t>{{ req_district }}</w:t>
                             </w:r>
@@ -2332,11 +2266,7 @@
                     <w:p>
                       <w:pPr>
                         <w:pStyle w:val="Normal1"/>
-                        <w:widowControl/>
-                        <w:suppressAutoHyphens w:val="true"/>
-                        <w:bidi w:val="0"/>
-                        <w:spacing w:lineRule="auto" w:line="276" w:before="0" w:after="200"/>
-                        <w:jc w:val="start"/>
+                        <w:spacing w:before="0" w:after="200"/>
                         <w:rPr>
                           <w:color w:val="000000"/>
                         </w:rPr>
@@ -2344,8 +2274,6 @@
                       <w:r>
                         <w:rPr>
                           <w:color w:val="000000"/>
-                          <w:sz w:val="34"/>
-                          <w:szCs w:val="34"/>
                         </w:rPr>
                         <w:t>{{ req_district }}</w:t>
                       </w:r>
@@ -2360,13 +2288,13 @@
         <mc:AlternateContent>
           <mc:Choice Requires="wps">
             <w:drawing>
-              <wp:anchor distT="0" distB="0" distL="0" distR="0" simplePos="0" relativeHeight="79" behindDoc="0" locked="0" layoutInCell="1" allowOverlap="1" wp14:anchorId="6B3950FB">
+              <wp:anchor distT="0" distB="0" distL="0" distR="0" simplePos="0" relativeHeight="85" behindDoc="0" locked="0" layoutInCell="1" allowOverlap="1" wp14:anchorId="6B3950FB">
                 <wp:simplePos x="0" y="0"/>
                 <wp:positionH relativeFrom="column">
                   <wp:posOffset>4334510</wp:posOffset>
                 </wp:positionH>
                 <wp:positionV relativeFrom="paragraph">
-                  <wp:posOffset>-16510</wp:posOffset>
+                  <wp:posOffset>-33020</wp:posOffset>
                 </wp:positionV>
                 <wp:extent cx="1485265" cy="488315"/>
                 <wp:effectExtent l="0" t="0" r="0" b="0"/>
@@ -2405,9 +2333,7 @@
                               <w:bidi w:val="0"/>
                               <w:spacing w:lineRule="auto" w:line="276" w:before="0" w:after="200"/>
                               <w:jc w:val="start"/>
-                              <w:rPr>
-                                <w:color w:val="000000"/>
-                              </w:rPr>
+                              <w:rPr/>
                             </w:pPr>
                             <w:r>
                               <w:rPr>
@@ -2431,7 +2357,7 @@
           </mc:Choice>
           <mc:Fallback>
             <w:pict>
-              <v:rect id="shape_0" stroked="f" o:allowincell="f" style="position:absolute;margin-left:341.3pt;margin-top:-1.3pt;width:116.9pt;height:38.4pt;mso-wrap-style:square;v-text-anchor:top" wp14:anchorId="6B3950FB">
+              <v:rect id="shape_0" stroked="f" o:allowincell="f" style="position:absolute;margin-left:341.3pt;margin-top:-2.6pt;width:116.9pt;height:38.4pt;mso-wrap-style:square;v-text-anchor:top" wp14:anchorId="6B3950FB">
                 <v:fill o:detectmouseclick="t" on="false"/>
                 <v:stroke color="#3465a4" joinstyle="round" endcap="flat"/>
                 <v:textbox>
@@ -2444,9 +2370,7 @@
                         <w:bidi w:val="0"/>
                         <w:spacing w:lineRule="auto" w:line="276" w:before="0" w:after="200"/>
                         <w:jc w:val="start"/>
-                        <w:rPr>
-                          <w:color w:val="000000"/>
-                        </w:rPr>
+                        <w:rPr/>
                       </w:pPr>
                       <w:r>
                         <w:rPr>
@@ -2483,6 +2407,7 @@
           <w:tab w:val="left" w:pos="4536" w:leader="none"/>
         </w:tabs>
         <w:spacing w:lineRule="atLeast" w:line="198" w:before="0" w:after="198"/>
+        <w:jc w:val="both"/>
         <w:rPr/>
       </w:pPr>
       <w:r>
@@ -2505,7 +2430,7 @@
         <mc:AlternateContent>
           <mc:Choice Requires="wps">
             <w:drawing>
-              <wp:anchor distT="0" distB="0" distL="0" distR="0" simplePos="0" relativeHeight="17" behindDoc="0" locked="0" layoutInCell="1" allowOverlap="1" wp14:anchorId="2DFC763C">
+              <wp:anchor distT="0" distB="0" distL="0" distR="0" simplePos="0" relativeHeight="25" behindDoc="0" locked="0" layoutInCell="1" allowOverlap="1" wp14:anchorId="2DFC763C">
                 <wp:simplePos x="0" y="0"/>
                 <wp:positionH relativeFrom="column">
                   <wp:posOffset>549910</wp:posOffset>
@@ -2628,6 +2553,7 @@
           <w:tab w:val="left" w:pos="4536" w:leader="none"/>
         </w:tabs>
         <w:spacing w:lineRule="atLeast" w:line="198" w:before="0" w:after="198"/>
+        <w:jc w:val="both"/>
         <w:rPr/>
       </w:pPr>
       <w:r>
@@ -2808,7 +2734,7 @@
         <mc:AlternateContent>
           <mc:Choice Requires="wps">
             <w:drawing>
-              <wp:anchor distT="0" distB="0" distL="0" distR="0" simplePos="0" relativeHeight="13" behindDoc="0" locked="0" layoutInCell="1" allowOverlap="1" wp14:anchorId="37EAA4AC">
+              <wp:anchor distT="0" distB="0" distL="0" distR="0" simplePos="0" relativeHeight="21" behindDoc="0" locked="0" layoutInCell="1" allowOverlap="1" wp14:anchorId="37EAA4AC">
                 <wp:simplePos x="0" y="0"/>
                 <wp:positionH relativeFrom="column">
                   <wp:posOffset>1487805</wp:posOffset>
@@ -2915,7 +2841,7 @@
         <mc:AlternateContent>
           <mc:Choice Requires="wps">
             <w:drawing>
-              <wp:anchor distT="0" distB="0" distL="0" distR="0" simplePos="0" relativeHeight="19" behindDoc="0" locked="0" layoutInCell="1" allowOverlap="1" wp14:anchorId="31F98848">
+              <wp:anchor distT="0" distB="0" distL="0" distR="0" simplePos="0" relativeHeight="27" behindDoc="0" locked="0" layoutInCell="1" allowOverlap="1" wp14:anchorId="31F98848">
                 <wp:simplePos x="0" y="0"/>
                 <wp:positionH relativeFrom="column">
                   <wp:posOffset>2810510</wp:posOffset>
@@ -2955,11 +2881,7 @@
                           <w:p>
                             <w:pPr>
                               <w:pStyle w:val="Normal1"/>
-                              <w:widowControl/>
-                              <w:suppressAutoHyphens w:val="true"/>
-                              <w:bidi w:val="0"/>
-                              <w:spacing w:lineRule="auto" w:line="276" w:before="0" w:after="200"/>
-                              <w:jc w:val="start"/>
+                              <w:spacing w:before="0" w:after="200"/>
                               <w:rPr>
                                 <w:color w:val="000000"/>
                               </w:rPr>
@@ -2967,8 +2889,6 @@
                             <w:r>
                               <w:rPr>
                                 <w:color w:val="000000"/>
-                                <w:sz w:val="34"/>
-                                <w:szCs w:val="34"/>
                               </w:rPr>
                               <w:t>{{ cause_text_1 }}</w:t>
                             </w:r>
@@ -2994,11 +2914,7 @@
                     <w:p>
                       <w:pPr>
                         <w:pStyle w:val="Normal1"/>
-                        <w:widowControl/>
-                        <w:suppressAutoHyphens w:val="true"/>
-                        <w:bidi w:val="0"/>
-                        <w:spacing w:lineRule="auto" w:line="276" w:before="0" w:after="200"/>
-                        <w:jc w:val="start"/>
+                        <w:spacing w:before="0" w:after="200"/>
                         <w:rPr>
                           <w:color w:val="000000"/>
                         </w:rPr>
@@ -3006,8 +2922,6 @@
                       <w:r>
                         <w:rPr>
                           <w:color w:val="000000"/>
-                          <w:sz w:val="34"/>
-                          <w:szCs w:val="34"/>
                         </w:rPr>
                         <w:t>{{ cause_text_1 }}</w:t>
                       </w:r>
@@ -3038,6 +2952,7 @@
           <w:tab w:val="left" w:pos="4536" w:leader="none"/>
         </w:tabs>
         <w:spacing w:lineRule="atLeast" w:line="198" w:before="0" w:after="198"/>
+        <w:jc w:val="both"/>
         <w:rPr/>
       </w:pPr>
       <w:r>
@@ -3059,6 +2974,7 @@
           <w:tab w:val="left" w:pos="4536" w:leader="none"/>
         </w:tabs>
         <w:spacing w:lineRule="atLeast" w:line="198" w:before="0" w:after="198"/>
+        <w:jc w:val="both"/>
         <w:rPr/>
       </w:pPr>
       <w:r>
@@ -3078,7 +2994,7 @@
         <mc:AlternateContent>
           <mc:Choice Requires="wps">
             <w:drawing>
-              <wp:anchor distT="5715" distB="4445" distL="5715" distR="4445" simplePos="0" relativeHeight="7" behindDoc="0" locked="0" layoutInCell="1" allowOverlap="1">
+              <wp:anchor distT="5715" distB="4445" distL="5715" distR="4445" simplePos="0" relativeHeight="15" behindDoc="0" locked="0" layoutInCell="1" allowOverlap="1">
                 <wp:simplePos x="0" y="0"/>
                 <wp:positionH relativeFrom="column">
                   <wp:posOffset>1440815</wp:posOffset>
@@ -3207,7 +3123,7 @@
         <mc:AlternateContent>
           <mc:Choice Requires="wps">
             <w:drawing>
-              <wp:anchor distT="0" distB="0" distL="0" distR="0" simplePos="0" relativeHeight="33" behindDoc="0" locked="0" layoutInCell="1" allowOverlap="1" wp14:anchorId="637A255E">
+              <wp:anchor distT="0" distB="0" distL="0" distR="0" simplePos="0" relativeHeight="41" behindDoc="0" locked="0" layoutInCell="1" allowOverlap="1" wp14:anchorId="637A255E">
                 <wp:simplePos x="0" y="0"/>
                 <wp:positionH relativeFrom="column">
                   <wp:posOffset>1460500</wp:posOffset>
@@ -3314,7 +3230,7 @@
         <mc:AlternateContent>
           <mc:Choice Requires="wps">
             <w:drawing>
-              <wp:anchor distT="0" distB="0" distL="0" distR="0" simplePos="0" relativeHeight="103" behindDoc="0" locked="0" layoutInCell="1" allowOverlap="1" wp14:anchorId="58D8629F">
+              <wp:anchor distT="0" distB="0" distL="0" distR="0" simplePos="0" relativeHeight="109" behindDoc="0" locked="0" layoutInCell="1" allowOverlap="1" wp14:anchorId="58D8629F">
                 <wp:simplePos x="0" y="0"/>
                 <wp:positionH relativeFrom="column">
                   <wp:posOffset>3944620</wp:posOffset>
@@ -3438,6 +3354,7 @@
           <w:tab w:val="left" w:pos="4536" w:leader="none"/>
         </w:tabs>
         <w:spacing w:lineRule="atLeast" w:line="198" w:before="0" w:after="198"/>
+        <w:jc w:val="both"/>
         <w:rPr/>
       </w:pPr>
       <w:r>
@@ -3475,6 +3392,7 @@
           <w:tab w:val="left" w:pos="4536" w:leader="none"/>
         </w:tabs>
         <w:spacing w:lineRule="atLeast" w:line="198" w:before="0" w:after="198"/>
+        <w:jc w:val="both"/>
         <w:rPr/>
       </w:pPr>
       <w:r>
@@ -3545,10 +3463,10 @@
         <mc:AlternateContent>
           <mc:Choice Requires="wps">
             <w:drawing>
-              <wp:anchor distT="0" distB="0" distL="0" distR="0" simplePos="0" relativeHeight="37" behindDoc="0" locked="0" layoutInCell="1" allowOverlap="1" wp14:anchorId="0ADC3FAE">
+              <wp:anchor distT="0" distB="0" distL="0" distR="0" simplePos="0" relativeHeight="45" behindDoc="0" locked="0" layoutInCell="1" allowOverlap="1" wp14:anchorId="0ADC3FAE">
                 <wp:simplePos x="0" y="0"/>
                 <wp:positionH relativeFrom="column">
-                  <wp:posOffset>1091565</wp:posOffset>
+                  <wp:posOffset>1214120</wp:posOffset>
                 </wp:positionH>
                 <wp:positionV relativeFrom="paragraph">
                   <wp:posOffset>-22860</wp:posOffset>
@@ -3589,16 +3507,17 @@
                               <w:suppressAutoHyphens w:val="true"/>
                               <w:bidi w:val="0"/>
                               <w:spacing w:lineRule="auto" w:line="276" w:before="0" w:after="200"/>
-                              <w:jc w:val="start"/>
-                              <w:rPr>
-                                <w:color w:val="000000"/>
+                              <w:jc w:val="center"/>
+                              <w:rPr>
+                                <w:sz w:val="32"/>
+                                <w:szCs w:val="32"/>
                               </w:rPr>
                             </w:pPr>
                             <w:r>
                               <w:rPr>
                                 <w:color w:val="000000"/>
-                                <w:sz w:val="34"/>
-                                <w:szCs w:val="34"/>
+                                <w:sz w:val="32"/>
+                                <w:szCs w:val="32"/>
                               </w:rPr>
                               <w:t>{{ acc_full_name }}</w:t>
                             </w:r>
@@ -3616,7 +3535,7 @@
           </mc:Choice>
           <mc:Fallback>
             <w:pict>
-              <v:rect id="shape_0" stroked="f" o:allowincell="f" style="position:absolute;margin-left:85.95pt;margin-top:-1.8pt;width:282.6pt;height:38.4pt;mso-wrap-style:square;v-text-anchor:top" wp14:anchorId="0ADC3FAE">
+              <v:rect id="shape_0" stroked="f" o:allowincell="f" style="position:absolute;margin-left:95.6pt;margin-top:-1.8pt;width:282.6pt;height:38.4pt;mso-wrap-style:square;v-text-anchor:top" wp14:anchorId="0ADC3FAE">
                 <v:fill o:detectmouseclick="t" on="false"/>
                 <v:stroke color="#3465a4" joinstyle="round" endcap="flat"/>
                 <v:textbox>
@@ -3628,16 +3547,17 @@
                         <w:suppressAutoHyphens w:val="true"/>
                         <w:bidi w:val="0"/>
                         <w:spacing w:lineRule="auto" w:line="276" w:before="0" w:after="200"/>
-                        <w:jc w:val="start"/>
-                        <w:rPr>
-                          <w:color w:val="000000"/>
+                        <w:jc w:val="center"/>
+                        <w:rPr>
+                          <w:sz w:val="32"/>
+                          <w:szCs w:val="32"/>
                         </w:rPr>
                       </w:pPr>
                       <w:r>
                         <w:rPr>
                           <w:color w:val="000000"/>
-                          <w:sz w:val="34"/>
-                          <w:szCs w:val="34"/>
+                          <w:sz w:val="32"/>
+                          <w:szCs w:val="32"/>
                         </w:rPr>
                         <w:t>{{ acc_full_name }}</w:t>
                       </w:r>
@@ -3652,7 +3572,7 @@
         <mc:AlternateContent>
           <mc:Choice Requires="wps">
             <w:drawing>
-              <wp:anchor distT="0" distB="0" distL="0" distR="0" simplePos="0" relativeHeight="39" behindDoc="0" locked="0" layoutInCell="1" allowOverlap="1" wp14:anchorId="5B960A8C">
+              <wp:anchor distT="0" distB="0" distL="0" distR="0" simplePos="0" relativeHeight="47" behindDoc="0" locked="0" layoutInCell="1" allowOverlap="1" wp14:anchorId="5B960A8C">
                 <wp:simplePos x="0" y="0"/>
                 <wp:positionH relativeFrom="column">
                   <wp:posOffset>4901565</wp:posOffset>
@@ -3660,7 +3580,7 @@
                 <wp:positionV relativeFrom="paragraph">
                   <wp:posOffset>-40005</wp:posOffset>
                 </wp:positionV>
-                <wp:extent cx="1485265" cy="488315"/>
+                <wp:extent cx="811530" cy="488315"/>
                 <wp:effectExtent l="0" t="0" r="0" b="0"/>
                 <wp:wrapNone/>
                 <wp:docPr id="27" name="Text Frame 20"/>
@@ -3671,7 +3591,7 @@
                       <wps:spPr>
                         <a:xfrm>
                           <a:off x="0" y="0"/>
-                          <a:ext cx="1485360" cy="488160"/>
+                          <a:ext cx="811440" cy="488160"/>
                         </a:xfrm>
                         <a:prstGeom prst="rect">
                           <a:avLst/>
@@ -3696,10 +3616,8 @@
                               <w:suppressAutoHyphens w:val="true"/>
                               <w:bidi w:val="0"/>
                               <w:spacing w:lineRule="auto" w:line="276" w:before="0" w:after="200"/>
-                              <w:jc w:val="start"/>
-                              <w:rPr>
-                                <w:color w:val="000000"/>
-                              </w:rPr>
+                              <w:jc w:val="center"/>
+                              <w:rPr/>
                             </w:pPr>
                             <w:r>
                               <w:rPr>
@@ -3723,7 +3641,7 @@
           </mc:Choice>
           <mc:Fallback>
             <w:pict>
-              <v:rect id="shape_0" stroked="f" o:allowincell="f" style="position:absolute;margin-left:385.95pt;margin-top:-3.15pt;width:116.9pt;height:38.4pt;mso-wrap-style:square;v-text-anchor:top" wp14:anchorId="5B960A8C">
+              <v:rect id="shape_0" stroked="f" o:allowincell="f" style="position:absolute;margin-left:385.95pt;margin-top:-3.15pt;width:63.85pt;height:38.4pt;mso-wrap-style:square;v-text-anchor:top" wp14:anchorId="5B960A8C">
                 <v:fill o:detectmouseclick="t" on="false"/>
                 <v:stroke color="#3465a4" joinstyle="round" endcap="flat"/>
                 <v:textbox>
@@ -3735,10 +3653,8 @@
                         <w:suppressAutoHyphens w:val="true"/>
                         <w:bidi w:val="0"/>
                         <w:spacing w:lineRule="auto" w:line="276" w:before="0" w:after="200"/>
-                        <w:jc w:val="start"/>
-                        <w:rPr>
-                          <w:color w:val="000000"/>
-                        </w:rPr>
+                        <w:jc w:val="center"/>
+                        <w:rPr/>
                       </w:pPr>
                       <w:r>
                         <w:rPr>
@@ -3776,6 +3692,7 @@
           <w:tab w:val="left" w:pos="4536" w:leader="none"/>
         </w:tabs>
         <w:spacing w:lineRule="atLeast" w:line="198" w:before="0" w:after="198"/>
+        <w:jc w:val="both"/>
         <w:rPr/>
       </w:pPr>
       <w:r>
@@ -3787,15 +3704,15 @@
         <mc:AlternateContent>
           <mc:Choice Requires="wps">
             <w:drawing>
-              <wp:anchor distT="0" distB="0" distL="0" distR="0" simplePos="0" relativeHeight="109" behindDoc="0" locked="0" layoutInCell="1" allowOverlap="1" wp14:anchorId="5B960A8C">
+              <wp:anchor distT="0" distB="0" distL="0" distR="0" simplePos="0" relativeHeight="115" behindDoc="0" locked="0" layoutInCell="1" allowOverlap="1" wp14:anchorId="5B960A8C">
                 <wp:simplePos x="0" y="0"/>
                 <wp:positionH relativeFrom="column">
-                  <wp:posOffset>4994910</wp:posOffset>
+                  <wp:posOffset>5085715</wp:posOffset>
                 </wp:positionH>
                 <wp:positionV relativeFrom="paragraph">
                   <wp:posOffset>-33020</wp:posOffset>
                 </wp:positionV>
-                <wp:extent cx="1134745" cy="488315"/>
+                <wp:extent cx="914400" cy="488315"/>
                 <wp:effectExtent l="0" t="0" r="0" b="0"/>
                 <wp:wrapNone/>
                 <wp:docPr id="28" name="Text Frame 50"/>
@@ -3806,7 +3723,7 @@
                       <wps:spPr>
                         <a:xfrm>
                           <a:off x="0" y="0"/>
-                          <a:ext cx="1134720" cy="488160"/>
+                          <a:ext cx="914400" cy="488160"/>
                         </a:xfrm>
                         <a:prstGeom prst="rect">
                           <a:avLst/>
@@ -3831,10 +3748,8 @@
                               <w:suppressAutoHyphens w:val="true"/>
                               <w:bidi w:val="0"/>
                               <w:spacing w:lineRule="auto" w:line="276" w:before="0" w:after="200"/>
-                              <w:jc w:val="start"/>
-                              <w:rPr>
-                                <w:color w:val="000000"/>
-                              </w:rPr>
+                              <w:jc w:val="center"/>
+                              <w:rPr/>
                             </w:pPr>
                             <w:r>
                               <w:rPr>
@@ -3858,7 +3773,7 @@
           </mc:Choice>
           <mc:Fallback>
             <w:pict>
-              <v:rect id="shape_0" stroked="f" o:allowincell="f" style="position:absolute;margin-left:393.3pt;margin-top:-2.6pt;width:89.3pt;height:38.4pt;mso-wrap-style:square;v-text-anchor:top" wp14:anchorId="5B960A8C">
+              <v:rect id="shape_0" stroked="f" o:allowincell="f" style="position:absolute;margin-left:400.45pt;margin-top:-2.6pt;width:71.95pt;height:38.4pt;mso-wrap-style:square;v-text-anchor:top" wp14:anchorId="5B960A8C">
                 <v:fill o:detectmouseclick="t" on="false"/>
                 <v:stroke color="#3465a4" joinstyle="round" endcap="flat"/>
                 <v:textbox>
@@ -3870,10 +3785,8 @@
                         <w:suppressAutoHyphens w:val="true"/>
                         <w:bidi w:val="0"/>
                         <w:spacing w:lineRule="auto" w:line="276" w:before="0" w:after="200"/>
-                        <w:jc w:val="start"/>
-                        <w:rPr>
-                          <w:color w:val="000000"/>
-                        </w:rPr>
+                        <w:jc w:val="center"/>
+                        <w:rPr/>
                       </w:pPr>
                       <w:r>
                         <w:rPr>
@@ -3945,7 +3858,7 @@
         <mc:AlternateContent>
           <mc:Choice Requires="wps">
             <w:drawing>
-              <wp:anchor distT="0" distB="0" distL="0" distR="0" simplePos="0" relativeHeight="41" behindDoc="0" locked="0" layoutInCell="1" allowOverlap="1" wp14:anchorId="20951D24">
+              <wp:anchor distT="0" distB="0" distL="0" distR="0" simplePos="0" relativeHeight="49" behindDoc="0" locked="0" layoutInCell="1" allowOverlap="1" wp14:anchorId="20951D24">
                 <wp:simplePos x="0" y="0"/>
                 <wp:positionH relativeFrom="column">
                   <wp:posOffset>507365</wp:posOffset>
@@ -3953,7 +3866,7 @@
                 <wp:positionV relativeFrom="paragraph">
                   <wp:posOffset>-45085</wp:posOffset>
                 </wp:positionV>
-                <wp:extent cx="1485265" cy="488315"/>
+                <wp:extent cx="1288415" cy="488315"/>
                 <wp:effectExtent l="0" t="0" r="0" b="0"/>
                 <wp:wrapNone/>
                 <wp:docPr id="29" name="Text Frame 21"/>
@@ -3964,7 +3877,7 @@
                       <wps:spPr>
                         <a:xfrm>
                           <a:off x="0" y="0"/>
-                          <a:ext cx="1485360" cy="488160"/>
+                          <a:ext cx="1288440" cy="488160"/>
                         </a:xfrm>
                         <a:prstGeom prst="rect">
                           <a:avLst/>
@@ -3989,10 +3902,8 @@
                               <w:suppressAutoHyphens w:val="true"/>
                               <w:bidi w:val="0"/>
                               <w:spacing w:lineRule="auto" w:line="276" w:before="0" w:after="200"/>
-                              <w:jc w:val="start"/>
-                              <w:rPr>
-                                <w:color w:val="000000"/>
-                              </w:rPr>
+                              <w:jc w:val="center"/>
+                              <w:rPr/>
                             </w:pPr>
                             <w:r>
                               <w:rPr>
@@ -4016,7 +3927,7 @@
           </mc:Choice>
           <mc:Fallback>
             <w:pict>
-              <v:rect id="shape_0" stroked="f" o:allowincell="f" style="position:absolute;margin-left:39.95pt;margin-top:-3.55pt;width:116.9pt;height:38.4pt;mso-wrap-style:square;v-text-anchor:top" wp14:anchorId="20951D24">
+              <v:rect id="shape_0" stroked="f" o:allowincell="f" style="position:absolute;margin-left:39.95pt;margin-top:-3.55pt;width:101.4pt;height:38.4pt;mso-wrap-style:square;v-text-anchor:top" wp14:anchorId="20951D24">
                 <v:fill o:detectmouseclick="t" on="false"/>
                 <v:stroke color="#3465a4" joinstyle="round" endcap="flat"/>
                 <v:textbox>
@@ -4028,10 +3939,8 @@
                         <w:suppressAutoHyphens w:val="true"/>
                         <w:bidi w:val="0"/>
                         <w:spacing w:lineRule="auto" w:line="276" w:before="0" w:after="200"/>
-                        <w:jc w:val="start"/>
-                        <w:rPr>
-                          <w:color w:val="000000"/>
-                        </w:rPr>
+                        <w:jc w:val="center"/>
+                        <w:rPr/>
                       </w:pPr>
                       <w:r>
                         <w:rPr>
@@ -4052,7 +3961,7 @@
         <mc:AlternateContent>
           <mc:Choice Requires="wps">
             <w:drawing>
-              <wp:anchor distT="0" distB="0" distL="0" distR="0" simplePos="0" relativeHeight="43" behindDoc="0" locked="0" layoutInCell="1" allowOverlap="1" wp14:anchorId="70E0DDD0">
+              <wp:anchor distT="0" distB="0" distL="0" distR="0" simplePos="0" relativeHeight="51" behindDoc="0" locked="0" layoutInCell="1" allowOverlap="1" wp14:anchorId="70E0DDD0">
                 <wp:simplePos x="0" y="0"/>
                 <wp:positionH relativeFrom="column">
                   <wp:posOffset>1992630</wp:posOffset>
@@ -4060,7 +3969,7 @@
                 <wp:positionV relativeFrom="paragraph">
                   <wp:posOffset>-45085</wp:posOffset>
                 </wp:positionV>
-                <wp:extent cx="1485265" cy="488315"/>
+                <wp:extent cx="1169035" cy="488315"/>
                 <wp:effectExtent l="0" t="0" r="0" b="0"/>
                 <wp:wrapNone/>
                 <wp:docPr id="30" name="Text Frame 22"/>
@@ -4071,7 +3980,7 @@
                       <wps:spPr>
                         <a:xfrm>
                           <a:off x="0" y="0"/>
-                          <a:ext cx="1485360" cy="488160"/>
+                          <a:ext cx="1168920" cy="488160"/>
                         </a:xfrm>
                         <a:prstGeom prst="rect">
                           <a:avLst/>
@@ -4096,10 +4005,8 @@
                               <w:suppressAutoHyphens w:val="true"/>
                               <w:bidi w:val="0"/>
                               <w:spacing w:lineRule="auto" w:line="276" w:before="0" w:after="200"/>
-                              <w:jc w:val="start"/>
-                              <w:rPr>
-                                <w:color w:val="000000"/>
-                              </w:rPr>
+                              <w:jc w:val="center"/>
+                              <w:rPr/>
                             </w:pPr>
                             <w:r>
                               <w:rPr>
@@ -4123,7 +4030,7 @@
           </mc:Choice>
           <mc:Fallback>
             <w:pict>
-              <v:rect id="shape_0" stroked="f" o:allowincell="f" style="position:absolute;margin-left:156.9pt;margin-top:-3.55pt;width:116.9pt;height:38.4pt;mso-wrap-style:square;v-text-anchor:top" wp14:anchorId="70E0DDD0">
+              <v:rect id="shape_0" stroked="f" o:allowincell="f" style="position:absolute;margin-left:156.9pt;margin-top:-3.55pt;width:92pt;height:38.4pt;mso-wrap-style:square;v-text-anchor:top" wp14:anchorId="70E0DDD0">
                 <v:fill o:detectmouseclick="t" on="false"/>
                 <v:stroke color="#3465a4" joinstyle="round" endcap="flat"/>
                 <v:textbox>
@@ -4135,10 +4042,8 @@
                         <w:suppressAutoHyphens w:val="true"/>
                         <w:bidi w:val="0"/>
                         <w:spacing w:lineRule="auto" w:line="276" w:before="0" w:after="200"/>
-                        <w:jc w:val="start"/>
-                        <w:rPr>
-                          <w:color w:val="000000"/>
-                        </w:rPr>
+                        <w:jc w:val="center"/>
+                        <w:rPr/>
                       </w:pPr>
                       <w:r>
                         <w:rPr>
@@ -4159,7 +4064,7 @@
         <mc:AlternateContent>
           <mc:Choice Requires="wps">
             <w:drawing>
-              <wp:anchor distT="0" distB="0" distL="0" distR="0" simplePos="0" relativeHeight="91" behindDoc="0" locked="0" layoutInCell="1" allowOverlap="1" wp14:anchorId="0D7F89DA">
+              <wp:anchor distT="0" distB="0" distL="0" distR="0" simplePos="0" relativeHeight="97" behindDoc="0" locked="0" layoutInCell="1" allowOverlap="1" wp14:anchorId="0D7F89DA">
                 <wp:simplePos x="0" y="0"/>
                 <wp:positionH relativeFrom="column">
                   <wp:posOffset>3225165</wp:posOffset>
@@ -4167,7 +4072,7 @@
                 <wp:positionV relativeFrom="paragraph">
                   <wp:posOffset>-45085</wp:posOffset>
                 </wp:positionV>
-                <wp:extent cx="1485265" cy="488315"/>
+                <wp:extent cx="1180465" cy="488315"/>
                 <wp:effectExtent l="0" t="0" r="0" b="0"/>
                 <wp:wrapNone/>
                 <wp:docPr id="31" name="Text Frame 23"/>
@@ -4178,7 +4083,7 @@
                       <wps:spPr>
                         <a:xfrm>
                           <a:off x="0" y="0"/>
-                          <a:ext cx="1485360" cy="488160"/>
+                          <a:ext cx="1180440" cy="488160"/>
                         </a:xfrm>
                         <a:prstGeom prst="rect">
                           <a:avLst/>
@@ -4203,10 +4108,8 @@
                               <w:suppressAutoHyphens w:val="true"/>
                               <w:bidi w:val="0"/>
                               <w:spacing w:lineRule="auto" w:line="276" w:before="0" w:after="200"/>
-                              <w:jc w:val="start"/>
-                              <w:rPr>
-                                <w:color w:val="000000"/>
-                              </w:rPr>
+                              <w:jc w:val="center"/>
+                              <w:rPr/>
                             </w:pPr>
                             <w:r>
                               <w:rPr>
@@ -4230,7 +4133,7 @@
           </mc:Choice>
           <mc:Fallback>
             <w:pict>
-              <v:rect id="shape_0" stroked="f" o:allowincell="f" style="position:absolute;margin-left:253.95pt;margin-top:-3.55pt;width:116.9pt;height:38.4pt;mso-wrap-style:square;v-text-anchor:top" wp14:anchorId="0D7F89DA">
+              <v:rect id="shape_0" stroked="f" o:allowincell="f" style="position:absolute;margin-left:253.95pt;margin-top:-3.55pt;width:92.9pt;height:38.4pt;mso-wrap-style:square;v-text-anchor:top" wp14:anchorId="0D7F89DA">
                 <v:fill o:detectmouseclick="t" on="false"/>
                 <v:stroke color="#3465a4" joinstyle="round" endcap="flat"/>
                 <v:textbox>
@@ -4242,10 +4145,8 @@
                         <w:suppressAutoHyphens w:val="true"/>
                         <w:bidi w:val="0"/>
                         <w:spacing w:lineRule="auto" w:line="276" w:before="0" w:after="200"/>
-                        <w:jc w:val="start"/>
-                        <w:rPr>
-                          <w:color w:val="000000"/>
-                        </w:rPr>
+                        <w:jc w:val="center"/>
+                        <w:rPr/>
                       </w:pPr>
                       <w:r>
                         <w:rPr>
@@ -4283,6 +4184,7 @@
           <w:tab w:val="left" w:pos="4536" w:leader="none"/>
         </w:tabs>
         <w:spacing w:lineRule="atLeast" w:line="198" w:before="0" w:after="198"/>
+        <w:jc w:val="both"/>
         <w:rPr/>
       </w:pPr>
       <w:r>
@@ -4345,15 +4247,15 @@
         <mc:AlternateContent>
           <mc:Choice Requires="wps">
             <w:drawing>
-              <wp:anchor distT="0" distB="0" distL="0" distR="0" simplePos="0" relativeHeight="45" behindDoc="0" locked="0" layoutInCell="1" allowOverlap="1" wp14:anchorId="2CD7E670">
+              <wp:anchor distT="0" distB="0" distL="0" distR="0" simplePos="0" relativeHeight="53" behindDoc="0" locked="0" layoutInCell="1" allowOverlap="1" wp14:anchorId="2CD7E670">
                 <wp:simplePos x="0" y="0"/>
                 <wp:positionH relativeFrom="column">
-                  <wp:posOffset>295910</wp:posOffset>
+                  <wp:posOffset>367665</wp:posOffset>
                 </wp:positionH>
                 <wp:positionV relativeFrom="paragraph">
                   <wp:posOffset>-31750</wp:posOffset>
                 </wp:positionV>
-                <wp:extent cx="1485265" cy="488315"/>
+                <wp:extent cx="617855" cy="488315"/>
                 <wp:effectExtent l="0" t="0" r="0" b="0"/>
                 <wp:wrapNone/>
                 <wp:docPr id="32" name="Text Frame 24"/>
@@ -4364,7 +4266,7 @@
                       <wps:spPr>
                         <a:xfrm>
                           <a:off x="0" y="0"/>
-                          <a:ext cx="1485360" cy="488160"/>
+                          <a:ext cx="617760" cy="488160"/>
                         </a:xfrm>
                         <a:prstGeom prst="rect">
                           <a:avLst/>
@@ -4389,10 +4291,8 @@
                               <w:suppressAutoHyphens w:val="true"/>
                               <w:bidi w:val="0"/>
                               <w:spacing w:lineRule="auto" w:line="276" w:before="0" w:after="200"/>
-                              <w:jc w:val="start"/>
-                              <w:rPr>
-                                <w:color w:val="000000"/>
-                              </w:rPr>
+                              <w:jc w:val="center"/>
+                              <w:rPr/>
                             </w:pPr>
                             <w:r>
                               <w:rPr>
@@ -4416,7 +4316,7 @@
           </mc:Choice>
           <mc:Fallback>
             <w:pict>
-              <v:rect id="shape_0" stroked="f" o:allowincell="f" style="position:absolute;margin-left:23.3pt;margin-top:-2.5pt;width:116.9pt;height:38.4pt;mso-wrap-style:square;v-text-anchor:top" wp14:anchorId="2CD7E670">
+              <v:rect id="shape_0" stroked="f" o:allowincell="f" style="position:absolute;margin-left:28.95pt;margin-top:-2.5pt;width:48.6pt;height:38.4pt;mso-wrap-style:square;v-text-anchor:top" wp14:anchorId="2CD7E670">
                 <v:fill o:detectmouseclick="t" on="false"/>
                 <v:stroke color="#3465a4" joinstyle="round" endcap="flat"/>
                 <v:textbox>
@@ -4428,10 +4328,8 @@
                         <w:suppressAutoHyphens w:val="true"/>
                         <w:bidi w:val="0"/>
                         <w:spacing w:lineRule="auto" w:line="276" w:before="0" w:after="200"/>
-                        <w:jc w:val="start"/>
-                        <w:rPr>
-                          <w:color w:val="000000"/>
-                        </w:rPr>
+                        <w:jc w:val="center"/>
+                        <w:rPr/>
                       </w:pPr>
                       <w:r>
                         <w:rPr>
@@ -4452,7 +4350,7 @@
         <mc:AlternateContent>
           <mc:Choice Requires="wps">
             <w:drawing>
-              <wp:anchor distT="0" distB="0" distL="0" distR="0" simplePos="0" relativeHeight="47" behindDoc="0" locked="0" layoutInCell="1" allowOverlap="1" wp14:anchorId="0B65A935">
+              <wp:anchor distT="0" distB="0" distL="0" distR="0" simplePos="0" relativeHeight="55" behindDoc="0" locked="0" layoutInCell="1" allowOverlap="1" wp14:anchorId="0B65A935">
                 <wp:simplePos x="0" y="0"/>
                 <wp:positionH relativeFrom="column">
                   <wp:posOffset>1091565</wp:posOffset>
@@ -4496,10 +4394,8 @@
                               <w:suppressAutoHyphens w:val="true"/>
                               <w:bidi w:val="0"/>
                               <w:spacing w:lineRule="auto" w:line="276" w:before="0" w:after="200"/>
-                              <w:jc w:val="start"/>
-                              <w:rPr>
-                                <w:color w:val="000000"/>
-                              </w:rPr>
+                              <w:jc w:val="center"/>
+                              <w:rPr/>
                             </w:pPr>
                             <w:r>
                               <w:rPr>
@@ -4535,10 +4431,8 @@
                         <w:suppressAutoHyphens w:val="true"/>
                         <w:bidi w:val="0"/>
                         <w:spacing w:lineRule="auto" w:line="276" w:before="0" w:after="200"/>
-                        <w:jc w:val="start"/>
-                        <w:rPr>
-                          <w:color w:val="000000"/>
-                        </w:rPr>
+                        <w:jc w:val="center"/>
+                        <w:rPr/>
                       </w:pPr>
                       <w:r>
                         <w:rPr>
@@ -4559,15 +4453,15 @@
         <mc:AlternateContent>
           <mc:Choice Requires="wps">
             <w:drawing>
-              <wp:anchor distT="0" distB="0" distL="0" distR="0" simplePos="0" relativeHeight="67" behindDoc="0" locked="0" layoutInCell="1" allowOverlap="1" wp14:anchorId="1946A03B">
+              <wp:anchor distT="0" distB="0" distL="0" distR="0" simplePos="0" relativeHeight="73" behindDoc="0" locked="0" layoutInCell="1" allowOverlap="1" wp14:anchorId="1946A03B">
                 <wp:simplePos x="0" y="0"/>
                 <wp:positionH relativeFrom="column">
-                  <wp:posOffset>3064510</wp:posOffset>
+                  <wp:posOffset>3196590</wp:posOffset>
                 </wp:positionH>
                 <wp:positionV relativeFrom="paragraph">
                   <wp:posOffset>-22860</wp:posOffset>
                 </wp:positionV>
-                <wp:extent cx="1485265" cy="488315"/>
+                <wp:extent cx="2580005" cy="488315"/>
                 <wp:effectExtent l="0" t="0" r="0" b="0"/>
                 <wp:wrapNone/>
                 <wp:docPr id="34" name="Text Frame 26"/>
@@ -4578,7 +4472,7 @@
                       <wps:spPr>
                         <a:xfrm>
                           <a:off x="0" y="0"/>
-                          <a:ext cx="1485360" cy="488160"/>
+                          <a:ext cx="2580120" cy="488160"/>
                         </a:xfrm>
                         <a:prstGeom prst="rect">
                           <a:avLst/>
@@ -4603,10 +4497,8 @@
                               <w:suppressAutoHyphens w:val="true"/>
                               <w:bidi w:val="0"/>
                               <w:spacing w:lineRule="auto" w:line="276" w:before="0" w:after="200"/>
-                              <w:jc w:val="start"/>
-                              <w:rPr>
-                                <w:color w:val="000000"/>
-                              </w:rPr>
+                              <w:jc w:val="center"/>
+                              <w:rPr/>
                             </w:pPr>
                             <w:r>
                               <w:rPr>
@@ -4630,7 +4522,7 @@
           </mc:Choice>
           <mc:Fallback>
             <w:pict>
-              <v:rect id="shape_0" stroked="f" o:allowincell="f" style="position:absolute;margin-left:241.3pt;margin-top:-1.8pt;width:116.9pt;height:38.4pt;mso-wrap-style:square;v-text-anchor:top" wp14:anchorId="1946A03B">
+              <v:rect id="shape_0" stroked="f" o:allowincell="f" style="position:absolute;margin-left:251.7pt;margin-top:-1.8pt;width:203.1pt;height:38.4pt;mso-wrap-style:square;v-text-anchor:top" wp14:anchorId="1946A03B">
                 <v:fill o:detectmouseclick="t" on="false"/>
                 <v:stroke color="#3465a4" joinstyle="round" endcap="flat"/>
                 <v:textbox>
@@ -4642,10 +4534,8 @@
                         <w:suppressAutoHyphens w:val="true"/>
                         <w:bidi w:val="0"/>
                         <w:spacing w:lineRule="auto" w:line="276" w:before="0" w:after="200"/>
-                        <w:jc w:val="start"/>
-                        <w:rPr>
-                          <w:color w:val="000000"/>
-                        </w:rPr>
+                        <w:jc w:val="center"/>
+                        <w:rPr/>
                       </w:pPr>
                       <w:r>
                         <w:rPr>
@@ -4683,6 +4573,7 @@
           <w:tab w:val="left" w:pos="4536" w:leader="none"/>
         </w:tabs>
         <w:spacing w:lineRule="atLeast" w:line="198" w:before="0" w:after="198"/>
+        <w:jc w:val="both"/>
         <w:rPr/>
       </w:pPr>
       <w:r>
@@ -4761,10 +4652,10 @@
         <mc:AlternateContent>
           <mc:Choice Requires="wps">
             <w:drawing>
-              <wp:anchor distT="0" distB="0" distL="0" distR="0" simplePos="0" relativeHeight="21" behindDoc="0" locked="0" layoutInCell="1" allowOverlap="1" wp14:anchorId="010CBE94">
+              <wp:anchor distT="0" distB="0" distL="0" distR="0" simplePos="0" relativeHeight="29" behindDoc="0" locked="0" layoutInCell="1" allowOverlap="1" wp14:anchorId="010CBE94">
                 <wp:simplePos x="0" y="0"/>
                 <wp:positionH relativeFrom="column">
-                  <wp:posOffset>4300855</wp:posOffset>
+                  <wp:posOffset>4385310</wp:posOffset>
                 </wp:positionH>
                 <wp:positionV relativeFrom="paragraph">
                   <wp:posOffset>-40005</wp:posOffset>
@@ -4805,10 +4696,8 @@
                               <w:suppressAutoHyphens w:val="true"/>
                               <w:bidi w:val="0"/>
                               <w:spacing w:lineRule="auto" w:line="276" w:before="0" w:after="200"/>
-                              <w:jc w:val="start"/>
-                              <w:rPr>
-                                <w:color w:val="000000"/>
-                              </w:rPr>
+                              <w:jc w:val="center"/>
+                              <w:rPr/>
                             </w:pPr>
                             <w:r>
                               <w:rPr>
@@ -4832,7 +4721,7 @@
           </mc:Choice>
           <mc:Fallback>
             <w:pict>
-              <v:rect id="shape_0" stroked="f" o:allowincell="f" style="position:absolute;margin-left:338.65pt;margin-top:-3.15pt;width:116.9pt;height:38.4pt;mso-wrap-style:square;v-text-anchor:top" wp14:anchorId="010CBE94">
+              <v:rect id="shape_0" stroked="f" o:allowincell="f" style="position:absolute;margin-left:345.3pt;margin-top:-3.15pt;width:116.9pt;height:38.4pt;mso-wrap-style:square;v-text-anchor:top" wp14:anchorId="010CBE94">
                 <v:fill o:detectmouseclick="t" on="false"/>
                 <v:stroke color="#3465a4" joinstyle="round" endcap="flat"/>
                 <v:textbox>
@@ -4844,10 +4733,8 @@
                         <w:suppressAutoHyphens w:val="true"/>
                         <w:bidi w:val="0"/>
                         <w:spacing w:lineRule="auto" w:line="276" w:before="0" w:after="200"/>
-                        <w:jc w:val="start"/>
-                        <w:rPr>
-                          <w:color w:val="000000"/>
-                        </w:rPr>
+                        <w:jc w:val="center"/>
+                        <w:rPr/>
                       </w:pPr>
                       <w:r>
                         <w:rPr>
@@ -4868,15 +4755,15 @@
         <mc:AlternateContent>
           <mc:Choice Requires="wps">
             <w:drawing>
-              <wp:anchor distT="0" distB="0" distL="0" distR="0" simplePos="0" relativeHeight="49" behindDoc="0" locked="0" layoutInCell="1" allowOverlap="1" wp14:anchorId="2299F9C0">
+              <wp:anchor distT="0" distB="0" distL="0" distR="0" simplePos="0" relativeHeight="57" behindDoc="0" locked="0" layoutInCell="1" allowOverlap="1" wp14:anchorId="2299F9C0">
                 <wp:simplePos x="0" y="0"/>
                 <wp:positionH relativeFrom="column">
-                  <wp:posOffset>499110</wp:posOffset>
+                  <wp:posOffset>615315</wp:posOffset>
                 </wp:positionH>
                 <wp:positionV relativeFrom="paragraph">
                   <wp:posOffset>-27940</wp:posOffset>
                 </wp:positionV>
-                <wp:extent cx="1485265" cy="488315"/>
+                <wp:extent cx="1090930" cy="488315"/>
                 <wp:effectExtent l="0" t="0" r="0" b="0"/>
                 <wp:wrapNone/>
                 <wp:docPr id="36" name="Text Frame 27"/>
@@ -4887,7 +4774,7 @@
                       <wps:spPr>
                         <a:xfrm>
                           <a:off x="0" y="0"/>
-                          <a:ext cx="1485360" cy="488160"/>
+                          <a:ext cx="1090800" cy="488160"/>
                         </a:xfrm>
                         <a:prstGeom prst="rect">
                           <a:avLst/>
@@ -4912,10 +4799,8 @@
                               <w:suppressAutoHyphens w:val="true"/>
                               <w:bidi w:val="0"/>
                               <w:spacing w:lineRule="auto" w:line="276" w:before="0" w:after="200"/>
-                              <w:jc w:val="start"/>
-                              <w:rPr>
-                                <w:color w:val="000000"/>
-                              </w:rPr>
+                              <w:jc w:val="center"/>
+                              <w:rPr/>
                             </w:pPr>
                             <w:r>
                               <w:rPr>
@@ -4939,7 +4824,7 @@
           </mc:Choice>
           <mc:Fallback>
             <w:pict>
-              <v:rect id="shape_0" stroked="f" o:allowincell="f" style="position:absolute;margin-left:39.3pt;margin-top:-2.2pt;width:116.9pt;height:38.4pt;mso-wrap-style:square;v-text-anchor:top" wp14:anchorId="2299F9C0">
+              <v:rect id="shape_0" stroked="f" o:allowincell="f" style="position:absolute;margin-left:48.45pt;margin-top:-2.2pt;width:85.85pt;height:38.4pt;mso-wrap-style:square;v-text-anchor:top" wp14:anchorId="2299F9C0">
                 <v:fill o:detectmouseclick="t" on="false"/>
                 <v:stroke color="#3465a4" joinstyle="round" endcap="flat"/>
                 <v:textbox>
@@ -4951,10 +4836,8 @@
                         <w:suppressAutoHyphens w:val="true"/>
                         <w:bidi w:val="0"/>
                         <w:spacing w:lineRule="auto" w:line="276" w:before="0" w:after="200"/>
-                        <w:jc w:val="start"/>
-                        <w:rPr>
-                          <w:color w:val="000000"/>
-                        </w:rPr>
+                        <w:jc w:val="center"/>
+                        <w:rPr/>
                       </w:pPr>
                       <w:r>
                         <w:rPr>
@@ -4975,7 +4858,7 @@
         <mc:AlternateContent>
           <mc:Choice Requires="wps">
             <w:drawing>
-              <wp:anchor distT="0" distB="0" distL="0" distR="0" simplePos="0" relativeHeight="51" behindDoc="0" locked="0" layoutInCell="1" allowOverlap="1" wp14:anchorId="407F911D">
+              <wp:anchor distT="0" distB="0" distL="0" distR="0" simplePos="0" relativeHeight="59" behindDoc="0" locked="0" layoutInCell="1" allowOverlap="1" wp14:anchorId="407F911D">
                 <wp:simplePos x="0" y="0"/>
                 <wp:positionH relativeFrom="column">
                   <wp:posOffset>2312035</wp:posOffset>
@@ -5019,10 +4902,8 @@
                               <w:suppressAutoHyphens w:val="true"/>
                               <w:bidi w:val="0"/>
                               <w:spacing w:lineRule="auto" w:line="276" w:before="0" w:after="200"/>
-                              <w:jc w:val="start"/>
-                              <w:rPr>
-                                <w:color w:val="000000"/>
-                              </w:rPr>
+                              <w:jc w:val="center"/>
+                              <w:rPr/>
                             </w:pPr>
                             <w:r>
                               <w:rPr>
@@ -5058,10 +4939,8 @@
                         <w:suppressAutoHyphens w:val="true"/>
                         <w:bidi w:val="0"/>
                         <w:spacing w:lineRule="auto" w:line="276" w:before="0" w:after="200"/>
-                        <w:jc w:val="start"/>
-                        <w:rPr>
-                          <w:color w:val="000000"/>
-                        </w:rPr>
+                        <w:jc w:val="center"/>
+                        <w:rPr/>
                       </w:pPr>
                       <w:r>
                         <w:rPr>
@@ -5099,6 +4978,7 @@
           <w:tab w:val="left" w:pos="4536" w:leader="none"/>
         </w:tabs>
         <w:spacing w:lineRule="atLeast" w:line="198" w:before="0" w:after="198"/>
+        <w:jc w:val="both"/>
         <w:rPr/>
       </w:pPr>
       <w:r>
@@ -5129,7 +5009,7 @@
         <mc:AlternateContent>
           <mc:Choice Requires="wps">
             <w:drawing>
-              <wp:anchor distT="0" distB="0" distL="0" distR="0" simplePos="0" relativeHeight="23" behindDoc="0" locked="0" layoutInCell="1" allowOverlap="1" wp14:anchorId="7CF9AEB1">
+              <wp:anchor distT="0" distB="0" distL="0" distR="0" simplePos="0" relativeHeight="31" behindDoc="0" locked="0" layoutInCell="1" allowOverlap="1" wp14:anchorId="7CF9AEB1">
                 <wp:simplePos x="0" y="0"/>
                 <wp:positionH relativeFrom="column">
                   <wp:posOffset>499110</wp:posOffset>
@@ -5173,10 +5053,8 @@
                               <w:suppressAutoHyphens w:val="true"/>
                               <w:bidi w:val="0"/>
                               <w:spacing w:lineRule="auto" w:line="276" w:before="0" w:after="200"/>
-                              <w:jc w:val="start"/>
-                              <w:rPr>
-                                <w:color w:val="000000"/>
-                              </w:rPr>
+                              <w:jc w:val="center"/>
+                              <w:rPr/>
                             </w:pPr>
                             <w:r>
                               <w:rPr>
@@ -5212,10 +5090,8 @@
                         <w:suppressAutoHyphens w:val="true"/>
                         <w:bidi w:val="0"/>
                         <w:spacing w:lineRule="auto" w:line="276" w:before="0" w:after="200"/>
-                        <w:jc w:val="start"/>
-                        <w:rPr>
-                          <w:color w:val="000000"/>
-                        </w:rPr>
+                        <w:jc w:val="center"/>
+                        <w:rPr/>
                       </w:pPr>
                       <w:r>
                         <w:rPr>
@@ -5236,10 +5112,10 @@
         <mc:AlternateContent>
           <mc:Choice Requires="wps">
             <w:drawing>
-              <wp:anchor distT="0" distB="0" distL="0" distR="0" simplePos="0" relativeHeight="53" behindDoc="0" locked="0" layoutInCell="1" allowOverlap="1" wp14:anchorId="1F216421">
+              <wp:anchor distT="0" distB="0" distL="0" distR="0" simplePos="0" relativeHeight="61" behindDoc="0" locked="0" layoutInCell="1" allowOverlap="1" wp14:anchorId="1F216421">
                 <wp:simplePos x="0" y="0"/>
                 <wp:positionH relativeFrom="column">
-                  <wp:posOffset>3471545</wp:posOffset>
+                  <wp:posOffset>3571875</wp:posOffset>
                 </wp:positionH>
                 <wp:positionV relativeFrom="paragraph">
                   <wp:posOffset>-37465</wp:posOffset>
@@ -5280,10 +5156,8 @@
                               <w:suppressAutoHyphens w:val="true"/>
                               <w:bidi w:val="0"/>
                               <w:spacing w:lineRule="auto" w:line="276" w:before="0" w:after="200"/>
-                              <w:jc w:val="start"/>
-                              <w:rPr>
-                                <w:color w:val="000000"/>
-                              </w:rPr>
+                              <w:jc w:val="center"/>
+                              <w:rPr/>
                             </w:pPr>
                             <w:r>
                               <w:rPr>
@@ -5307,7 +5181,7 @@
           </mc:Choice>
           <mc:Fallback>
             <w:pict>
-              <v:rect id="shape_0" stroked="f" o:allowincell="f" style="position:absolute;margin-left:273.35pt;margin-top:-2.95pt;width:184pt;height:38.4pt;mso-wrap-style:square;v-text-anchor:top" wp14:anchorId="1F216421">
+              <v:rect id="shape_0" stroked="f" o:allowincell="f" style="position:absolute;margin-left:281.25pt;margin-top:-2.95pt;width:184pt;height:38.4pt;mso-wrap-style:square;v-text-anchor:top" wp14:anchorId="1F216421">
                 <v:fill o:detectmouseclick="t" on="false"/>
                 <v:stroke color="#3465a4" joinstyle="round" endcap="flat"/>
                 <v:textbox>
@@ -5319,10 +5193,8 @@
                         <w:suppressAutoHyphens w:val="true"/>
                         <w:bidi w:val="0"/>
                         <w:spacing w:lineRule="auto" w:line="276" w:before="0" w:after="200"/>
-                        <w:jc w:val="start"/>
-                        <w:rPr>
-                          <w:color w:val="000000"/>
-                        </w:rPr>
+                        <w:jc w:val="center"/>
+                        <w:rPr/>
                       </w:pPr>
                       <w:r>
                         <w:rPr>
@@ -5360,6 +5232,7 @@
           <w:tab w:val="left" w:pos="4536" w:leader="none"/>
         </w:tabs>
         <w:spacing w:lineRule="atLeast" w:line="198" w:before="0" w:after="198"/>
+        <w:jc w:val="both"/>
         <w:rPr/>
       </w:pPr>
       <w:r>
@@ -5381,6 +5254,7 @@
           <w:tab w:val="left" w:pos="4536" w:leader="none"/>
         </w:tabs>
         <w:spacing w:lineRule="atLeast" w:line="198" w:before="0" w:after="198"/>
+        <w:jc w:val="both"/>
         <w:rPr/>
       </w:pPr>
       <w:r>
@@ -5392,7 +5266,7 @@
         <mc:AlternateContent>
           <mc:Choice Requires="wps">
             <w:drawing>
-              <wp:anchor distT="5715" distB="4445" distL="5715" distR="4445" simplePos="0" relativeHeight="111" behindDoc="1" locked="0" layoutInCell="1" allowOverlap="1">
+              <wp:anchor distT="5715" distB="4445" distL="5715" distR="4445" simplePos="0" relativeHeight="7" behindDoc="1" locked="0" layoutInCell="1" allowOverlap="1">
                 <wp:simplePos x="0" y="0"/>
                 <wp:positionH relativeFrom="column">
                   <wp:posOffset>332740</wp:posOffset>
@@ -5521,7 +5395,7 @@
         <mc:AlternateContent>
           <mc:Choice Requires="wps">
             <w:drawing>
-              <wp:anchor distT="0" distB="0" distL="0" distR="0" simplePos="0" relativeHeight="55" behindDoc="0" locked="0" layoutInCell="1" allowOverlap="1" wp14:anchorId="43DD32B8">
+              <wp:anchor distT="0" distB="0" distL="0" distR="0" simplePos="0" relativeHeight="63" behindDoc="0" locked="0" layoutInCell="1" allowOverlap="1" wp14:anchorId="43DD32B8">
                 <wp:simplePos x="0" y="0"/>
                 <wp:positionH relativeFrom="column">
                   <wp:posOffset>386080</wp:posOffset>
@@ -5643,6 +5517,7 @@
           <w:tab w:val="left" w:pos="1134" w:leader="none"/>
         </w:tabs>
         <w:spacing w:lineRule="atLeast" w:line="198" w:before="0" w:after="198"/>
+        <w:jc w:val="both"/>
         <w:rPr/>
       </w:pPr>
       <w:r>
@@ -5654,7 +5529,7 @@
         <mc:AlternateContent>
           <mc:Choice Requires="wps">
             <w:drawing>
-              <wp:anchor distT="5715" distB="4445" distL="5715" distR="4445" simplePos="0" relativeHeight="113" behindDoc="1" locked="0" layoutInCell="1" allowOverlap="1">
+              <wp:anchor distT="5715" distB="4445" distL="5715" distR="4445" simplePos="0" relativeHeight="9" behindDoc="1" locked="0" layoutInCell="1" allowOverlap="1">
                 <wp:simplePos x="0" y="0"/>
                 <wp:positionH relativeFrom="column">
                   <wp:posOffset>332740</wp:posOffset>
@@ -5759,7 +5634,7 @@
         <mc:AlternateContent>
           <mc:Choice Requires="wps">
             <w:drawing>
-              <wp:anchor distT="0" distB="0" distL="0" distR="0" simplePos="0" relativeHeight="57" behindDoc="0" locked="0" layoutInCell="1" allowOverlap="1" wp14:anchorId="5F885152">
+              <wp:anchor distT="0" distB="0" distL="0" distR="0" simplePos="0" relativeHeight="65" behindDoc="0" locked="0" layoutInCell="1" allowOverlap="1" wp14:anchorId="5F885152">
                 <wp:simplePos x="0" y="0"/>
                 <wp:positionH relativeFrom="column">
                   <wp:posOffset>386080</wp:posOffset>
@@ -5881,7 +5756,7 @@
           <w:tab w:val="left" w:pos="1134" w:leader="none"/>
         </w:tabs>
         <w:spacing w:lineRule="atLeast" w:line="198" w:before="0" w:after="198"/>
-        <w:jc w:val="center"/>
+        <w:jc w:val="both"/>
         <w:rPr>
           <w:rFonts w:ascii="TH SarabunIT๙" w:hAnsi="TH SarabunIT๙" w:eastAsia="Sarabun" w:cs="TH SarabunIT๙"/>
           <w:sz w:val="34"/>
@@ -5965,6 +5840,7 @@
           <w:tab w:val="left" w:pos="1134" w:leader="none"/>
         </w:tabs>
         <w:spacing w:lineRule="atLeast" w:line="198" w:before="0" w:after="198"/>
+        <w:jc w:val="both"/>
         <w:rPr/>
       </w:pPr>
       <w:r>
@@ -5979,15 +5855,15 @@
         <mc:AlternateContent>
           <mc:Choice Requires="wps">
             <w:drawing>
-              <wp:anchor distT="0" distB="0" distL="0" distR="0" simplePos="0" relativeHeight="59" behindDoc="0" locked="0" layoutInCell="1" allowOverlap="1" wp14:anchorId="43F6DA88">
+              <wp:anchor distT="0" distB="0" distL="0" distR="0" simplePos="0" relativeHeight="67" behindDoc="0" locked="0" layoutInCell="1" allowOverlap="1" wp14:anchorId="43F6DA88">
                 <wp:simplePos x="0" y="0"/>
                 <wp:positionH relativeFrom="column">
-                  <wp:posOffset>609600</wp:posOffset>
+                  <wp:posOffset>755015</wp:posOffset>
                 </wp:positionH>
                 <wp:positionV relativeFrom="paragraph">
                   <wp:posOffset>-31115</wp:posOffset>
                 </wp:positionV>
-                <wp:extent cx="5199380" cy="488315"/>
+                <wp:extent cx="5053965" cy="488315"/>
                 <wp:effectExtent l="0" t="0" r="0" b="0"/>
                 <wp:wrapNone/>
                 <wp:docPr id="44" name="Text Frame 32"/>
@@ -5998,7 +5874,7 @@
                       <wps:spPr>
                         <a:xfrm>
                           <a:off x="0" y="0"/>
-                          <a:ext cx="5199480" cy="488160"/>
+                          <a:ext cx="5054040" cy="488160"/>
                         </a:xfrm>
                         <a:prstGeom prst="rect">
                           <a:avLst/>
@@ -6025,14 +5901,15 @@
                               <w:spacing w:lineRule="auto" w:line="276" w:before="0" w:after="200"/>
                               <w:jc w:val="start"/>
                               <w:rPr>
-                                <w:color w:val="000000"/>
+                                <w:sz w:val="30"/>
+                                <w:szCs w:val="30"/>
                               </w:rPr>
                             </w:pPr>
                             <w:r>
                               <w:rPr>
                                 <w:color w:val="000000"/>
-                                <w:sz w:val="34"/>
-                                <w:szCs w:val="34"/>
+                                <w:sz w:val="30"/>
+                                <w:szCs w:val="30"/>
                               </w:rPr>
                               <w:t>{{ scene }}</w:t>
                             </w:r>
@@ -6050,7 +5927,7 @@
           </mc:Choice>
           <mc:Fallback>
             <w:pict>
-              <v:rect id="shape_0" stroked="f" o:allowincell="f" style="position:absolute;margin-left:48pt;margin-top:-2.45pt;width:409.35pt;height:38.4pt;mso-wrap-style:square;v-text-anchor:top" wp14:anchorId="43F6DA88">
+              <v:rect id="shape_0" stroked="f" o:allowincell="f" style="position:absolute;margin-left:59.45pt;margin-top:-2.45pt;width:397.9pt;height:38.4pt;mso-wrap-style:square;v-text-anchor:top" wp14:anchorId="43F6DA88">
                 <v:fill o:detectmouseclick="t" on="false"/>
                 <v:stroke color="#3465a4" joinstyle="round" endcap="flat"/>
                 <v:textbox>
@@ -6064,14 +5941,15 @@
                         <w:spacing w:lineRule="auto" w:line="276" w:before="0" w:after="200"/>
                         <w:jc w:val="start"/>
                         <w:rPr>
-                          <w:color w:val="000000"/>
+                          <w:sz w:val="30"/>
+                          <w:szCs w:val="30"/>
                         </w:rPr>
                       </w:pPr>
                       <w:r>
                         <w:rPr>
                           <w:color w:val="000000"/>
-                          <w:sz w:val="34"/>
-                          <w:szCs w:val="34"/>
+                          <w:sz w:val="30"/>
+                          <w:szCs w:val="30"/>
                         </w:rPr>
                         <w:t>{{ scene }}</w:t>
                       </w:r>
@@ -6101,6 +5979,7 @@
           <w:tab w:val="left" w:pos="1134" w:leader="none"/>
         </w:tabs>
         <w:spacing w:lineRule="atLeast" w:line="198" w:before="0" w:after="198"/>
+        <w:jc w:val="both"/>
         <w:rPr/>
       </w:pPr>
       <w:r>
@@ -6109,72 +5988,175 @@
           <w:sz w:val="34"/>
           <w:szCs w:val="34"/>
         </w:rPr>
-        <w:t>เมื่อวันที่</w:t>
-      </w:r>
-      <w:r>
-        <w:rPr>
-          <w:rFonts w:eastAsia="Sarabun" w:cs="TH SarabunIT๙" w:hint="cs"/>
-          <w:sz w:val="34"/>
-          <w:szCs w:val="34"/>
-        </w:rPr>
-        <w:t>..............</w:t>
-      </w:r>
-      <w:r>
-        <w:rPr>
-          <w:rFonts w:ascii="TH SarabunIT๙" w:hAnsi="TH SarabunIT๙" w:eastAsia="Sarabun" w:hint="cs"/>
-          <w:sz w:val="34"/>
-          <w:szCs w:val="34"/>
-        </w:rPr>
-        <w:t>เดือน</w:t>
-      </w:r>
-      <w:r>
-        <w:rPr>
-          <w:rFonts w:eastAsia="Sarabun" w:cs="TH SarabunIT๙" w:hint="cs"/>
-          <w:sz w:val="34"/>
-          <w:szCs w:val="34"/>
-        </w:rPr>
-        <w:t>........................................</w:t>
-      </w:r>
-      <w:r>
-        <w:rPr>
-          <w:rFonts w:ascii="TH SarabunIT๙" w:hAnsi="TH SarabunIT๙" w:eastAsia="Sarabun" w:hint="cs"/>
-          <w:sz w:val="34"/>
-          <w:szCs w:val="34"/>
-        </w:rPr>
-        <w:t>พุทธศักราช</w:t>
-      </w:r>
-      <w:r>
-        <w:rPr>
-          <w:rFonts w:eastAsia="Sarabun" w:cs="TH SarabunIT๙" w:hint="cs"/>
-          <w:sz w:val="34"/>
-          <w:szCs w:val="34"/>
-        </w:rPr>
-        <w:t>........................</w:t>
-      </w:r>
-      <w:r>
-        <w:rPr>
-          <w:rFonts w:ascii="TH SarabunIT๙" w:hAnsi="TH SarabunIT๙" w:eastAsia="Sarabun" w:hint="cs"/>
-          <w:sz w:val="34"/>
-          <w:szCs w:val="34"/>
-        </w:rPr>
-        <w:t>เวลา</w:t>
-      </w:r>
-      <w:r>
-        <w:rPr>
-          <w:rFonts w:eastAsia="Sarabun" w:cs="TH SarabunIT๙" w:hint="cs"/>
-          <w:sz w:val="34"/>
-          <w:szCs w:val="34"/>
-        </w:rPr>
-        <w:t>..........................</w:t>
-      </w:r>
-      <w:r>
         <mc:AlternateContent>
           <mc:Choice Requires="wps">
             <w:drawing>
-              <wp:anchor distT="0" distB="0" distL="0" distR="0" simplePos="0" relativeHeight="25" behindDoc="0" locked="0" layoutInCell="1" allowOverlap="1" wp14:anchorId="24AB52B6">
+              <wp:anchor distT="0" distB="0" distL="0" distR="0" simplePos="0" relativeHeight="117" behindDoc="0" locked="0" layoutInCell="1" allowOverlap="1" wp14:anchorId="5CEE6168">
                 <wp:simplePos x="0" y="0"/>
                 <wp:positionH relativeFrom="column">
-                  <wp:posOffset>4427220</wp:posOffset>
+                  <wp:posOffset>424180</wp:posOffset>
+                </wp:positionH>
+                <wp:positionV relativeFrom="paragraph">
+                  <wp:posOffset>-43815</wp:posOffset>
+                </wp:positionV>
+                <wp:extent cx="617220" cy="732155"/>
+                <wp:effectExtent l="0" t="0" r="0" b="0"/>
+                <wp:wrapNone/>
+                <wp:docPr id="45" name="Text Frame 51"/>
+                <a:graphic xmlns:a="http://schemas.openxmlformats.org/drawingml/2006/main">
+                  <a:graphicData uri="http://schemas.microsoft.com/office/word/2010/wordprocessingShape">
+                    <wps:wsp>
+                      <wps:cNvSpPr/>
+                      <wps:spPr>
+                        <a:xfrm>
+                          <a:off x="0" y="0"/>
+                          <a:ext cx="617400" cy="732240"/>
+                        </a:xfrm>
+                        <a:prstGeom prst="rect">
+                          <a:avLst/>
+                        </a:prstGeom>
+                        <a:noFill/>
+                        <a:ln w="0">
+                          <a:noFill/>
+                        </a:ln>
+                      </wps:spPr>
+                      <wps:style>
+                        <a:lnRef idx="0"/>
+                        <a:fillRef idx="0"/>
+                        <a:effectRef idx="0"/>
+                        <a:fontRef idx="minor"/>
+                      </wps:style>
+                      <wps:txbx>
+                        <w:txbxContent>
+                          <w:p>
+                            <w:pPr>
+                              <w:pStyle w:val="Normal1"/>
+                              <w:widowControl/>
+                              <w:suppressAutoHyphens w:val="true"/>
+                              <w:bidi w:val="0"/>
+                              <w:spacing w:lineRule="auto" w:line="276" w:before="0" w:after="200"/>
+                              <w:jc w:val="center"/>
+                              <w:rPr/>
+                            </w:pPr>
+                            <w:r>
+                              <w:rPr>
+                                <w:color w:val="000000"/>
+                                <w:sz w:val="34"/>
+                                <w:szCs w:val="34"/>
+                              </w:rPr>
+                              <w:t>{{ scene_date_day }}</w:t>
+                            </w:r>
+                          </w:p>
+                        </w:txbxContent>
+                      </wps:txbx>
+                      <wps:bodyPr lIns="0" rIns="0" tIns="0" bIns="0" anchor="t">
+                        <a:noAutofit/>
+                      </wps:bodyPr>
+                    </wps:wsp>
+                  </a:graphicData>
+                </a:graphic>
+              </wp:anchor>
+            </w:drawing>
+          </mc:Choice>
+          <mc:Fallback>
+            <w:pict>
+              <v:rect id="shape_0" stroked="f" o:allowincell="f" style="position:absolute;margin-left:33.4pt;margin-top:-3.45pt;width:48.55pt;height:57.6pt;mso-wrap-style:square;v-text-anchor:top" wp14:anchorId="5CEE6168">
+                <v:fill o:detectmouseclick="t" on="false"/>
+                <v:stroke color="#3465a4" joinstyle="round" endcap="flat"/>
+                <v:textbox>
+                  <w:txbxContent>
+                    <w:p>
+                      <w:pPr>
+                        <w:pStyle w:val="Normal1"/>
+                        <w:widowControl/>
+                        <w:suppressAutoHyphens w:val="true"/>
+                        <w:bidi w:val="0"/>
+                        <w:spacing w:lineRule="auto" w:line="276" w:before="0" w:after="200"/>
+                        <w:jc w:val="center"/>
+                        <w:rPr/>
+                      </w:pPr>
+                      <w:r>
+                        <w:rPr>
+                          <w:color w:val="000000"/>
+                          <w:sz w:val="34"/>
+                          <w:szCs w:val="34"/>
+                        </w:rPr>
+                        <w:t>{{ scene_date_day }}</w:t>
+                      </w:r>
+                    </w:p>
+                  </w:txbxContent>
+                </v:textbox>
+                <w10:wrap type="none"/>
+              </v:rect>
+            </w:pict>
+          </mc:Fallback>
+        </mc:AlternateContent>
+        <w:t>เมื่อวันที่</w:t>
+      </w:r>
+      <w:r>
+        <w:rPr>
+          <w:rFonts w:eastAsia="Sarabun" w:cs="TH SarabunIT๙" w:hint="cs"/>
+          <w:sz w:val="34"/>
+          <w:szCs w:val="34"/>
+        </w:rPr>
+        <w:t>..............</w:t>
+      </w:r>
+      <w:r>
+        <w:rPr>
+          <w:rFonts w:ascii="TH SarabunIT๙" w:hAnsi="TH SarabunIT๙" w:eastAsia="Sarabun" w:hint="cs"/>
+          <w:sz w:val="34"/>
+          <w:szCs w:val="34"/>
+        </w:rPr>
+        <w:t>เดือน</w:t>
+      </w:r>
+      <w:r>
+        <w:rPr>
+          <w:rFonts w:eastAsia="Sarabun" w:cs="TH SarabunIT๙" w:hint="cs"/>
+          <w:sz w:val="34"/>
+          <w:szCs w:val="34"/>
+        </w:rPr>
+        <w:t>........................................</w:t>
+      </w:r>
+      <w:r>
+        <w:rPr>
+          <w:rFonts w:ascii="TH SarabunIT๙" w:hAnsi="TH SarabunIT๙" w:eastAsia="Sarabun" w:hint="cs"/>
+          <w:sz w:val="34"/>
+          <w:szCs w:val="34"/>
+        </w:rPr>
+        <w:t>พุทธศักราช</w:t>
+      </w:r>
+      <w:r>
+        <w:rPr>
+          <w:rFonts w:eastAsia="Sarabun" w:cs="TH SarabunIT๙" w:hint="cs"/>
+          <w:sz w:val="34"/>
+          <w:szCs w:val="34"/>
+        </w:rPr>
+        <w:t>........................</w:t>
+      </w:r>
+      <w:r>
+        <w:rPr>
+          <w:rFonts w:ascii="TH SarabunIT๙" w:hAnsi="TH SarabunIT๙" w:eastAsia="Sarabun" w:hint="cs"/>
+          <w:sz w:val="34"/>
+          <w:szCs w:val="34"/>
+        </w:rPr>
+        <w:t>เวลา</w:t>
+      </w:r>
+      <w:r>
+        <w:rPr>
+          <w:rFonts w:eastAsia="Sarabun" w:cs="TH SarabunIT๙" w:hint="cs"/>
+          <w:sz w:val="34"/>
+          <w:szCs w:val="34"/>
+        </w:rPr>
+        <w:t>..........................</w:t>
+      </w:r>
+      <w:r>
+        <mc:AlternateContent>
+          <mc:Choice Requires="wps">
+            <w:drawing>
+              <wp:anchor distT="0" distB="0" distL="0" distR="0" simplePos="0" relativeHeight="33" behindDoc="0" locked="0" layoutInCell="1" allowOverlap="1" wp14:anchorId="24AB52B6">
+                <wp:simplePos x="0" y="0"/>
+                <wp:positionH relativeFrom="column">
+                  <wp:posOffset>4412615</wp:posOffset>
                 </wp:positionH>
                 <wp:positionV relativeFrom="paragraph">
                   <wp:posOffset>-28575</wp:posOffset>
@@ -6182,7 +6164,7 @@
                 <wp:extent cx="939165" cy="732155"/>
                 <wp:effectExtent l="0" t="0" r="0" b="0"/>
                 <wp:wrapNone/>
-                <wp:docPr id="45" name="Text Frame 36"/>
+                <wp:docPr id="46" name="Text Frame 36"/>
                 <a:graphic xmlns:a="http://schemas.openxmlformats.org/drawingml/2006/main">
                   <a:graphicData uri="http://schemas.microsoft.com/office/word/2010/wordprocessingShape">
                     <wps:wsp>
@@ -6215,10 +6197,8 @@
                               <w:suppressAutoHyphens w:val="true"/>
                               <w:bidi w:val="0"/>
                               <w:spacing w:lineRule="auto" w:line="276" w:before="0" w:after="200"/>
-                              <w:jc w:val="start"/>
-                              <w:rPr>
-                                <w:color w:val="000000"/>
-                              </w:rPr>
+                              <w:jc w:val="center"/>
+                              <w:rPr/>
                             </w:pPr>
                             <w:r>
                               <w:rPr>
@@ -6242,7 +6222,7 @@
           </mc:Choice>
           <mc:Fallback>
             <w:pict>
-              <v:rect id="shape_0" stroked="f" o:allowincell="f" style="position:absolute;margin-left:348.6pt;margin-top:-2.25pt;width:73.9pt;height:57.6pt;mso-wrap-style:square;v-text-anchor:top" wp14:anchorId="24AB52B6">
+              <v:rect id="shape_0" stroked="f" o:allowincell="f" style="position:absolute;margin-left:347.45pt;margin-top:-2.25pt;width:73.9pt;height:57.6pt;mso-wrap-style:square;v-text-anchor:top" wp14:anchorId="24AB52B6">
                 <v:fill o:detectmouseclick="t" on="false"/>
                 <v:stroke color="#3465a4" joinstyle="round" endcap="flat"/>
                 <v:textbox>
@@ -6254,10 +6234,8 @@
                         <w:suppressAutoHyphens w:val="true"/>
                         <w:bidi w:val="0"/>
                         <w:spacing w:lineRule="auto" w:line="276" w:before="0" w:after="200"/>
-                        <w:jc w:val="start"/>
-                        <w:rPr>
-                          <w:color w:val="000000"/>
-                        </w:rPr>
+                        <w:jc w:val="center"/>
+                        <w:rPr/>
                       </w:pPr>
                       <w:r>
                         <w:rPr>
@@ -6278,117 +6256,10 @@
         <mc:AlternateContent>
           <mc:Choice Requires="wps">
             <w:drawing>
-              <wp:anchor distT="0" distB="0" distL="0" distR="0" simplePos="0" relativeHeight="61" behindDoc="0" locked="0" layoutInCell="1" allowOverlap="1" wp14:anchorId="5CEE6168">
+              <wp:anchor distT="0" distB="0" distL="0" distR="0" simplePos="0" relativeHeight="69" behindDoc="0" locked="0" layoutInCell="1" allowOverlap="1" wp14:anchorId="007AE448">
                 <wp:simplePos x="0" y="0"/>
                 <wp:positionH relativeFrom="column">
-                  <wp:posOffset>481965</wp:posOffset>
-                </wp:positionH>
-                <wp:positionV relativeFrom="paragraph">
-                  <wp:posOffset>-28575</wp:posOffset>
-                </wp:positionV>
-                <wp:extent cx="617220" cy="732155"/>
-                <wp:effectExtent l="0" t="0" r="0" b="0"/>
-                <wp:wrapNone/>
-                <wp:docPr id="46" name="Text Frame 33"/>
-                <a:graphic xmlns:a="http://schemas.openxmlformats.org/drawingml/2006/main">
-                  <a:graphicData uri="http://schemas.microsoft.com/office/word/2010/wordprocessingShape">
-                    <wps:wsp>
-                      <wps:cNvSpPr/>
-                      <wps:spPr>
-                        <a:xfrm>
-                          <a:off x="0" y="0"/>
-                          <a:ext cx="617400" cy="732240"/>
-                        </a:xfrm>
-                        <a:prstGeom prst="rect">
-                          <a:avLst/>
-                        </a:prstGeom>
-                        <a:noFill/>
-                        <a:ln w="0">
-                          <a:noFill/>
-                        </a:ln>
-                      </wps:spPr>
-                      <wps:style>
-                        <a:lnRef idx="0"/>
-                        <a:fillRef idx="0"/>
-                        <a:effectRef idx="0"/>
-                        <a:fontRef idx="minor"/>
-                      </wps:style>
-                      <wps:txbx>
-                        <w:txbxContent>
-                          <w:p>
-                            <w:pPr>
-                              <w:pStyle w:val="Normal1"/>
-                              <w:widowControl/>
-                              <w:suppressAutoHyphens w:val="true"/>
-                              <w:bidi w:val="0"/>
-                              <w:spacing w:lineRule="auto" w:line="276" w:before="0" w:after="200"/>
-                              <w:jc w:val="start"/>
-                              <w:rPr>
-                                <w:color w:val="000000"/>
-                              </w:rPr>
-                            </w:pPr>
-                            <w:r>
-                              <w:rPr>
-                                <w:color w:val="000000"/>
-                                <w:sz w:val="34"/>
-                                <w:szCs w:val="34"/>
-                              </w:rPr>
-                              <w:t>{{ scene_date_day }}</w:t>
-                            </w:r>
-                          </w:p>
-                        </w:txbxContent>
-                      </wps:txbx>
-                      <wps:bodyPr lIns="0" rIns="0" tIns="0" bIns="0" anchor="t">
-                        <a:noAutofit/>
-                      </wps:bodyPr>
-                    </wps:wsp>
-                  </a:graphicData>
-                </a:graphic>
-              </wp:anchor>
-            </w:drawing>
-          </mc:Choice>
-          <mc:Fallback>
-            <w:pict>
-              <v:rect id="shape_0" stroked="f" o:allowincell="f" style="position:absolute;margin-left:37.95pt;margin-top:-2.25pt;width:48.55pt;height:57.6pt;mso-wrap-style:square;v-text-anchor:top" wp14:anchorId="5CEE6168">
-                <v:fill o:detectmouseclick="t" on="false"/>
-                <v:stroke color="#3465a4" joinstyle="round" endcap="flat"/>
-                <v:textbox>
-                  <w:txbxContent>
-                    <w:p>
-                      <w:pPr>
-                        <w:pStyle w:val="Normal1"/>
-                        <w:widowControl/>
-                        <w:suppressAutoHyphens w:val="true"/>
-                        <w:bidi w:val="0"/>
-                        <w:spacing w:lineRule="auto" w:line="276" w:before="0" w:after="200"/>
-                        <w:jc w:val="start"/>
-                        <w:rPr>
-                          <w:color w:val="000000"/>
-                        </w:rPr>
-                      </w:pPr>
-                      <w:r>
-                        <w:rPr>
-                          <w:color w:val="000000"/>
-                          <w:sz w:val="34"/>
-                          <w:szCs w:val="34"/>
-                        </w:rPr>
-                        <w:t>{{ scene_date_day }}</w:t>
-                      </w:r>
-                    </w:p>
-                  </w:txbxContent>
-                </v:textbox>
-                <w10:wrap type="none"/>
-              </v:rect>
-            </w:pict>
-          </mc:Fallback>
-        </mc:AlternateContent>
-        <mc:AlternateContent>
-          <mc:Choice Requires="wps">
-            <w:drawing>
-              <wp:anchor distT="0" distB="0" distL="0" distR="0" simplePos="0" relativeHeight="63" behindDoc="0" locked="0" layoutInCell="1" allowOverlap="1" wp14:anchorId="007AE448">
-                <wp:simplePos x="0" y="0"/>
-                <wp:positionH relativeFrom="column">
-                  <wp:posOffset>1294765</wp:posOffset>
+                  <wp:posOffset>1242060</wp:posOffset>
                 </wp:positionH>
                 <wp:positionV relativeFrom="paragraph">
                   <wp:posOffset>-28575</wp:posOffset>
@@ -6429,10 +6300,8 @@
                               <w:suppressAutoHyphens w:val="true"/>
                               <w:bidi w:val="0"/>
                               <w:spacing w:lineRule="auto" w:line="276" w:before="0" w:after="200"/>
-                              <w:jc w:val="start"/>
-                              <w:rPr>
-                                <w:color w:val="000000"/>
-                              </w:rPr>
+                              <w:jc w:val="center"/>
+                              <w:rPr/>
                             </w:pPr>
                             <w:r>
                               <w:rPr>
@@ -6456,7 +6325,7 @@
           </mc:Choice>
           <mc:Fallback>
             <w:pict>
-              <v:rect id="shape_0" stroked="f" o:allowincell="f" style="position:absolute;margin-left:101.95pt;margin-top:-2.25pt;width:115.25pt;height:57.6pt;mso-wrap-style:square;v-text-anchor:top" wp14:anchorId="007AE448">
+              <v:rect id="shape_0" stroked="f" o:allowincell="f" style="position:absolute;margin-left:97.8pt;margin-top:-2.25pt;width:115.25pt;height:57.6pt;mso-wrap-style:square;v-text-anchor:top" wp14:anchorId="007AE448">
                 <v:fill o:detectmouseclick="t" on="false"/>
                 <v:stroke color="#3465a4" joinstyle="round" endcap="flat"/>
                 <v:textbox>
@@ -6468,10 +6337,8 @@
                         <w:suppressAutoHyphens w:val="true"/>
                         <w:bidi w:val="0"/>
                         <w:spacing w:lineRule="auto" w:line="276" w:before="0" w:after="200"/>
-                        <w:jc w:val="start"/>
-                        <w:rPr>
-                          <w:color w:val="000000"/>
-                        </w:rPr>
+                        <w:jc w:val="center"/>
+                        <w:rPr/>
                       </w:pPr>
                       <w:r>
                         <w:rPr>
@@ -6492,10 +6359,10 @@
         <mc:AlternateContent>
           <mc:Choice Requires="wps">
             <w:drawing>
-              <wp:anchor distT="0" distB="0" distL="0" distR="0" simplePos="0" relativeHeight="97" behindDoc="0" locked="0" layoutInCell="1" allowOverlap="1" wp14:anchorId="2811EE3F">
+              <wp:anchor distT="0" distB="0" distL="0" distR="0" simplePos="0" relativeHeight="103" behindDoc="0" locked="0" layoutInCell="1" allowOverlap="1" wp14:anchorId="2811EE3F">
                 <wp:simplePos x="0" y="0"/>
                 <wp:positionH relativeFrom="column">
-                  <wp:posOffset>3309620</wp:posOffset>
+                  <wp:posOffset>3295015</wp:posOffset>
                 </wp:positionH>
                 <wp:positionV relativeFrom="paragraph">
                   <wp:posOffset>-28575</wp:posOffset>
@@ -6536,10 +6403,8 @@
                               <w:suppressAutoHyphens w:val="true"/>
                               <w:bidi w:val="0"/>
                               <w:spacing w:lineRule="auto" w:line="276" w:before="0" w:after="200"/>
-                              <w:jc w:val="start"/>
-                              <w:rPr>
-                                <w:color w:val="000000"/>
-                              </w:rPr>
+                              <w:jc w:val="center"/>
+                              <w:rPr/>
                             </w:pPr>
                             <w:r>
                               <w:rPr>
@@ -6563,7 +6428,7 @@
           </mc:Choice>
           <mc:Fallback>
             <w:pict>
-              <v:rect id="shape_0" stroked="f" o:allowincell="f" style="position:absolute;margin-left:260.6pt;margin-top:-2.25pt;width:70.6pt;height:57.6pt;mso-wrap-style:square;v-text-anchor:top" wp14:anchorId="2811EE3F">
+              <v:rect id="shape_0" stroked="f" o:allowincell="f" style="position:absolute;margin-left:259.45pt;margin-top:-2.25pt;width:70.6pt;height:57.6pt;mso-wrap-style:square;v-text-anchor:top" wp14:anchorId="2811EE3F">
                 <v:fill o:detectmouseclick="t" on="false"/>
                 <v:stroke color="#3465a4" joinstyle="round" endcap="flat"/>
                 <v:textbox>
@@ -6575,10 +6440,8 @@
                         <w:suppressAutoHyphens w:val="true"/>
                         <w:bidi w:val="0"/>
                         <w:spacing w:lineRule="auto" w:line="276" w:before="0" w:after="200"/>
-                        <w:jc w:val="start"/>
-                        <w:rPr>
-                          <w:color w:val="000000"/>
-                        </w:rPr>
+                        <w:jc w:val="center"/>
+                        <w:rPr/>
                       </w:pPr>
                       <w:r>
                         <w:rPr>
@@ -6613,7 +6476,8 @@
           <w:tab w:val="clear" w:pos="720"/>
           <w:tab w:val="left" w:pos="1134" w:leader="none"/>
         </w:tabs>
-        <w:spacing w:lineRule="atLeast" w:line="198" w:before="0" w:after="198"/>
+        <w:spacing w:lineRule="atLeast" w:line="198" w:before="0" w:after="170"/>
+        <w:jc w:val="both"/>
         <w:rPr/>
       </w:pPr>
       <w:r>
@@ -6628,15 +6492,15 @@
         <mc:AlternateContent>
           <mc:Choice Requires="wps">
             <w:drawing>
-              <wp:anchor distT="0" distB="0" distL="0" distR="0" simplePos="0" relativeHeight="27" behindDoc="0" locked="0" layoutInCell="1" allowOverlap="1" wp14:anchorId="05C0D669">
+              <wp:anchor distT="0" distB="0" distL="0" distR="0" simplePos="0" relativeHeight="35" behindDoc="0" locked="0" layoutInCell="1" allowOverlap="1" wp14:anchorId="05C0D669">
                 <wp:simplePos x="0" y="0"/>
                 <wp:positionH relativeFrom="column">
-                  <wp:posOffset>-52070</wp:posOffset>
+                  <wp:posOffset>85725</wp:posOffset>
                 </wp:positionH>
                 <wp:positionV relativeFrom="paragraph">
-                  <wp:posOffset>-41910</wp:posOffset>
+                  <wp:posOffset>-20955</wp:posOffset>
                 </wp:positionV>
-                <wp:extent cx="5867400" cy="2907030"/>
+                <wp:extent cx="5729605" cy="2790190"/>
                 <wp:effectExtent l="0" t="0" r="0" b="0"/>
                 <wp:wrapNone/>
                 <wp:docPr id="49" name="Text Frame 37"/>
@@ -6647,7 +6511,7 @@
                       <wps:spPr>
                         <a:xfrm>
                           <a:off x="0" y="0"/>
-                          <a:ext cx="5867280" cy="2907000"/>
+                          <a:ext cx="5729760" cy="2790360"/>
                         </a:xfrm>
                         <a:prstGeom prst="rect">
                           <a:avLst/>
@@ -6668,17 +6532,24 @@
                           <w:p>
                             <w:pPr>
                               <w:pStyle w:val="Normal1"/>
-                              <w:spacing w:before="0" w:after="200"/>
-                              <w:ind w:firstLine="5443"/>
-                              <w:rPr>
-                                <w:color w:val="000000"/>
+                              <w:widowControl/>
+                              <w:suppressAutoHyphens w:val="true"/>
+                              <w:bidi w:val="0"/>
+                              <w:spacing w:lineRule="auto" w:line="360" w:before="0" w:after="170"/>
+                              <w:ind w:firstLine="5329" w:start="0" w:end="0"/>
+                              <w:jc w:val="start"/>
+                              <w:rPr>
+                                <w:rFonts w:ascii="TH SarabunIT๙" w:hAnsi="TH SarabunIT๙" w:cs="TH SarabunIT๙"/>
+                                <w:sz w:val="32"/>
+                                <w:szCs w:val="32"/>
                               </w:rPr>
                             </w:pPr>
                             <w:r>
                               <w:rPr>
+                                <w:rFonts w:cs="TH SarabunIT๙"/>
                                 <w:color w:val="000000"/>
-                                <w:sz w:val="34"/>
-                                <w:szCs w:val="34"/>
+                                <w:sz w:val="32"/>
+                                <w:szCs w:val="32"/>
                               </w:rPr>
                               <w:t>{{ charge }}</w:t>
                             </w:r>
@@ -6696,7 +6567,7 @@
           </mc:Choice>
           <mc:Fallback>
             <w:pict>
-              <v:rect id="shape_0" stroked="f" o:allowincell="f" style="position:absolute;margin-left:-4.1pt;margin-top:-3.3pt;width:461.95pt;height:228.85pt;mso-wrap-style:square;v-text-anchor:top" wp14:anchorId="05C0D669">
+              <v:rect id="shape_0" stroked="f" o:allowincell="f" style="position:absolute;margin-left:6.75pt;margin-top:-1.65pt;width:451.1pt;height:219.65pt;mso-wrap-style:square;v-text-anchor:top" wp14:anchorId="05C0D669">
                 <v:fill o:detectmouseclick="t" on="false"/>
                 <v:stroke color="#3465a4" joinstyle="round" endcap="flat"/>
                 <v:textbox>
@@ -6704,17 +6575,24 @@
                     <w:p>
                       <w:pPr>
                         <w:pStyle w:val="Normal1"/>
-                        <w:spacing w:before="0" w:after="200"/>
-                        <w:ind w:firstLine="5443"/>
-                        <w:rPr>
-                          <w:color w:val="000000"/>
+                        <w:widowControl/>
+                        <w:suppressAutoHyphens w:val="true"/>
+                        <w:bidi w:val="0"/>
+                        <w:spacing w:lineRule="auto" w:line="360" w:before="0" w:after="170"/>
+                        <w:ind w:firstLine="5329" w:start="0" w:end="0"/>
+                        <w:jc w:val="start"/>
+                        <w:rPr>
+                          <w:rFonts w:ascii="TH SarabunIT๙" w:hAnsi="TH SarabunIT๙" w:cs="TH SarabunIT๙"/>
+                          <w:sz w:val="32"/>
+                          <w:szCs w:val="32"/>
                         </w:rPr>
                       </w:pPr>
                       <w:r>
                         <w:rPr>
+                          <w:rFonts w:cs="TH SarabunIT๙"/>
                           <w:color w:val="000000"/>
-                          <w:sz w:val="34"/>
-                          <w:szCs w:val="34"/>
+                          <w:sz w:val="32"/>
+                          <w:szCs w:val="32"/>
                         </w:rPr>
                         <w:t>{{ charge }}</w:t>
                       </w:r>
@@ -6743,12 +6621,129 @@
           <w:tab w:val="clear" w:pos="720"/>
           <w:tab w:val="left" w:pos="1134" w:leader="none"/>
         </w:tabs>
-        <w:spacing w:lineRule="atLeast" w:line="198" w:before="0" w:after="198"/>
-        <w:rPr>
-          <w:rFonts w:ascii="TH SarabunIT๙" w:hAnsi="TH SarabunIT๙" w:eastAsia="Sarabun" w:cs="TH SarabunIT๙"/>
-          <w:sz w:val="34"/>
-          <w:szCs w:val="34"/>
-        </w:rPr>
+        <w:spacing w:lineRule="atLeast" w:line="198" w:before="0" w:after="170"/>
+        <w:jc w:val="both"/>
+        <w:rPr/>
+      </w:pPr>
+      <w:r>
+        <w:rPr>
+          <w:rFonts w:eastAsia="Sarabun" w:cs="TH SarabunIT๙"/>
+          <w:sz w:val="34"/>
+          <w:szCs w:val="34"/>
+        </w:rPr>
+        <w:t>....................................................................................................................................................................</w:t>
+      </w:r>
+    </w:p>
+    <w:p>
+      <w:pPr>
+        <w:pStyle w:val="Normal1"/>
+        <w:tabs>
+          <w:tab w:val="clear" w:pos="720"/>
+          <w:tab w:val="left" w:pos="1134" w:leader="none"/>
+        </w:tabs>
+        <w:spacing w:lineRule="atLeast" w:line="198" w:before="0" w:after="170"/>
+        <w:jc w:val="both"/>
+        <w:rPr/>
+      </w:pPr>
+      <w:r>
+        <w:rPr>
+          <w:rFonts w:eastAsia="Sarabun" w:cs="TH SarabunIT๙"/>
+          <w:sz w:val="34"/>
+          <w:szCs w:val="34"/>
+        </w:rPr>
+        <w:t>....................................................................................................................................................................</w:t>
+      </w:r>
+    </w:p>
+    <w:p>
+      <w:pPr>
+        <w:pStyle w:val="Normal1"/>
+        <w:tabs>
+          <w:tab w:val="clear" w:pos="720"/>
+          <w:tab w:val="left" w:pos="1134" w:leader="none"/>
+        </w:tabs>
+        <w:spacing w:lineRule="atLeast" w:line="198" w:before="0" w:after="170"/>
+        <w:jc w:val="both"/>
+        <w:rPr/>
+      </w:pPr>
+      <w:r>
+        <w:rPr>
+          <w:rFonts w:eastAsia="Sarabun" w:cs="TH SarabunIT๙"/>
+          <w:sz w:val="34"/>
+          <w:szCs w:val="34"/>
+        </w:rPr>
+        <w:t>....................................................................................................................................................................</w:t>
+      </w:r>
+    </w:p>
+    <w:p>
+      <w:pPr>
+        <w:pStyle w:val="Normal1"/>
+        <w:tabs>
+          <w:tab w:val="clear" w:pos="720"/>
+          <w:tab w:val="left" w:pos="1134" w:leader="none"/>
+        </w:tabs>
+        <w:spacing w:lineRule="atLeast" w:line="198" w:before="0" w:after="170"/>
+        <w:jc w:val="both"/>
+        <w:rPr/>
+      </w:pPr>
+      <w:r>
+        <w:rPr>
+          <w:rFonts w:eastAsia="Sarabun" w:cs="TH SarabunIT๙"/>
+          <w:sz w:val="34"/>
+          <w:szCs w:val="34"/>
+        </w:rPr>
+        <w:t>....................................................................................................................................................................</w:t>
+      </w:r>
+    </w:p>
+    <w:p>
+      <w:pPr>
+        <w:pStyle w:val="Normal1"/>
+        <w:tabs>
+          <w:tab w:val="clear" w:pos="720"/>
+          <w:tab w:val="left" w:pos="1134" w:leader="none"/>
+        </w:tabs>
+        <w:spacing w:lineRule="atLeast" w:line="198" w:before="0" w:after="170"/>
+        <w:jc w:val="both"/>
+        <w:rPr/>
+      </w:pPr>
+      <w:r>
+        <w:rPr>
+          <w:rFonts w:eastAsia="Sarabun" w:cs="TH SarabunIT๙"/>
+          <w:sz w:val="34"/>
+          <w:szCs w:val="34"/>
+        </w:rPr>
+        <w:t>....................................................................................................................................................................</w:t>
+      </w:r>
+    </w:p>
+    <w:p>
+      <w:pPr>
+        <w:pStyle w:val="Normal1"/>
+        <w:tabs>
+          <w:tab w:val="clear" w:pos="720"/>
+          <w:tab w:val="left" w:pos="1134" w:leader="none"/>
+        </w:tabs>
+        <w:spacing w:lineRule="atLeast" w:line="198" w:before="0" w:after="170"/>
+        <w:jc w:val="both"/>
+        <w:rPr/>
+      </w:pPr>
+      <w:r>
+        <w:rPr>
+          <w:rFonts w:eastAsia="Sarabun" w:cs="TH SarabunIT๙"/>
+          <w:sz w:val="34"/>
+          <w:szCs w:val="34"/>
+        </w:rPr>
+        <w:t>.................................................................................................................................................................…</w:t>
+      </w:r>
+    </w:p>
+    <w:p>
+      <w:pPr>
+        <w:pStyle w:val="Normal1"/>
+        <w:tabs>
+          <w:tab w:val="clear" w:pos="720"/>
+          <w:tab w:val="left" w:pos="1134" w:leader="none"/>
+        </w:tabs>
+        <w:spacing w:lineRule="atLeast" w:line="198" w:before="0" w:after="170"/>
+        <w:jc w:val="both"/>
+        <w:rPr/>
       </w:pPr>
       <w:r>
         <w:rPr>
@@ -6767,144 +6762,7 @@
           <w:tab w:val="left" w:pos="1134" w:leader="none"/>
         </w:tabs>
         <w:spacing w:lineRule="atLeast" w:line="198" w:before="0" w:after="198"/>
-        <w:rPr>
-          <w:rFonts w:ascii="TH SarabunIT๙" w:hAnsi="TH SarabunIT๙" w:eastAsia="Sarabun" w:cs="TH SarabunIT๙"/>
-          <w:sz w:val="34"/>
-          <w:szCs w:val="34"/>
-        </w:rPr>
-      </w:pPr>
-      <w:r>
-        <w:rPr>
-          <w:rFonts w:eastAsia="Sarabun" w:cs="TH SarabunIT๙"/>
-          <w:sz w:val="34"/>
-          <w:szCs w:val="34"/>
-        </w:rPr>
-        <w:t>....................................................................................................................................................................</w:t>
-      </w:r>
-    </w:p>
-    <w:p>
-      <w:pPr>
-        <w:pStyle w:val="Normal1"/>
-        <w:tabs>
-          <w:tab w:val="clear" w:pos="720"/>
-          <w:tab w:val="left" w:pos="1134" w:leader="none"/>
-        </w:tabs>
-        <w:spacing w:lineRule="atLeast" w:line="198" w:before="0" w:after="198"/>
-        <w:rPr>
-          <w:rFonts w:ascii="TH SarabunIT๙" w:hAnsi="TH SarabunIT๙" w:eastAsia="Sarabun" w:cs="TH SarabunIT๙"/>
-          <w:sz w:val="34"/>
-          <w:szCs w:val="34"/>
-        </w:rPr>
-      </w:pPr>
-      <w:r>
-        <w:rPr>
-          <w:rFonts w:eastAsia="Sarabun" w:cs="TH SarabunIT๙"/>
-          <w:sz w:val="34"/>
-          <w:szCs w:val="34"/>
-        </w:rPr>
-        <w:t>....................................................................................................................................................................</w:t>
-      </w:r>
-    </w:p>
-    <w:p>
-      <w:pPr>
-        <w:pStyle w:val="Normal1"/>
-        <w:tabs>
-          <w:tab w:val="clear" w:pos="720"/>
-          <w:tab w:val="left" w:pos="1134" w:leader="none"/>
-        </w:tabs>
-        <w:spacing w:lineRule="atLeast" w:line="198" w:before="0" w:after="198"/>
-        <w:rPr>
-          <w:rFonts w:ascii="TH SarabunIT๙" w:hAnsi="TH SarabunIT๙" w:eastAsia="Sarabun" w:cs="TH SarabunIT๙"/>
-          <w:sz w:val="34"/>
-          <w:szCs w:val="34"/>
-        </w:rPr>
-      </w:pPr>
-      <w:r>
-        <w:rPr>
-          <w:rFonts w:eastAsia="Sarabun" w:cs="TH SarabunIT๙"/>
-          <w:sz w:val="34"/>
-          <w:szCs w:val="34"/>
-        </w:rPr>
-        <w:t>....................................................................................................................................................................</w:t>
-      </w:r>
-    </w:p>
-    <w:p>
-      <w:pPr>
-        <w:pStyle w:val="Normal1"/>
-        <w:tabs>
-          <w:tab w:val="clear" w:pos="720"/>
-          <w:tab w:val="left" w:pos="1134" w:leader="none"/>
-        </w:tabs>
-        <w:spacing w:lineRule="atLeast" w:line="198" w:before="0" w:after="198"/>
-        <w:rPr>
-          <w:rFonts w:ascii="TH SarabunIT๙" w:hAnsi="TH SarabunIT๙" w:eastAsia="Sarabun" w:cs="TH SarabunIT๙"/>
-          <w:sz w:val="34"/>
-          <w:szCs w:val="34"/>
-        </w:rPr>
-      </w:pPr>
-      <w:r>
-        <w:rPr>
-          <w:rFonts w:eastAsia="Sarabun" w:cs="TH SarabunIT๙"/>
-          <w:sz w:val="34"/>
-          <w:szCs w:val="34"/>
-        </w:rPr>
-        <w:t>....................................................................................................................................................................</w:t>
-      </w:r>
-    </w:p>
-    <w:p>
-      <w:pPr>
-        <w:pStyle w:val="Normal1"/>
-        <w:tabs>
-          <w:tab w:val="clear" w:pos="720"/>
-          <w:tab w:val="left" w:pos="1134" w:leader="none"/>
-        </w:tabs>
-        <w:spacing w:lineRule="atLeast" w:line="198" w:before="0" w:after="198"/>
-        <w:rPr>
-          <w:rFonts w:ascii="TH SarabunIT๙" w:hAnsi="TH SarabunIT๙" w:eastAsia="Sarabun" w:cs="TH SarabunIT๙"/>
-          <w:sz w:val="34"/>
-          <w:szCs w:val="34"/>
-        </w:rPr>
-      </w:pPr>
-      <w:r>
-        <w:rPr>
-          <w:rFonts w:eastAsia="Sarabun" w:cs="TH SarabunIT๙"/>
-          <w:sz w:val="34"/>
-          <w:szCs w:val="34"/>
-        </w:rPr>
-        <w:t>.................................................................................................................................................................…</w:t>
-      </w:r>
-    </w:p>
-    <w:p>
-      <w:pPr>
-        <w:pStyle w:val="Normal1"/>
-        <w:tabs>
-          <w:tab w:val="clear" w:pos="720"/>
-          <w:tab w:val="left" w:pos="1134" w:leader="none"/>
-        </w:tabs>
-        <w:spacing w:lineRule="atLeast" w:line="198" w:before="0" w:after="198"/>
-        <w:rPr>
-          <w:rFonts w:ascii="TH SarabunIT๙" w:hAnsi="TH SarabunIT๙" w:eastAsia="Sarabun" w:cs="TH SarabunIT๙"/>
-          <w:sz w:val="34"/>
-          <w:szCs w:val="34"/>
-        </w:rPr>
-      </w:pPr>
-      <w:r>
-        <w:rPr>
-          <w:rFonts w:eastAsia="Sarabun" w:cs="TH SarabunIT๙"/>
-          <w:sz w:val="34"/>
-          <w:szCs w:val="34"/>
-        </w:rPr>
-        <w:t>....................................................................................................................................................................</w:t>
-      </w:r>
-    </w:p>
-    <w:p>
-      <w:pPr>
-        <w:pStyle w:val="Normal1"/>
-        <w:tabs>
-          <w:tab w:val="clear" w:pos="720"/>
-          <w:tab w:val="left" w:pos="1134" w:leader="none"/>
-        </w:tabs>
-        <w:spacing w:lineRule="atLeast" w:line="198" w:before="0" w:after="198"/>
+        <w:jc w:val="both"/>
         <w:rPr/>
       </w:pPr>
       <w:r>
@@ -6919,7 +6777,7 @@
         <mc:AlternateContent>
           <mc:Choice Requires="wps">
             <w:drawing>
-              <wp:anchor distT="0" distB="0" distL="0" distR="0" simplePos="0" relativeHeight="65" behindDoc="0" locked="0" layoutInCell="1" allowOverlap="1" wp14:anchorId="37003977">
+              <wp:anchor distT="0" distB="0" distL="0" distR="0" simplePos="0" relativeHeight="71" behindDoc="0" locked="0" layoutInCell="1" allowOverlap="1" wp14:anchorId="37003977">
                 <wp:simplePos x="0" y="0"/>
                 <wp:positionH relativeFrom="column">
                   <wp:posOffset>1607185</wp:posOffset>
@@ -7041,6 +6899,7 @@
           <w:tab w:val="left" w:pos="1134" w:leader="none"/>
         </w:tabs>
         <w:spacing w:lineRule="atLeast" w:line="198" w:before="0" w:after="198"/>
+        <w:jc w:val="both"/>
         <w:rPr/>
       </w:pPr>
       <w:r>
@@ -7071,7 +6930,7 @@
         <mc:AlternateContent>
           <mc:Choice Requires="wps">
             <w:drawing>
-              <wp:anchor distT="0" distB="0" distL="0" distR="0" simplePos="0" relativeHeight="69" behindDoc="0" locked="0" layoutInCell="1" allowOverlap="1" wp14:anchorId="6037DD53">
+              <wp:anchor distT="0" distB="0" distL="0" distR="0" simplePos="0" relativeHeight="75" behindDoc="0" locked="0" layoutInCell="1" allowOverlap="1" wp14:anchorId="6037DD53">
                 <wp:simplePos x="0" y="0"/>
                 <wp:positionH relativeFrom="column">
                   <wp:posOffset>2535555</wp:posOffset>
@@ -7193,6 +7052,7 @@
           <w:tab w:val="left" w:pos="1134" w:leader="none"/>
         </w:tabs>
         <w:spacing w:lineRule="atLeast" w:line="198" w:before="0" w:after="198"/>
+        <w:jc w:val="both"/>
         <w:rPr/>
       </w:pPr>
       <w:r>
@@ -7247,7 +7107,7 @@
         <mc:AlternateContent>
           <mc:Choice Requires="wps">
             <w:drawing>
-              <wp:anchor distT="0" distB="0" distL="0" distR="0" simplePos="0" relativeHeight="71" behindDoc="0" locked="0" layoutInCell="1" allowOverlap="1" wp14:anchorId="65F255C1">
+              <wp:anchor distT="0" distB="0" distL="0" distR="0" simplePos="0" relativeHeight="77" behindDoc="0" locked="0" layoutInCell="1" allowOverlap="1" wp14:anchorId="65F255C1">
                 <wp:simplePos x="0" y="0"/>
                 <wp:positionH relativeFrom="column">
                   <wp:posOffset>4170680</wp:posOffset>
@@ -7363,6 +7223,7 @@
           <w:tab w:val="left" w:pos="1134" w:leader="none"/>
         </w:tabs>
         <w:spacing w:lineRule="atLeast" w:line="198" w:before="0" w:after="198"/>
+        <w:jc w:val="both"/>
         <w:rPr/>
       </w:pPr>
       <w:r>
@@ -7382,6 +7243,7 @@
           <w:tab w:val="left" w:pos="1134" w:leader="none"/>
         </w:tabs>
         <w:spacing w:lineRule="atLeast" w:line="198" w:before="0" w:after="198"/>
+        <w:jc w:val="both"/>
         <w:rPr/>
       </w:pPr>
       <w:r>
@@ -7452,7 +7314,7 @@
         <mc:AlternateContent>
           <mc:Choice Requires="wps">
             <w:drawing>
-              <wp:anchor distT="0" distB="0" distL="0" distR="0" simplePos="0" relativeHeight="73" behindDoc="0" locked="0" layoutInCell="1" allowOverlap="1" wp14:anchorId="1141CF86">
+              <wp:anchor distT="0" distB="0" distL="0" distR="0" simplePos="0" relativeHeight="79" behindDoc="0" locked="0" layoutInCell="1" allowOverlap="1" wp14:anchorId="1141CF86">
                 <wp:simplePos x="0" y="0"/>
                 <wp:positionH relativeFrom="column">
                   <wp:posOffset>3843020</wp:posOffset>
@@ -7568,6 +7430,7 @@
           <w:tab w:val="left" w:pos="1134" w:leader="none"/>
         </w:tabs>
         <w:spacing w:lineRule="atLeast" w:line="198" w:before="0" w:after="198"/>
+        <w:jc w:val="both"/>
         <w:rPr/>
       </w:pPr>
       <w:r>
@@ -7587,6 +7450,7 @@
           <w:tab w:val="left" w:pos="1134" w:leader="none"/>
         </w:tabs>
         <w:spacing w:lineRule="atLeast" w:line="198" w:before="0" w:after="198"/>
+        <w:jc w:val="both"/>
         <w:rPr/>
       </w:pPr>
       <w:r>
@@ -7630,6 +7494,7 @@
           <w:tab w:val="left" w:pos="1134" w:leader="none"/>
         </w:tabs>
         <w:spacing w:lineRule="atLeast" w:line="198" w:before="0" w:after="198"/>
+        <w:jc w:val="both"/>
         <w:rPr/>
       </w:pPr>
       <w:r>
@@ -7649,7 +7514,7 @@
         <mc:AlternateContent>
           <mc:Choice Requires="wps">
             <w:drawing>
-              <wp:anchor distT="5715" distB="4445" distL="5715" distR="4445" simplePos="0" relativeHeight="115" behindDoc="1" locked="0" layoutInCell="1" allowOverlap="1">
+              <wp:anchor distT="5715" distB="4445" distL="5715" distR="4445" simplePos="0" relativeHeight="11" behindDoc="1" locked="0" layoutInCell="1" allowOverlap="1">
                 <wp:simplePos x="0" y="0"/>
                 <wp:positionH relativeFrom="column">
                   <wp:posOffset>1080135</wp:posOffset>
@@ -7779,7 +7644,7 @@
         <mc:AlternateContent>
           <mc:Choice Requires="wps">
             <w:drawing>
-              <wp:anchor distT="0" distB="0" distL="0" distR="0" simplePos="0" relativeHeight="75" behindDoc="0" locked="0" layoutInCell="1" allowOverlap="1" wp14:anchorId="682413F3">
+              <wp:anchor distT="0" distB="0" distL="0" distR="0" simplePos="0" relativeHeight="81" behindDoc="0" locked="0" layoutInCell="1" allowOverlap="1" wp14:anchorId="682413F3">
                 <wp:simplePos x="0" y="0"/>
                 <wp:positionH relativeFrom="column">
                   <wp:posOffset>1140460</wp:posOffset>
@@ -7886,7 +7751,7 @@
         <mc:AlternateContent>
           <mc:Choice Requires="wps">
             <w:drawing>
-              <wp:anchor distT="0" distB="0" distL="0" distR="0" simplePos="0" relativeHeight="81" behindDoc="0" locked="0" layoutInCell="1" allowOverlap="1" wp14:anchorId="631AA505">
+              <wp:anchor distT="0" distB="0" distL="0" distR="0" simplePos="0" relativeHeight="87" behindDoc="0" locked="0" layoutInCell="1" allowOverlap="1" wp14:anchorId="631AA505">
                 <wp:simplePos x="0" y="0"/>
                 <wp:positionH relativeFrom="column">
                   <wp:posOffset>1092200</wp:posOffset>
@@ -8008,6 +7873,7 @@
           <w:tab w:val="left" w:pos="1134" w:leader="none"/>
         </w:tabs>
         <w:spacing w:lineRule="atLeast" w:line="198" w:before="0" w:after="198"/>
+        <w:jc w:val="both"/>
         <w:rPr/>
       </w:pPr>
       <w:r>
@@ -8022,7 +7888,7 @@
         <mc:AlternateContent>
           <mc:Choice Requires="wps">
             <w:drawing>
-              <wp:anchor distT="0" distB="0" distL="0" distR="0" simplePos="0" relativeHeight="83" behindDoc="0" locked="0" layoutInCell="1" allowOverlap="1" wp14:anchorId="0E4095E6">
+              <wp:anchor distT="0" distB="0" distL="0" distR="0" simplePos="0" relativeHeight="89" behindDoc="0" locked="0" layoutInCell="1" allowOverlap="1" wp14:anchorId="0E4095E6">
                 <wp:simplePos x="0" y="0"/>
                 <wp:positionH relativeFrom="column">
                   <wp:posOffset>918845</wp:posOffset>
@@ -8144,6 +8010,7 @@
           <w:tab w:val="left" w:pos="1134" w:leader="none"/>
         </w:tabs>
         <w:spacing w:lineRule="atLeast" w:line="198" w:before="0" w:after="198"/>
+        <w:jc w:val="both"/>
         <w:rPr/>
       </w:pPr>
       <w:r>
@@ -8163,7 +8030,7 @@
         <mc:AlternateContent>
           <mc:Choice Requires="wps">
             <w:drawing>
-              <wp:anchor distT="5715" distB="4445" distL="5715" distR="4445" simplePos="0" relativeHeight="117" behindDoc="1" locked="0" layoutInCell="1" allowOverlap="1">
+              <wp:anchor distT="5715" distB="4445" distL="5715" distR="4445" simplePos="0" relativeHeight="13" behindDoc="1" locked="0" layoutInCell="1" allowOverlap="1">
                 <wp:simplePos x="0" y="0"/>
                 <wp:positionH relativeFrom="column">
                   <wp:posOffset>1080135</wp:posOffset>
@@ -8269,7 +8136,7 @@
         <mc:AlternateContent>
           <mc:Choice Requires="wps">
             <w:drawing>
-              <wp:anchor distT="0" distB="0" distL="0" distR="0" simplePos="0" relativeHeight="105" behindDoc="0" locked="0" layoutInCell="1" allowOverlap="1" wp14:anchorId="07C3E400">
+              <wp:anchor distT="0" distB="0" distL="0" distR="0" simplePos="0" relativeHeight="111" behindDoc="0" locked="0" layoutInCell="1" allowOverlap="1" wp14:anchorId="07C3E400">
                 <wp:simplePos x="0" y="0"/>
                 <wp:positionH relativeFrom="column">
                   <wp:posOffset>1113155</wp:posOffset>
@@ -9417,14 +9284,14 @@
       <w:suppressAutoHyphens w:val="true"/>
       <w:bidi w:val="0"/>
       <w:spacing w:lineRule="auto" w:line="276" w:before="0" w:after="200"/>
-      <w:jc w:val="start"/>
+      <w:jc w:val="center"/>
     </w:pPr>
     <w:rPr>
       <w:rFonts w:ascii="TH SarabunIT๙" w:hAnsi="TH SarabunIT๙" w:eastAsia="Calibri" w:cs="TH SarabunIT๙"/>
       <w:color w:val="auto"/>
       <w:kern w:val="0"/>
-      <w:sz w:val="34"/>
-      <w:szCs w:val="34"/>
+      <w:sz w:val="32"/>
+      <w:szCs w:val="32"/>
       <w:lang w:val="en-US" w:eastAsia="zh-CN" w:bidi="th-TH"/>
     </w:rPr>
   </w:style>

</xml_diff>

<commit_message>
Fix more document template + adjust filter + add the last filter
</commit_message>
<xml_diff>
--- a/warrant_form/resources/reqform_template.docx
+++ b/warrant_form/resources/reqform_template.docx
@@ -55,7 +55,7 @@
                         <w:txbxContent>
                           <w:p>
                             <w:pPr>
-                              <w:pStyle w:val="FrameContents"/>
+                              <w:pStyle w:val="FrameContentsuser"/>
                               <w:spacing w:lineRule="auto" w:line="276"/>
                               <w:rPr>
                                 <w:rFonts w:ascii="TH SarabunIT๙" w:hAnsi="TH SarabunIT๙" w:eastAsia="Sarabun" w:cs="TH SarabunIT๙"/>
@@ -76,7 +76,7 @@
                           </w:p>
                           <w:p>
                             <w:pPr>
-                              <w:pStyle w:val="FrameContents"/>
+                              <w:pStyle w:val="FrameContentsuser"/>
                               <w:spacing w:lineRule="auto" w:line="276"/>
                               <w:rPr>
                                 <w:rFonts w:ascii="TH SarabunIT๙" w:hAnsi="TH SarabunIT๙" w:eastAsia="Sarabun" w:cs="TH SarabunIT๙"/>
@@ -97,7 +97,7 @@
                           </w:p>
                           <w:p>
                             <w:pPr>
-                              <w:pStyle w:val="FrameContents"/>
+                              <w:pStyle w:val="FrameContentsuser"/>
                               <w:spacing w:lineRule="auto" w:line="276"/>
                               <w:rPr>
                                 <w:rFonts w:ascii="TH SarabunIT๙" w:hAnsi="TH SarabunIT๙" w:cs="TH SarabunIT๙"/>
@@ -116,7 +116,7 @@
                           </w:p>
                           <w:p>
                             <w:pPr>
-                              <w:pStyle w:val="FrameContents"/>
+                              <w:pStyle w:val="FrameContentsuser"/>
                               <w:spacing w:lineRule="auto" w:line="276"/>
                               <w:rPr/>
                             </w:pPr>
@@ -162,7 +162,7 @@
                   <w:txbxContent>
                     <w:p>
                       <w:pPr>
-                        <w:pStyle w:val="FrameContents"/>
+                        <w:pStyle w:val="FrameContentsuser"/>
                         <w:spacing w:lineRule="auto" w:line="276"/>
                         <w:rPr>
                           <w:rFonts w:ascii="TH SarabunIT๙" w:hAnsi="TH SarabunIT๙" w:eastAsia="Sarabun" w:cs="TH SarabunIT๙"/>
@@ -183,7 +183,7 @@
                     </w:p>
                     <w:p>
                       <w:pPr>
-                        <w:pStyle w:val="FrameContents"/>
+                        <w:pStyle w:val="FrameContentsuser"/>
                         <w:spacing w:lineRule="auto" w:line="276"/>
                         <w:rPr>
                           <w:rFonts w:ascii="TH SarabunIT๙" w:hAnsi="TH SarabunIT๙" w:eastAsia="Sarabun" w:cs="TH SarabunIT๙"/>
@@ -204,7 +204,7 @@
                     </w:p>
                     <w:p>
                       <w:pPr>
-                        <w:pStyle w:val="FrameContents"/>
+                        <w:pStyle w:val="FrameContentsuser"/>
                         <w:spacing w:lineRule="auto" w:line="276"/>
                         <w:rPr>
                           <w:rFonts w:ascii="TH SarabunIT๙" w:hAnsi="TH SarabunIT๙" w:cs="TH SarabunIT๙"/>
@@ -223,7 +223,7 @@
                     </w:p>
                     <w:p>
                       <w:pPr>
-                        <w:pStyle w:val="FrameContents"/>
+                        <w:pStyle w:val="FrameContentsuser"/>
                         <w:spacing w:lineRule="auto" w:line="276"/>
                         <w:rPr/>
                       </w:pPr>
@@ -300,7 +300,7 @@
                         <w:txbxContent>
                           <w:p>
                             <w:pPr>
-                              <w:pStyle w:val="FrameContents"/>
+                              <w:pStyle w:val="FrameContentsuser"/>
                               <w:spacing w:lineRule="auto" w:line="276"/>
                               <w:rPr>
                                 <w:rFonts w:ascii="TH SarabunIT๙" w:hAnsi="TH SarabunIT๙" w:eastAsia="Sarabun" w:cs="TH SarabunIT๙"/>
@@ -339,7 +339,7 @@
                           </w:p>
                           <w:p>
                             <w:pPr>
-                              <w:pStyle w:val="FrameContents"/>
+                              <w:pStyle w:val="FrameContentsuser"/>
                               <w:spacing w:lineRule="auto" w:line="276"/>
                               <w:rPr/>
                             </w:pPr>
@@ -373,7 +373,7 @@
                   <w:txbxContent>
                     <w:p>
                       <w:pPr>
-                        <w:pStyle w:val="FrameContents"/>
+                        <w:pStyle w:val="FrameContentsuser"/>
                         <w:spacing w:lineRule="auto" w:line="276"/>
                         <w:rPr>
                           <w:rFonts w:ascii="TH SarabunIT๙" w:hAnsi="TH SarabunIT๙" w:eastAsia="Sarabun" w:cs="TH SarabunIT๙"/>
@@ -412,7 +412,7 @@
                     </w:p>
                     <w:p>
                       <w:pPr>
-                        <w:pStyle w:val="FrameContents"/>
+                        <w:pStyle w:val="FrameContentsuser"/>
                         <w:spacing w:lineRule="auto" w:line="276"/>
                         <w:rPr/>
                       </w:pPr>
@@ -490,6 +490,13 @@
           <w:szCs w:val="34"/>
         </w:rPr>
         <w:tab/>
+      </w:r>
+      <w:r>
+        <w:rPr>
+          <w:rFonts w:cs="TH SarabunIT๙"/>
+          <w:sz w:val="34"/>
+          <w:szCs w:val="34"/>
+        </w:rPr>
         <w:tab/>
       </w:r>
       <w:r>
@@ -751,7 +758,7 @@
               <wp:anchor distT="0" distB="0" distL="0" distR="0" simplePos="0" relativeHeight="105" behindDoc="0" locked="0" layoutInCell="1" allowOverlap="1" wp14:anchorId="0C6474A2">
                 <wp:simplePos x="0" y="0"/>
                 <wp:positionH relativeFrom="column">
-                  <wp:posOffset>-127000</wp:posOffset>
+                  <wp:posOffset>-85725</wp:posOffset>
                 </wp:positionH>
                 <wp:positionV relativeFrom="paragraph">
                   <wp:posOffset>-41275</wp:posOffset>
@@ -817,7 +824,7 @@
           </mc:Choice>
           <mc:Fallback>
             <w:pict>
-              <v:rect id="shape_0" stroked="f" o:allowincell="f" style="position:absolute;margin-left:-10pt;margin-top:-3.25pt;width:187.85pt;height:38.4pt;mso-wrap-style:square;v-text-anchor:top" wp14:anchorId="0C6474A2">
+              <v:rect id="shape_0" stroked="f" o:allowincell="f" style="position:absolute;margin-left:-6.75pt;margin-top:-3.25pt;width:187.85pt;height:38.4pt;mso-wrap-style:square;v-text-anchor:top" wp14:anchorId="0C6474A2">
                 <v:fill o:detectmouseclick="t" on="false"/>
                 <v:stroke color="#3465a4" weight="19080" joinstyle="round" endcap="flat"/>
                 <v:textbox>
@@ -2101,12 +2108,12 @@
               <wp:anchor distT="0" distB="0" distL="0" distR="0" simplePos="0" relativeHeight="43" behindDoc="0" locked="0" layoutInCell="1" allowOverlap="1" wp14:anchorId="3C72A6D4">
                 <wp:simplePos x="0" y="0"/>
                 <wp:positionH relativeFrom="column">
-                  <wp:posOffset>401320</wp:posOffset>
+                  <wp:posOffset>648335</wp:posOffset>
                 </wp:positionH>
                 <wp:positionV relativeFrom="paragraph">
-                  <wp:posOffset>-33020</wp:posOffset>
+                  <wp:posOffset>-635</wp:posOffset>
                 </wp:positionV>
-                <wp:extent cx="1485265" cy="488315"/>
+                <wp:extent cx="1137285" cy="455930"/>
                 <wp:effectExtent l="0" t="0" r="0" b="0"/>
                 <wp:wrapNone/>
                 <wp:docPr id="16" name="Text Frame 13"/>
@@ -2117,7 +2124,7 @@
                       <wps:spPr>
                         <a:xfrm>
                           <a:off x="0" y="0"/>
-                          <a:ext cx="1485360" cy="488160"/>
+                          <a:ext cx="1137240" cy="455760"/>
                         </a:xfrm>
                         <a:prstGeom prst="rect">
                           <a:avLst/>
@@ -2140,12 +2147,15 @@
                               <w:pStyle w:val="Normal1"/>
                               <w:spacing w:before="0" w:after="200"/>
                               <w:rPr>
-                                <w:color w:val="000000"/>
+                                <w:sz w:val="30"/>
+                                <w:szCs w:val="30"/>
                               </w:rPr>
                             </w:pPr>
                             <w:r>
                               <w:rPr>
                                 <w:color w:val="000000"/>
+                                <w:sz w:val="30"/>
+                                <w:szCs w:val="30"/>
                               </w:rPr>
                               <w:t>{{ req_sub_district }}</w:t>
                             </w:r>
@@ -2163,7 +2173,7 @@
           </mc:Choice>
           <mc:Fallback>
             <w:pict>
-              <v:rect id="shape_0" stroked="f" o:allowincell="f" style="position:absolute;margin-left:31.6pt;margin-top:-2.6pt;width:116.9pt;height:38.4pt;mso-wrap-style:square;v-text-anchor:top" wp14:anchorId="3C72A6D4">
+              <v:rect id="shape_0" stroked="f" o:allowincell="f" style="position:absolute;margin-left:51.05pt;margin-top:-0.05pt;width:89.5pt;height:35.85pt;mso-wrap-style:square;v-text-anchor:top" wp14:anchorId="3C72A6D4">
                 <v:fill o:detectmouseclick="t" on="false"/>
                 <v:stroke color="#3465a4" joinstyle="round" endcap="flat"/>
                 <v:textbox>
@@ -2173,12 +2183,15 @@
                         <w:pStyle w:val="Normal1"/>
                         <w:spacing w:before="0" w:after="200"/>
                         <w:rPr>
-                          <w:color w:val="000000"/>
+                          <w:sz w:val="30"/>
+                          <w:szCs w:val="30"/>
                         </w:rPr>
                       </w:pPr>
                       <w:r>
                         <w:rPr>
                           <w:color w:val="000000"/>
+                          <w:sz w:val="30"/>
+                          <w:szCs w:val="30"/>
                         </w:rPr>
                         <w:t>{{ req_sub_district }}</w:t>
                       </w:r>
@@ -2291,12 +2304,12 @@
               <wp:anchor distT="0" distB="0" distL="0" distR="0" simplePos="0" relativeHeight="85" behindDoc="0" locked="0" layoutInCell="1" allowOverlap="1" wp14:anchorId="6B3950FB">
                 <wp:simplePos x="0" y="0"/>
                 <wp:positionH relativeFrom="column">
-                  <wp:posOffset>4334510</wp:posOffset>
+                  <wp:posOffset>4294505</wp:posOffset>
                 </wp:positionH>
                 <wp:positionV relativeFrom="paragraph">
                   <wp:posOffset>-33020</wp:posOffset>
                 </wp:positionV>
-                <wp:extent cx="1485265" cy="488315"/>
+                <wp:extent cx="1442085" cy="488315"/>
                 <wp:effectExtent l="0" t="0" r="0" b="0"/>
                 <wp:wrapNone/>
                 <wp:docPr id="18" name="Text Frame 15"/>
@@ -2307,7 +2320,7 @@
                       <wps:spPr>
                         <a:xfrm>
                           <a:off x="0" y="0"/>
-                          <a:ext cx="1485360" cy="488160"/>
+                          <a:ext cx="1442160" cy="488160"/>
                         </a:xfrm>
                         <a:prstGeom prst="rect">
                           <a:avLst/>
@@ -2332,14 +2345,17 @@
                               <w:suppressAutoHyphens w:val="true"/>
                               <w:bidi w:val="0"/>
                               <w:spacing w:lineRule="auto" w:line="276" w:before="0" w:after="200"/>
-                              <w:jc w:val="start"/>
-                              <w:rPr/>
+                              <w:jc w:val="center"/>
+                              <w:rPr>
+                                <w:sz w:val="32"/>
+                                <w:szCs w:val="32"/>
+                              </w:rPr>
                             </w:pPr>
                             <w:r>
                               <w:rPr>
                                 <w:color w:val="000000"/>
-                                <w:sz w:val="34"/>
-                                <w:szCs w:val="34"/>
+                                <w:sz w:val="32"/>
+                                <w:szCs w:val="32"/>
                               </w:rPr>
                               <w:t>{{ req_province }}</w:t>
                             </w:r>
@@ -2357,7 +2373,7 @@
           </mc:Choice>
           <mc:Fallback>
             <w:pict>
-              <v:rect id="shape_0" stroked="f" o:allowincell="f" style="position:absolute;margin-left:341.3pt;margin-top:-2.6pt;width:116.9pt;height:38.4pt;mso-wrap-style:square;v-text-anchor:top" wp14:anchorId="6B3950FB">
+              <v:rect id="shape_0" stroked="f" o:allowincell="f" style="position:absolute;margin-left:338.15pt;margin-top:-2.6pt;width:113.5pt;height:38.4pt;mso-wrap-style:square;v-text-anchor:top" wp14:anchorId="6B3950FB">
                 <v:fill o:detectmouseclick="t" on="false"/>
                 <v:stroke color="#3465a4" joinstyle="round" endcap="flat"/>
                 <v:textbox>
@@ -2369,14 +2385,17 @@
                         <w:suppressAutoHyphens w:val="true"/>
                         <w:bidi w:val="0"/>
                         <w:spacing w:lineRule="auto" w:line="276" w:before="0" w:after="200"/>
-                        <w:jc w:val="start"/>
-                        <w:rPr/>
+                        <w:jc w:val="center"/>
+                        <w:rPr>
+                          <w:sz w:val="32"/>
+                          <w:szCs w:val="32"/>
+                        </w:rPr>
                       </w:pPr>
                       <w:r>
                         <w:rPr>
                           <w:color w:val="000000"/>
-                          <w:sz w:val="34"/>
-                          <w:szCs w:val="34"/>
+                          <w:sz w:val="32"/>
+                          <w:szCs w:val="32"/>
                         </w:rPr>
                         <w:t>{{ req_province }}</w:t>
                       </w:r>
@@ -2641,7 +2660,7 @@
                         <w:txbxContent>
                           <w:p>
                             <w:pPr>
-                              <w:pStyle w:val="FrameContentsuser"/>
+                              <w:pStyle w:val="FrameContents"/>
                               <w:spacing w:lineRule="auto" w:line="240" w:before="0" w:after="0"/>
                               <w:ind w:hanging="0" w:start="0" w:end="0"/>
                               <w:jc w:val="start"/>
@@ -2675,7 +2694,7 @@
                   <w:txbxContent>
                     <w:p>
                       <w:pPr>
-                        <w:pStyle w:val="FrameContentsuser"/>
+                        <w:pStyle w:val="FrameContents"/>
                         <w:spacing w:lineRule="auto" w:line="240" w:before="0" w:after="0"/>
                         <w:ind w:hanging="0" w:start="0" w:end="0"/>
                         <w:jc w:val="start"/>
@@ -3038,7 +3057,7 @@
                         <w:txbxContent>
                           <w:p>
                             <w:pPr>
-                              <w:pStyle w:val="FrameContentsuser"/>
+                              <w:pStyle w:val="FrameContents"/>
                               <w:spacing w:lineRule="auto" w:line="240" w:before="0" w:after="0"/>
                               <w:ind w:hanging="0" w:start="0" w:end="0"/>
                               <w:jc w:val="start"/>
@@ -3072,7 +3091,7 @@
                   <w:txbxContent>
                     <w:p>
                       <w:pPr>
-                        <w:pStyle w:val="FrameContentsuser"/>
+                        <w:pStyle w:val="FrameContents"/>
                         <w:spacing w:lineRule="auto" w:line="240" w:before="0" w:after="0"/>
                         <w:ind w:hanging="0" w:start="0" w:end="0"/>
                         <w:jc w:val="start"/>
@@ -3861,12 +3880,12 @@
               <wp:anchor distT="0" distB="0" distL="0" distR="0" simplePos="0" relativeHeight="49" behindDoc="0" locked="0" layoutInCell="1" allowOverlap="1" wp14:anchorId="20951D24">
                 <wp:simplePos x="0" y="0"/>
                 <wp:positionH relativeFrom="column">
-                  <wp:posOffset>507365</wp:posOffset>
+                  <wp:posOffset>455295</wp:posOffset>
                 </wp:positionH>
                 <wp:positionV relativeFrom="paragraph">
-                  <wp:posOffset>-45085</wp:posOffset>
+                  <wp:posOffset>-10795</wp:posOffset>
                 </wp:positionV>
-                <wp:extent cx="1288415" cy="488315"/>
+                <wp:extent cx="1172210" cy="454025"/>
                 <wp:effectExtent l="0" t="0" r="0" b="0"/>
                 <wp:wrapNone/>
                 <wp:docPr id="29" name="Text Frame 21"/>
@@ -3877,7 +3896,7 @@
                       <wps:spPr>
                         <a:xfrm>
                           <a:off x="0" y="0"/>
-                          <a:ext cx="1288440" cy="488160"/>
+                          <a:ext cx="1172160" cy="453960"/>
                         </a:xfrm>
                         <a:prstGeom prst="rect">
                           <a:avLst/>
@@ -3903,13 +3922,16 @@
                               <w:bidi w:val="0"/>
                               <w:spacing w:lineRule="auto" w:line="276" w:before="0" w:after="200"/>
                               <w:jc w:val="center"/>
-                              <w:rPr/>
+                              <w:rPr>
+                                <w:sz w:val="30"/>
+                                <w:szCs w:val="30"/>
+                              </w:rPr>
                             </w:pPr>
                             <w:r>
                               <w:rPr>
                                 <w:color w:val="000000"/>
-                                <w:sz w:val="34"/>
-                                <w:szCs w:val="34"/>
+                                <w:sz w:val="30"/>
+                                <w:szCs w:val="30"/>
                               </w:rPr>
                               <w:t>{{ acc_origin }}</w:t>
                             </w:r>
@@ -3927,7 +3949,7 @@
           </mc:Choice>
           <mc:Fallback>
             <w:pict>
-              <v:rect id="shape_0" stroked="f" o:allowincell="f" style="position:absolute;margin-left:39.95pt;margin-top:-3.55pt;width:101.4pt;height:38.4pt;mso-wrap-style:square;v-text-anchor:top" wp14:anchorId="20951D24">
+              <v:rect id="shape_0" stroked="f" o:allowincell="f" style="position:absolute;margin-left:35.85pt;margin-top:-0.85pt;width:92.25pt;height:35.7pt;mso-wrap-style:square;v-text-anchor:top" wp14:anchorId="20951D24">
                 <v:fill o:detectmouseclick="t" on="false"/>
                 <v:stroke color="#3465a4" joinstyle="round" endcap="flat"/>
                 <v:textbox>
@@ -3940,13 +3962,16 @@
                         <w:bidi w:val="0"/>
                         <w:spacing w:lineRule="auto" w:line="276" w:before="0" w:after="200"/>
                         <w:jc w:val="center"/>
-                        <w:rPr/>
+                        <w:rPr>
+                          <w:sz w:val="30"/>
+                          <w:szCs w:val="30"/>
+                        </w:rPr>
                       </w:pPr>
                       <w:r>
                         <w:rPr>
                           <w:color w:val="000000"/>
-                          <w:sz w:val="34"/>
-                          <w:szCs w:val="34"/>
+                          <w:sz w:val="30"/>
+                          <w:szCs w:val="30"/>
                         </w:rPr>
                         <w:t>{{ acc_origin }}</w:t>
                       </w:r>
@@ -3964,12 +3989,12 @@
               <wp:anchor distT="0" distB="0" distL="0" distR="0" simplePos="0" relativeHeight="51" behindDoc="0" locked="0" layoutInCell="1" allowOverlap="1" wp14:anchorId="70E0DDD0">
                 <wp:simplePos x="0" y="0"/>
                 <wp:positionH relativeFrom="column">
-                  <wp:posOffset>1992630</wp:posOffset>
+                  <wp:posOffset>2037715</wp:posOffset>
                 </wp:positionH>
                 <wp:positionV relativeFrom="paragraph">
-                  <wp:posOffset>-45085</wp:posOffset>
+                  <wp:posOffset>-10795</wp:posOffset>
                 </wp:positionV>
-                <wp:extent cx="1169035" cy="488315"/>
+                <wp:extent cx="967105" cy="454025"/>
                 <wp:effectExtent l="0" t="0" r="0" b="0"/>
                 <wp:wrapNone/>
                 <wp:docPr id="30" name="Text Frame 22"/>
@@ -3980,7 +4005,7 @@
                       <wps:spPr>
                         <a:xfrm>
                           <a:off x="0" y="0"/>
-                          <a:ext cx="1168920" cy="488160"/>
+                          <a:ext cx="966960" cy="453960"/>
                         </a:xfrm>
                         <a:prstGeom prst="rect">
                           <a:avLst/>
@@ -4006,13 +4031,16 @@
                               <w:bidi w:val="0"/>
                               <w:spacing w:lineRule="auto" w:line="276" w:before="0" w:after="200"/>
                               <w:jc w:val="center"/>
-                              <w:rPr/>
+                              <w:rPr>
+                                <w:sz w:val="30"/>
+                                <w:szCs w:val="30"/>
+                              </w:rPr>
                             </w:pPr>
                             <w:r>
                               <w:rPr>
                                 <w:color w:val="000000"/>
-                                <w:sz w:val="34"/>
-                                <w:szCs w:val="34"/>
+                                <w:sz w:val="30"/>
+                                <w:szCs w:val="30"/>
                               </w:rPr>
                               <w:t>{{ acc_nation }}</w:t>
                             </w:r>
@@ -4030,7 +4058,7 @@
           </mc:Choice>
           <mc:Fallback>
             <w:pict>
-              <v:rect id="shape_0" stroked="f" o:allowincell="f" style="position:absolute;margin-left:156.9pt;margin-top:-3.55pt;width:92pt;height:38.4pt;mso-wrap-style:square;v-text-anchor:top" wp14:anchorId="70E0DDD0">
+              <v:rect id="shape_0" stroked="f" o:allowincell="f" style="position:absolute;margin-left:160.45pt;margin-top:-0.85pt;width:76.1pt;height:35.7pt;mso-wrap-style:square;v-text-anchor:top" wp14:anchorId="70E0DDD0">
                 <v:fill o:detectmouseclick="t" on="false"/>
                 <v:stroke color="#3465a4" joinstyle="round" endcap="flat"/>
                 <v:textbox>
@@ -4043,13 +4071,16 @@
                         <w:bidi w:val="0"/>
                         <w:spacing w:lineRule="auto" w:line="276" w:before="0" w:after="200"/>
                         <w:jc w:val="center"/>
-                        <w:rPr/>
+                        <w:rPr>
+                          <w:sz w:val="30"/>
+                          <w:szCs w:val="30"/>
+                        </w:rPr>
                       </w:pPr>
                       <w:r>
                         <w:rPr>
                           <w:color w:val="000000"/>
-                          <w:sz w:val="34"/>
-                          <w:szCs w:val="34"/>
+                          <w:sz w:val="30"/>
+                          <w:szCs w:val="30"/>
                         </w:rPr>
                         <w:t>{{ acc_nation }}</w:t>
                       </w:r>
@@ -4250,7 +4281,7 @@
               <wp:anchor distT="0" distB="0" distL="0" distR="0" simplePos="0" relativeHeight="53" behindDoc="0" locked="0" layoutInCell="1" allowOverlap="1" wp14:anchorId="2CD7E670">
                 <wp:simplePos x="0" y="0"/>
                 <wp:positionH relativeFrom="column">
-                  <wp:posOffset>367665</wp:posOffset>
+                  <wp:posOffset>247650</wp:posOffset>
                 </wp:positionH>
                 <wp:positionV relativeFrom="paragraph">
                   <wp:posOffset>-31750</wp:posOffset>
@@ -4316,7 +4347,7 @@
           </mc:Choice>
           <mc:Fallback>
             <w:pict>
-              <v:rect id="shape_0" stroked="f" o:allowincell="f" style="position:absolute;margin-left:28.95pt;margin-top:-2.5pt;width:48.6pt;height:38.4pt;mso-wrap-style:square;v-text-anchor:top" wp14:anchorId="2CD7E670">
+              <v:rect id="shape_0" stroked="f" o:allowincell="f" style="position:absolute;margin-left:19.5pt;margin-top:-2.5pt;width:48.6pt;height:38.4pt;mso-wrap-style:square;v-text-anchor:top" wp14:anchorId="2CD7E670">
                 <v:fill o:detectmouseclick="t" on="false"/>
                 <v:stroke color="#3465a4" joinstyle="round" endcap="flat"/>
                 <v:textbox>
@@ -4353,7 +4384,7 @@
               <wp:anchor distT="0" distB="0" distL="0" distR="0" simplePos="0" relativeHeight="55" behindDoc="0" locked="0" layoutInCell="1" allowOverlap="1" wp14:anchorId="0B65A935">
                 <wp:simplePos x="0" y="0"/>
                 <wp:positionH relativeFrom="column">
-                  <wp:posOffset>1091565</wp:posOffset>
+                  <wp:posOffset>944880</wp:posOffset>
                 </wp:positionH>
                 <wp:positionV relativeFrom="paragraph">
                   <wp:posOffset>-31750</wp:posOffset>
@@ -4419,7 +4450,7 @@
           </mc:Choice>
           <mc:Fallback>
             <w:pict>
-              <v:rect id="shape_0" stroked="f" o:allowincell="f" style="position:absolute;margin-left:85.95pt;margin-top:-2.5pt;width:116.9pt;height:38.4pt;mso-wrap-style:square;v-text-anchor:top" wp14:anchorId="0B65A935">
+              <v:rect id="shape_0" stroked="f" o:allowincell="f" style="position:absolute;margin-left:74.4pt;margin-top:-2.5pt;width:116.9pt;height:38.4pt;mso-wrap-style:square;v-text-anchor:top" wp14:anchorId="0B65A935">
                 <v:fill o:detectmouseclick="t" on="false"/>
                 <v:stroke color="#3465a4" joinstyle="round" endcap="flat"/>
                 <v:textbox>
@@ -4456,7 +4487,7 @@
               <wp:anchor distT="0" distB="0" distL="0" distR="0" simplePos="0" relativeHeight="73" behindDoc="0" locked="0" layoutInCell="1" allowOverlap="1" wp14:anchorId="1946A03B">
                 <wp:simplePos x="0" y="0"/>
                 <wp:positionH relativeFrom="column">
-                  <wp:posOffset>3196590</wp:posOffset>
+                  <wp:posOffset>3067685</wp:posOffset>
                 </wp:positionH>
                 <wp:positionV relativeFrom="paragraph">
                   <wp:posOffset>-22860</wp:posOffset>
@@ -4522,7 +4553,7 @@
           </mc:Choice>
           <mc:Fallback>
             <w:pict>
-              <v:rect id="shape_0" stroked="f" o:allowincell="f" style="position:absolute;margin-left:251.7pt;margin-top:-1.8pt;width:203.1pt;height:38.4pt;mso-wrap-style:square;v-text-anchor:top" wp14:anchorId="1946A03B">
+              <v:rect id="shape_0" stroked="f" o:allowincell="f" style="position:absolute;margin-left:241.55pt;margin-top:-1.8pt;width:203.1pt;height:38.4pt;mso-wrap-style:square;v-text-anchor:top" wp14:anchorId="1946A03B">
                 <v:fill o:detectmouseclick="t" on="false"/>
                 <v:stroke color="#3465a4" joinstyle="round" endcap="flat"/>
                 <v:textbox>
@@ -4655,12 +4686,12 @@
               <wp:anchor distT="0" distB="0" distL="0" distR="0" simplePos="0" relativeHeight="29" behindDoc="0" locked="0" layoutInCell="1" allowOverlap="1" wp14:anchorId="010CBE94">
                 <wp:simplePos x="0" y="0"/>
                 <wp:positionH relativeFrom="column">
-                  <wp:posOffset>4385310</wp:posOffset>
+                  <wp:posOffset>4259580</wp:posOffset>
                 </wp:positionH>
                 <wp:positionV relativeFrom="paragraph">
                   <wp:posOffset>-40005</wp:posOffset>
                 </wp:positionV>
-                <wp:extent cx="1485265" cy="488315"/>
+                <wp:extent cx="1500505" cy="488315"/>
                 <wp:effectExtent l="0" t="0" r="0" b="0"/>
                 <wp:wrapNone/>
                 <wp:docPr id="35" name="Text Frame 29"/>
@@ -4671,7 +4702,7 @@
                       <wps:spPr>
                         <a:xfrm>
                           <a:off x="0" y="0"/>
-                          <a:ext cx="1485360" cy="488160"/>
+                          <a:ext cx="1500480" cy="488160"/>
                         </a:xfrm>
                         <a:prstGeom prst="rect">
                           <a:avLst/>
@@ -4697,13 +4728,16 @@
                               <w:bidi w:val="0"/>
                               <w:spacing w:lineRule="auto" w:line="276" w:before="0" w:after="200"/>
                               <w:jc w:val="center"/>
-                              <w:rPr/>
+                              <w:rPr>
+                                <w:sz w:val="32"/>
+                                <w:szCs w:val="32"/>
+                              </w:rPr>
                             </w:pPr>
                             <w:r>
                               <w:rPr>
                                 <w:color w:val="000000"/>
-                                <w:sz w:val="34"/>
-                                <w:szCs w:val="34"/>
+                                <w:sz w:val="32"/>
+                                <w:szCs w:val="32"/>
                               </w:rPr>
                               <w:t>{{ acc_district }}</w:t>
                             </w:r>
@@ -4721,7 +4755,7 @@
           </mc:Choice>
           <mc:Fallback>
             <w:pict>
-              <v:rect id="shape_0" stroked="f" o:allowincell="f" style="position:absolute;margin-left:345.3pt;margin-top:-3.15pt;width:116.9pt;height:38.4pt;mso-wrap-style:square;v-text-anchor:top" wp14:anchorId="010CBE94">
+              <v:rect id="shape_0" stroked="f" o:allowincell="f" style="position:absolute;margin-left:335.4pt;margin-top:-3.15pt;width:118.1pt;height:38.4pt;mso-wrap-style:square;v-text-anchor:top" wp14:anchorId="010CBE94">
                 <v:fill o:detectmouseclick="t" on="false"/>
                 <v:stroke color="#3465a4" joinstyle="round" endcap="flat"/>
                 <v:textbox>
@@ -4734,13 +4768,16 @@
                         <w:bidi w:val="0"/>
                         <w:spacing w:lineRule="auto" w:line="276" w:before="0" w:after="200"/>
                         <w:jc w:val="center"/>
-                        <w:rPr/>
+                        <w:rPr>
+                          <w:sz w:val="32"/>
+                          <w:szCs w:val="32"/>
+                        </w:rPr>
                       </w:pPr>
                       <w:r>
                         <w:rPr>
                           <w:color w:val="000000"/>
-                          <w:sz w:val="34"/>
-                          <w:szCs w:val="34"/>
+                          <w:sz w:val="32"/>
+                          <w:szCs w:val="32"/>
                         </w:rPr>
                         <w:t>{{ acc_district }}</w:t>
                       </w:r>
@@ -4758,7 +4795,7 @@
               <wp:anchor distT="0" distB="0" distL="0" distR="0" simplePos="0" relativeHeight="57" behindDoc="0" locked="0" layoutInCell="1" allowOverlap="1" wp14:anchorId="2299F9C0">
                 <wp:simplePos x="0" y="0"/>
                 <wp:positionH relativeFrom="column">
-                  <wp:posOffset>615315</wp:posOffset>
+                  <wp:posOffset>499110</wp:posOffset>
                 </wp:positionH>
                 <wp:positionV relativeFrom="paragraph">
                   <wp:posOffset>-27940</wp:posOffset>
@@ -4800,13 +4837,16 @@
                               <w:bidi w:val="0"/>
                               <w:spacing w:lineRule="auto" w:line="276" w:before="0" w:after="200"/>
                               <w:jc w:val="center"/>
-                              <w:rPr/>
+                              <w:rPr>
+                                <w:sz w:val="32"/>
+                                <w:szCs w:val="32"/>
+                              </w:rPr>
                             </w:pPr>
                             <w:r>
                               <w:rPr>
                                 <w:color w:val="000000"/>
-                                <w:sz w:val="34"/>
-                                <w:szCs w:val="34"/>
+                                <w:sz w:val="32"/>
+                                <w:szCs w:val="32"/>
                               </w:rPr>
                               <w:t>{{ acc_near }}</w:t>
                             </w:r>
@@ -4824,7 +4864,7 @@
           </mc:Choice>
           <mc:Fallback>
             <w:pict>
-              <v:rect id="shape_0" stroked="f" o:allowincell="f" style="position:absolute;margin-left:48.45pt;margin-top:-2.2pt;width:85.85pt;height:38.4pt;mso-wrap-style:square;v-text-anchor:top" wp14:anchorId="2299F9C0">
+              <v:rect id="shape_0" stroked="f" o:allowincell="f" style="position:absolute;margin-left:39.3pt;margin-top:-2.2pt;width:85.85pt;height:38.4pt;mso-wrap-style:square;v-text-anchor:top" wp14:anchorId="2299F9C0">
                 <v:fill o:detectmouseclick="t" on="false"/>
                 <v:stroke color="#3465a4" joinstyle="round" endcap="flat"/>
                 <v:textbox>
@@ -4837,13 +4877,16 @@
                         <w:bidi w:val="0"/>
                         <w:spacing w:lineRule="auto" w:line="276" w:before="0" w:after="200"/>
                         <w:jc w:val="center"/>
-                        <w:rPr/>
+                        <w:rPr>
+                          <w:sz w:val="32"/>
+                          <w:szCs w:val="32"/>
+                        </w:rPr>
                       </w:pPr>
                       <w:r>
                         <w:rPr>
                           <w:color w:val="000000"/>
-                          <w:sz w:val="34"/>
-                          <w:szCs w:val="34"/>
+                          <w:sz w:val="32"/>
+                          <w:szCs w:val="32"/>
                         </w:rPr>
                         <w:t>{{ acc_near }}</w:t>
                       </w:r>
@@ -4861,7 +4904,7 @@
               <wp:anchor distT="0" distB="0" distL="0" distR="0" simplePos="0" relativeHeight="59" behindDoc="0" locked="0" layoutInCell="1" allowOverlap="1" wp14:anchorId="407F911D">
                 <wp:simplePos x="0" y="0"/>
                 <wp:positionH relativeFrom="column">
-                  <wp:posOffset>2312035</wp:posOffset>
+                  <wp:posOffset>2212340</wp:posOffset>
                 </wp:positionH>
                 <wp:positionV relativeFrom="paragraph">
                   <wp:posOffset>-37465</wp:posOffset>
@@ -4903,13 +4946,16 @@
                               <w:bidi w:val="0"/>
                               <w:spacing w:lineRule="auto" w:line="276" w:before="0" w:after="200"/>
                               <w:jc w:val="center"/>
-                              <w:rPr/>
+                              <w:rPr>
+                                <w:sz w:val="32"/>
+                                <w:szCs w:val="32"/>
+                              </w:rPr>
                             </w:pPr>
                             <w:r>
                               <w:rPr>
                                 <w:color w:val="000000"/>
-                                <w:sz w:val="34"/>
-                                <w:szCs w:val="34"/>
+                                <w:sz w:val="32"/>
+                                <w:szCs w:val="32"/>
                               </w:rPr>
                               <w:t>{{ acc_sub_district }}</w:t>
                             </w:r>
@@ -4927,7 +4973,7 @@
           </mc:Choice>
           <mc:Fallback>
             <w:pict>
-              <v:rect id="shape_0" stroked="f" o:allowincell="f" style="position:absolute;margin-left:182.05pt;margin-top:-2.95pt;width:116.9pt;height:38.4pt;mso-wrap-style:square;v-text-anchor:top" wp14:anchorId="407F911D">
+              <v:rect id="shape_0" stroked="f" o:allowincell="f" style="position:absolute;margin-left:174.2pt;margin-top:-2.95pt;width:116.9pt;height:38.4pt;mso-wrap-style:square;v-text-anchor:top" wp14:anchorId="407F911D">
                 <v:fill o:detectmouseclick="t" on="false"/>
                 <v:stroke color="#3465a4" joinstyle="round" endcap="flat"/>
                 <v:textbox>
@@ -4940,13 +4986,16 @@
                         <w:bidi w:val="0"/>
                         <w:spacing w:lineRule="auto" w:line="276" w:before="0" w:after="200"/>
                         <w:jc w:val="center"/>
-                        <w:rPr/>
+                        <w:rPr>
+                          <w:sz w:val="32"/>
+                          <w:szCs w:val="32"/>
+                        </w:rPr>
                       </w:pPr>
                       <w:r>
                         <w:rPr>
                           <w:color w:val="000000"/>
-                          <w:sz w:val="34"/>
-                          <w:szCs w:val="34"/>
+                          <w:sz w:val="32"/>
+                          <w:szCs w:val="32"/>
                         </w:rPr>
                         <w:t>{{ acc_sub_district }}</w:t>
                       </w:r>
@@ -5310,7 +5359,7 @@
                         <w:txbxContent>
                           <w:p>
                             <w:pPr>
-                              <w:pStyle w:val="FrameContentsuser"/>
+                              <w:pStyle w:val="FrameContents"/>
                               <w:spacing w:lineRule="auto" w:line="240" w:before="0" w:after="0"/>
                               <w:ind w:hanging="0" w:start="0" w:end="0"/>
                               <w:jc w:val="start"/>
@@ -5344,7 +5393,7 @@
                   <w:txbxContent>
                     <w:p>
                       <w:pPr>
-                        <w:pStyle w:val="FrameContentsuser"/>
+                        <w:pStyle w:val="FrameContents"/>
                         <w:spacing w:lineRule="auto" w:line="240" w:before="0" w:after="0"/>
                         <w:ind w:hanging="0" w:start="0" w:end="0"/>
                         <w:jc w:val="start"/>
@@ -5573,7 +5622,7 @@
                         <w:txbxContent>
                           <w:p>
                             <w:pPr>
-                              <w:pStyle w:val="FrameContentsuser"/>
+                              <w:pStyle w:val="FrameContents"/>
                               <w:spacing w:lineRule="auto" w:line="240" w:before="0" w:after="0"/>
                               <w:ind w:hanging="0" w:start="0" w:end="0"/>
                               <w:jc w:val="start"/>
@@ -5607,7 +5656,7 @@
                   <w:txbxContent>
                     <w:p>
                       <w:pPr>
-                        <w:pStyle w:val="FrameContentsuser"/>
+                        <w:pStyle w:val="FrameContents"/>
                         <w:spacing w:lineRule="auto" w:line="240" w:before="0" w:after="0"/>
                         <w:ind w:hanging="0" w:start="0" w:end="0"/>
                         <w:jc w:val="start"/>
@@ -7558,7 +7607,7 @@
                         <w:txbxContent>
                           <w:p>
                             <w:pPr>
-                              <w:pStyle w:val="FrameContentsuser"/>
+                              <w:pStyle w:val="FrameContents"/>
                               <w:spacing w:lineRule="auto" w:line="240" w:before="0" w:after="0"/>
                               <w:ind w:hanging="0" w:start="0" w:end="0"/>
                               <w:jc w:val="start"/>
@@ -7592,7 +7641,7 @@
                   <w:txbxContent>
                     <w:p>
                       <w:pPr>
-                        <w:pStyle w:val="FrameContentsuser"/>
+                        <w:pStyle w:val="FrameContents"/>
                         <w:spacing w:lineRule="auto" w:line="240" w:before="0" w:after="0"/>
                         <w:ind w:hanging="0" w:start="0" w:end="0"/>
                         <w:jc w:val="start"/>
@@ -8074,7 +8123,7 @@
                         <w:txbxContent>
                           <w:p>
                             <w:pPr>
-                              <w:pStyle w:val="FrameContentsuser"/>
+                              <w:pStyle w:val="FrameContents"/>
                               <w:spacing w:lineRule="auto" w:line="240" w:before="0" w:after="0"/>
                               <w:ind w:hanging="0" w:start="0" w:end="0"/>
                               <w:jc w:val="start"/>
@@ -8108,7 +8157,7 @@
                   <w:txbxContent>
                     <w:p>
                       <w:pPr>
-                        <w:pStyle w:val="FrameContentsuser"/>
+                        <w:pStyle w:val="FrameContents"/>
                         <w:spacing w:lineRule="auto" w:line="240" w:before="0" w:after="0"/>
                         <w:ind w:hanging="0" w:start="0" w:end="0"/>
                         <w:jc w:val="start"/>
@@ -9333,15 +9382,15 @@
       <w:szCs w:val="48"/>
     </w:rPr>
   </w:style>
-  <w:style w:type="paragraph" w:styleId="FrameContents" w:customStyle="1">
-    <w:name w:val="Frame Contents"/>
+  <w:style w:type="paragraph" w:styleId="FrameContentsuser" w:customStyle="1">
+    <w:name w:val="Frame Contents (user)"/>
     <w:basedOn w:val="Normal"/>
     <w:qFormat/>
     <w:pPr/>
     <w:rPr/>
   </w:style>
-  <w:style w:type="paragraph" w:styleId="FrameContentsuser">
-    <w:name w:val="Frame Contents (user)"/>
+  <w:style w:type="paragraph" w:styleId="FrameContents">
+    <w:name w:val="Frame Contents"/>
     <w:basedOn w:val="Normal"/>
     <w:qFormat/>
     <w:pPr/>

</xml_diff>

<commit_message>
Tried fixing reqform doc again
</commit_message>
<xml_diff>
--- a/warrant_form/resources/reqform_template.docx
+++ b/warrant_form/resources/reqform_template.docx
@@ -55,7 +55,7 @@
                         <w:txbxContent>
                           <w:p>
                             <w:pPr>
-                              <w:pStyle w:val="FrameContentsuser"/>
+                              <w:pStyle w:val="FrameContents"/>
                               <w:spacing w:lineRule="auto" w:line="276"/>
                               <w:rPr>
                                 <w:rFonts w:ascii="TH SarabunIT๙" w:hAnsi="TH SarabunIT๙" w:eastAsia="Sarabun" w:cs="TH SarabunIT๙"/>
@@ -76,7 +76,7 @@
                           </w:p>
                           <w:p>
                             <w:pPr>
-                              <w:pStyle w:val="FrameContentsuser"/>
+                              <w:pStyle w:val="FrameContents"/>
                               <w:spacing w:lineRule="auto" w:line="276"/>
                               <w:rPr>
                                 <w:rFonts w:ascii="TH SarabunIT๙" w:hAnsi="TH SarabunIT๙" w:eastAsia="Sarabun" w:cs="TH SarabunIT๙"/>
@@ -97,7 +97,7 @@
                           </w:p>
                           <w:p>
                             <w:pPr>
-                              <w:pStyle w:val="FrameContentsuser"/>
+                              <w:pStyle w:val="FrameContents"/>
                               <w:spacing w:lineRule="auto" w:line="276"/>
                               <w:rPr>
                                 <w:rFonts w:ascii="TH SarabunIT๙" w:hAnsi="TH SarabunIT๙" w:cs="TH SarabunIT๙"/>
@@ -116,7 +116,7 @@
                           </w:p>
                           <w:p>
                             <w:pPr>
-                              <w:pStyle w:val="FrameContentsuser"/>
+                              <w:pStyle w:val="FrameContents"/>
                               <w:spacing w:lineRule="auto" w:line="276"/>
                               <w:rPr/>
                             </w:pPr>
@@ -162,7 +162,7 @@
                   <w:txbxContent>
                     <w:p>
                       <w:pPr>
-                        <w:pStyle w:val="FrameContentsuser"/>
+                        <w:pStyle w:val="FrameContents"/>
                         <w:spacing w:lineRule="auto" w:line="276"/>
                         <w:rPr>
                           <w:rFonts w:ascii="TH SarabunIT๙" w:hAnsi="TH SarabunIT๙" w:eastAsia="Sarabun" w:cs="TH SarabunIT๙"/>
@@ -183,7 +183,7 @@
                     </w:p>
                     <w:p>
                       <w:pPr>
-                        <w:pStyle w:val="FrameContentsuser"/>
+                        <w:pStyle w:val="FrameContents"/>
                         <w:spacing w:lineRule="auto" w:line="276"/>
                         <w:rPr>
                           <w:rFonts w:ascii="TH SarabunIT๙" w:hAnsi="TH SarabunIT๙" w:eastAsia="Sarabun" w:cs="TH SarabunIT๙"/>
@@ -204,7 +204,7 @@
                     </w:p>
                     <w:p>
                       <w:pPr>
-                        <w:pStyle w:val="FrameContentsuser"/>
+                        <w:pStyle w:val="FrameContents"/>
                         <w:spacing w:lineRule="auto" w:line="276"/>
                         <w:rPr>
                           <w:rFonts w:ascii="TH SarabunIT๙" w:hAnsi="TH SarabunIT๙" w:cs="TH SarabunIT๙"/>
@@ -223,7 +223,7 @@
                     </w:p>
                     <w:p>
                       <w:pPr>
-                        <w:pStyle w:val="FrameContentsuser"/>
+                        <w:pStyle w:val="FrameContents"/>
                         <w:spacing w:lineRule="auto" w:line="276"/>
                         <w:rPr/>
                       </w:pPr>
@@ -300,7 +300,7 @@
                         <w:txbxContent>
                           <w:p>
                             <w:pPr>
-                              <w:pStyle w:val="FrameContentsuser"/>
+                              <w:pStyle w:val="FrameContents"/>
                               <w:spacing w:lineRule="auto" w:line="276"/>
                               <w:rPr>
                                 <w:rFonts w:ascii="TH SarabunIT๙" w:hAnsi="TH SarabunIT๙" w:eastAsia="Sarabun" w:cs="TH SarabunIT๙"/>
@@ -339,7 +339,7 @@
                           </w:p>
                           <w:p>
                             <w:pPr>
-                              <w:pStyle w:val="FrameContentsuser"/>
+                              <w:pStyle w:val="FrameContents"/>
                               <w:spacing w:lineRule="auto" w:line="276"/>
                               <w:rPr/>
                             </w:pPr>
@@ -373,7 +373,7 @@
                   <w:txbxContent>
                     <w:p>
                       <w:pPr>
-                        <w:pStyle w:val="FrameContentsuser"/>
+                        <w:pStyle w:val="FrameContents"/>
                         <w:spacing w:lineRule="auto" w:line="276"/>
                         <w:rPr>
                           <w:rFonts w:ascii="TH SarabunIT๙" w:hAnsi="TH SarabunIT๙" w:eastAsia="Sarabun" w:cs="TH SarabunIT๙"/>
@@ -412,7 +412,7 @@
                     </w:p>
                     <w:p>
                       <w:pPr>
-                        <w:pStyle w:val="FrameContentsuser"/>
+                        <w:pStyle w:val="FrameContents"/>
                         <w:spacing w:lineRule="auto" w:line="276"/>
                         <w:rPr/>
                       </w:pPr>
@@ -490,13 +490,6 @@
           <w:szCs w:val="34"/>
         </w:rPr>
         <w:tab/>
-      </w:r>
-      <w:r>
-        <w:rPr>
-          <w:rFonts w:cs="TH SarabunIT๙"/>
-          <w:sz w:val="34"/>
-          <w:szCs w:val="34"/>
-        </w:rPr>
         <w:tab/>
       </w:r>
       <w:r>
@@ -872,12 +865,12 @@
               <wp:anchor distT="0" distB="0" distL="0" distR="0" simplePos="0" relativeHeight="39" behindDoc="0" locked="0" layoutInCell="1" allowOverlap="1" wp14:anchorId="464982A6">
                 <wp:simplePos x="0" y="0"/>
                 <wp:positionH relativeFrom="column">
-                  <wp:posOffset>3251835</wp:posOffset>
+                  <wp:posOffset>3399155</wp:posOffset>
                 </wp:positionH>
                 <wp:positionV relativeFrom="paragraph">
                   <wp:posOffset>-34925</wp:posOffset>
                 </wp:positionV>
-                <wp:extent cx="2386330" cy="488315"/>
+                <wp:extent cx="2239010" cy="488315"/>
                 <wp:effectExtent l="0" t="0" r="0" b="0"/>
                 <wp:wrapNone/>
                 <wp:docPr id="7" name="Text Frame 3"/>
@@ -888,7 +881,7 @@
                       <wps:spPr>
                         <a:xfrm>
                           <a:off x="0" y="0"/>
-                          <a:ext cx="2386440" cy="488160"/>
+                          <a:ext cx="2238840" cy="488160"/>
                         </a:xfrm>
                         <a:prstGeom prst="rect">
                           <a:avLst/>
@@ -940,7 +933,7 @@
           </mc:Choice>
           <mc:Fallback>
             <w:pict>
-              <v:rect id="shape_0" stroked="f" o:allowincell="f" style="position:absolute;margin-left:256.05pt;margin-top:-2.75pt;width:187.85pt;height:38.4pt;mso-wrap-style:square;v-text-anchor:top" wp14:anchorId="464982A6">
+              <v:rect id="shape_0" stroked="f" o:allowincell="f" style="position:absolute;margin-left:267.65pt;margin-top:-2.75pt;width:176.25pt;height:38.4pt;mso-wrap-style:square;v-text-anchor:top" wp14:anchorId="464982A6">
                 <v:fill o:detectmouseclick="t" on="false"/>
                 <v:stroke color="#3465a4" joinstyle="round" endcap="flat"/>
                 <v:textbox>
@@ -2660,7 +2653,7 @@
                         <w:txbxContent>
                           <w:p>
                             <w:pPr>
-                              <w:pStyle w:val="FrameContents"/>
+                              <w:pStyle w:val="FrameContentsuser"/>
                               <w:spacing w:lineRule="auto" w:line="240" w:before="0" w:after="0"/>
                               <w:ind w:hanging="0" w:start="0" w:end="0"/>
                               <w:jc w:val="start"/>
@@ -2694,7 +2687,7 @@
                   <w:txbxContent>
                     <w:p>
                       <w:pPr>
-                        <w:pStyle w:val="FrameContents"/>
+                        <w:pStyle w:val="FrameContentsuser"/>
                         <w:spacing w:lineRule="auto" w:line="240" w:before="0" w:after="0"/>
                         <w:ind w:hanging="0" w:start="0" w:end="0"/>
                         <w:jc w:val="start"/>
@@ -2868,7 +2861,7 @@
                 <wp:positionV relativeFrom="paragraph">
                   <wp:posOffset>-43815</wp:posOffset>
                 </wp:positionV>
-                <wp:extent cx="1485265" cy="488315"/>
+                <wp:extent cx="2938780" cy="488315"/>
                 <wp:effectExtent l="0" t="0" r="0" b="0"/>
                 <wp:wrapNone/>
                 <wp:docPr id="22" name="Text Frame 17"/>
@@ -2879,7 +2872,7 @@
                       <wps:spPr>
                         <a:xfrm>
                           <a:off x="0" y="0"/>
-                          <a:ext cx="1485360" cy="488160"/>
+                          <a:ext cx="2938680" cy="488160"/>
                         </a:xfrm>
                         <a:prstGeom prst="rect">
                           <a:avLst/>
@@ -2925,7 +2918,7 @@
           </mc:Choice>
           <mc:Fallback>
             <w:pict>
-              <v:rect id="shape_0" stroked="f" o:allowincell="f" style="position:absolute;margin-left:221.3pt;margin-top:-3.45pt;width:116.9pt;height:38.4pt;mso-wrap-style:square;v-text-anchor:top" wp14:anchorId="31F98848">
+              <v:rect id="shape_0" stroked="f" o:allowincell="f" style="position:absolute;margin-left:221.3pt;margin-top:-3.45pt;width:231.35pt;height:38.4pt;mso-wrap-style:square;v-text-anchor:top" wp14:anchorId="31F98848">
                 <v:fill o:detectmouseclick="t" on="false"/>
                 <v:stroke color="#3465a4" joinstyle="round" endcap="flat"/>
                 <v:textbox>
@@ -3057,7 +3050,7 @@
                         <w:txbxContent>
                           <w:p>
                             <w:pPr>
-                              <w:pStyle w:val="FrameContents"/>
+                              <w:pStyle w:val="FrameContentsuser"/>
                               <w:spacing w:lineRule="auto" w:line="240" w:before="0" w:after="0"/>
                               <w:ind w:hanging="0" w:start="0" w:end="0"/>
                               <w:jc w:val="start"/>
@@ -3091,7 +3084,7 @@
                   <w:txbxContent>
                     <w:p>
                       <w:pPr>
-                        <w:pStyle w:val="FrameContents"/>
+                        <w:pStyle w:val="FrameContentsuser"/>
                         <w:spacing w:lineRule="auto" w:line="240" w:before="0" w:after="0"/>
                         <w:ind w:hanging="0" w:start="0" w:end="0"/>
                         <w:jc w:val="start"/>
@@ -3257,7 +3250,7 @@
                 <wp:positionV relativeFrom="paragraph">
                   <wp:posOffset>-37465</wp:posOffset>
                 </wp:positionV>
-                <wp:extent cx="1485265" cy="488315"/>
+                <wp:extent cx="1788795" cy="488315"/>
                 <wp:effectExtent l="0" t="0" r="0" b="0"/>
                 <wp:wrapNone/>
                 <wp:docPr id="25" name="Text Frame 18"/>
@@ -3268,7 +3261,7 @@
                       <wps:spPr>
                         <a:xfrm>
                           <a:off x="0" y="0"/>
-                          <a:ext cx="1485360" cy="488160"/>
+                          <a:ext cx="1788840" cy="488160"/>
                         </a:xfrm>
                         <a:prstGeom prst="rect">
                           <a:avLst/>
@@ -3320,7 +3313,7 @@
           </mc:Choice>
           <mc:Fallback>
             <w:pict>
-              <v:rect id="shape_0" stroked="f" o:allowincell="f" style="position:absolute;margin-left:310.6pt;margin-top:-2.95pt;width:116.9pt;height:38.4pt;mso-wrap-style:square;v-text-anchor:top" wp14:anchorId="58D8629F">
+              <v:rect id="shape_0" stroked="f" o:allowincell="f" style="position:absolute;margin-left:310.6pt;margin-top:-2.95pt;width:140.8pt;height:38.4pt;mso-wrap-style:square;v-text-anchor:top" wp14:anchorId="58D8629F">
                 <v:fill o:detectmouseclick="t" on="false"/>
                 <v:stroke color="#3465a4" joinstyle="round" endcap="flat"/>
                 <v:textbox>
@@ -5359,7 +5352,7 @@
                         <w:txbxContent>
                           <w:p>
                             <w:pPr>
-                              <w:pStyle w:val="FrameContents"/>
+                              <w:pStyle w:val="FrameContentsuser"/>
                               <w:spacing w:lineRule="auto" w:line="240" w:before="0" w:after="0"/>
                               <w:ind w:hanging="0" w:start="0" w:end="0"/>
                               <w:jc w:val="start"/>
@@ -5393,7 +5386,7 @@
                   <w:txbxContent>
                     <w:p>
                       <w:pPr>
-                        <w:pStyle w:val="FrameContents"/>
+                        <w:pStyle w:val="FrameContentsuser"/>
                         <w:spacing w:lineRule="auto" w:line="240" w:before="0" w:after="0"/>
                         <w:ind w:hanging="0" w:start="0" w:end="0"/>
                         <w:jc w:val="start"/>
@@ -5622,7 +5615,7 @@
                         <w:txbxContent>
                           <w:p>
                             <w:pPr>
-                              <w:pStyle w:val="FrameContents"/>
+                              <w:pStyle w:val="FrameContentsuser"/>
                               <w:spacing w:lineRule="auto" w:line="240" w:before="0" w:after="0"/>
                               <w:ind w:hanging="0" w:start="0" w:end="0"/>
                               <w:jc w:val="start"/>
@@ -5656,7 +5649,7 @@
                   <w:txbxContent>
                     <w:p>
                       <w:pPr>
-                        <w:pStyle w:val="FrameContents"/>
+                        <w:pStyle w:val="FrameContentsuser"/>
                         <w:spacing w:lineRule="auto" w:line="240" w:before="0" w:after="0"/>
                         <w:ind w:hanging="0" w:start="0" w:end="0"/>
                         <w:jc w:val="start"/>
@@ -7607,7 +7600,7 @@
                         <w:txbxContent>
                           <w:p>
                             <w:pPr>
-                              <w:pStyle w:val="FrameContents"/>
+                              <w:pStyle w:val="FrameContentsuser"/>
                               <w:spacing w:lineRule="auto" w:line="240" w:before="0" w:after="0"/>
                               <w:ind w:hanging="0" w:start="0" w:end="0"/>
                               <w:jc w:val="start"/>
@@ -7641,7 +7634,7 @@
                   <w:txbxContent>
                     <w:p>
                       <w:pPr>
-                        <w:pStyle w:val="FrameContents"/>
+                        <w:pStyle w:val="FrameContentsuser"/>
                         <w:spacing w:lineRule="auto" w:line="240" w:before="0" w:after="0"/>
                         <w:ind w:hanging="0" w:start="0" w:end="0"/>
                         <w:jc w:val="start"/>
@@ -8123,7 +8116,7 @@
                         <w:txbxContent>
                           <w:p>
                             <w:pPr>
-                              <w:pStyle w:val="FrameContents"/>
+                              <w:pStyle w:val="FrameContentsuser"/>
                               <w:spacing w:lineRule="auto" w:line="240" w:before="0" w:after="0"/>
                               <w:ind w:hanging="0" w:start="0" w:end="0"/>
                               <w:jc w:val="start"/>
@@ -8157,7 +8150,7 @@
                   <w:txbxContent>
                     <w:p>
                       <w:pPr>
-                        <w:pStyle w:val="FrameContents"/>
+                        <w:pStyle w:val="FrameContentsuser"/>
                         <w:spacing w:lineRule="auto" w:line="240" w:before="0" w:after="0"/>
                         <w:ind w:hanging="0" w:start="0" w:end="0"/>
                         <w:jc w:val="start"/>
@@ -9382,15 +9375,15 @@
       <w:szCs w:val="48"/>
     </w:rPr>
   </w:style>
-  <w:style w:type="paragraph" w:styleId="FrameContentsuser" w:customStyle="1">
-    <w:name w:val="Frame Contents (user)"/>
+  <w:style w:type="paragraph" w:styleId="FrameContents" w:customStyle="1">
+    <w:name w:val="Frame Contents"/>
     <w:basedOn w:val="Normal"/>
     <w:qFormat/>
     <w:pPr/>
     <w:rPr/>
   </w:style>
-  <w:style w:type="paragraph" w:styleId="FrameContents">
-    <w:name w:val="Frame Contents"/>
+  <w:style w:type="paragraph" w:styleId="FrameContentsuser">
+    <w:name w:val="Frame Contents (user)"/>
     <w:basedOn w:val="Normal"/>
     <w:qFormat/>
     <w:pPr/>

</xml_diff>